<commit_message>
fix: package purls for DLL/JAR files, review fixes
New:
- binpath.py: a DLL or JAR whose path is in a NuGet cache, a packages.config
  folder, the Maven repository or the Gradle cache gets that package's purl
  (also replacing pkg:generic) and the package version instead of the
  assembly/manifest version. A file name is never turned into an ecosystem
  purl by guessing.

Review fixes:
- CXN-050 writes a dependencies entry for every component and the root, so
  fix on its own output changes nothing.
- A root component given as a string keeps its name; the 1.2/1.3 root version
  is blank, not "unknown".
- A registry URL gives the purl only for the same package; the component's
  version wins.
- Paths with | or backticks no longer break the Markdown tables; non-SBOM JSON
  reports "not validated as it is"; the "no changes" row is aligned.

Docs: Rule Book (md + docx), README, CHANGELOG, rule catalog. Tests:
tests/test_fix_layout.py.
</commit_message>
<xml_diff>
--- a/SBOM_Fixer_Rule_Book_And_Installation_guide.docx
+++ b/SBOM_Fixer_Rule_Book_And_Installation_guide.docx
@@ -358,7 +358,7 @@
       <w:pPr>
         <w:pStyle w:val="Heading1"/>
       </w:pPr>
-      <w:bookmarkStart w:id="0" w:name="_Toc242715102"/>
+      <w:bookmarkStart w:id="0" w:name="_Toc242715886"/>
       <w:r>
         <w:t>Contents</w:t>
       </w:r>
@@ -383,7 +383,7 @@
       <w:r>
         <w:fldChar w:fldCharType="separate"/>
       </w:r>
-      <w:hyperlink w:anchor="_Toc242715102" w:history="1">
+      <w:hyperlink w:anchor="_Toc242715886" w:history="1">
         <w:r>
           <w:rPr>
             <w:rStyle w:val="Hyperlink"/>
@@ -410,7 +410,7 @@
             <w:noProof/>
             <w:webHidden/>
           </w:rPr>
-          <w:instrText xml:space="preserve"> PAGEREF _Toc242715102 \h </w:instrText>
+          <w:instrText xml:space="preserve"> PAGEREF _Toc242715886 \h </w:instrText>
         </w:r>
         <w:r>
           <w:rPr>
@@ -451,7 +451,7 @@
           <w:noProof/>
         </w:rPr>
       </w:pPr>
-      <w:hyperlink w:anchor="_Toc242715103" w:history="1">
+      <w:hyperlink w:anchor="_Toc242715887" w:history="1">
         <w:r>
           <w:rPr>
             <w:rStyle w:val="Hyperlink"/>
@@ -478,7 +478,7 @@
             <w:noProof/>
             <w:webHidden/>
           </w:rPr>
-          <w:instrText xml:space="preserve"> PAGEREF _Toc242715103 \h </w:instrText>
+          <w:instrText xml:space="preserve"> PAGEREF _Toc242715887 \h </w:instrText>
         </w:r>
         <w:r>
           <w:rPr>
@@ -519,7 +519,7 @@
           <w:noProof/>
         </w:rPr>
       </w:pPr>
-      <w:hyperlink w:anchor="_Toc242715104" w:history="1">
+      <w:hyperlink w:anchor="_Toc242715888" w:history="1">
         <w:r>
           <w:rPr>
             <w:rStyle w:val="Hyperlink"/>
@@ -546,7 +546,7 @@
             <w:noProof/>
             <w:webHidden/>
           </w:rPr>
-          <w:instrText xml:space="preserve"> PAGEREF _Toc242715104 \h </w:instrText>
+          <w:instrText xml:space="preserve"> PAGEREF _Toc242715888 \h </w:instrText>
         </w:r>
         <w:r>
           <w:rPr>
@@ -566,7 +566,7 @@
             <w:noProof/>
             <w:webHidden/>
           </w:rPr>
-          <w:t>4</w:t>
+          <w:t>5</w:t>
         </w:r>
         <w:r>
           <w:rPr>
@@ -587,7 +587,7 @@
           <w:noProof/>
         </w:rPr>
       </w:pPr>
-      <w:hyperlink w:anchor="_Toc242715105" w:history="1">
+      <w:hyperlink w:anchor="_Toc242715889" w:history="1">
         <w:r>
           <w:rPr>
             <w:rStyle w:val="Hyperlink"/>
@@ -614,7 +614,7 @@
             <w:noProof/>
             <w:webHidden/>
           </w:rPr>
-          <w:instrText xml:space="preserve"> PAGEREF _Toc242715105 \h </w:instrText>
+          <w:instrText xml:space="preserve"> PAGEREF _Toc242715889 \h </w:instrText>
         </w:r>
         <w:r>
           <w:rPr>
@@ -634,7 +634,7 @@
             <w:noProof/>
             <w:webHidden/>
           </w:rPr>
-          <w:t>5</w:t>
+          <w:t>6</w:t>
         </w:r>
         <w:r>
           <w:rPr>
@@ -655,7 +655,7 @@
           <w:noProof/>
         </w:rPr>
       </w:pPr>
-      <w:hyperlink w:anchor="_Toc242715106" w:history="1">
+      <w:hyperlink w:anchor="_Toc242715890" w:history="1">
         <w:r>
           <w:rPr>
             <w:rStyle w:val="Hyperlink"/>
@@ -682,7 +682,7 @@
             <w:noProof/>
             <w:webHidden/>
           </w:rPr>
-          <w:instrText xml:space="preserve"> PAGEREF _Toc242715106 \h </w:instrText>
+          <w:instrText xml:space="preserve"> PAGEREF _Toc242715890 \h </w:instrText>
         </w:r>
         <w:r>
           <w:rPr>
@@ -702,7 +702,7 @@
             <w:noProof/>
             <w:webHidden/>
           </w:rPr>
-          <w:t>6</w:t>
+          <w:t>7</w:t>
         </w:r>
         <w:r>
           <w:rPr>
@@ -723,7 +723,7 @@
           <w:noProof/>
         </w:rPr>
       </w:pPr>
-      <w:hyperlink w:anchor="_Toc242715107" w:history="1">
+      <w:hyperlink w:anchor="_Toc242715891" w:history="1">
         <w:r>
           <w:rPr>
             <w:rStyle w:val="Hyperlink"/>
@@ -750,7 +750,7 @@
             <w:noProof/>
             <w:webHidden/>
           </w:rPr>
-          <w:instrText xml:space="preserve"> PAGEREF _Toc242715107 \h </w:instrText>
+          <w:instrText xml:space="preserve"> PAGEREF _Toc242715891 \h </w:instrText>
         </w:r>
         <w:r>
           <w:rPr>
@@ -770,7 +770,7 @@
             <w:noProof/>
             <w:webHidden/>
           </w:rPr>
-          <w:t>6</w:t>
+          <w:t>7</w:t>
         </w:r>
         <w:r>
           <w:rPr>
@@ -791,7 +791,7 @@
           <w:noProof/>
         </w:rPr>
       </w:pPr>
-      <w:hyperlink w:anchor="_Toc242715108" w:history="1">
+      <w:hyperlink w:anchor="_Toc242715892" w:history="1">
         <w:r>
           <w:rPr>
             <w:rStyle w:val="Hyperlink"/>
@@ -818,7 +818,7 @@
             <w:noProof/>
             <w:webHidden/>
           </w:rPr>
-          <w:instrText xml:space="preserve"> PAGEREF _Toc242715108 \h </w:instrText>
+          <w:instrText xml:space="preserve"> PAGEREF _Toc242715892 \h </w:instrText>
         </w:r>
         <w:r>
           <w:rPr>
@@ -838,7 +838,7 @@
             <w:noProof/>
             <w:webHidden/>
           </w:rPr>
-          <w:t>6</w:t>
+          <w:t>7</w:t>
         </w:r>
         <w:r>
           <w:rPr>
@@ -859,7 +859,7 @@
           <w:noProof/>
         </w:rPr>
       </w:pPr>
-      <w:hyperlink w:anchor="_Toc242715109" w:history="1">
+      <w:hyperlink w:anchor="_Toc242715893" w:history="1">
         <w:r>
           <w:rPr>
             <w:rStyle w:val="Hyperlink"/>
@@ -886,7 +886,7 @@
             <w:noProof/>
             <w:webHidden/>
           </w:rPr>
-          <w:instrText xml:space="preserve"> PAGEREF _Toc242715109 \h </w:instrText>
+          <w:instrText xml:space="preserve"> PAGEREF _Toc242715893 \h </w:instrText>
         </w:r>
         <w:r>
           <w:rPr>
@@ -906,7 +906,7 @@
             <w:noProof/>
             <w:webHidden/>
           </w:rPr>
-          <w:t>6</w:t>
+          <w:t>7</w:t>
         </w:r>
         <w:r>
           <w:rPr>
@@ -927,7 +927,7 @@
           <w:noProof/>
         </w:rPr>
       </w:pPr>
-      <w:hyperlink w:anchor="_Toc242715110" w:history="1">
+      <w:hyperlink w:anchor="_Toc242715894" w:history="1">
         <w:r>
           <w:rPr>
             <w:rStyle w:val="Hyperlink"/>
@@ -954,7 +954,7 @@
             <w:noProof/>
             <w:webHidden/>
           </w:rPr>
-          <w:instrText xml:space="preserve"> PAGEREF _Toc242715110 \h </w:instrText>
+          <w:instrText xml:space="preserve"> PAGEREF _Toc242715894 \h </w:instrText>
         </w:r>
         <w:r>
           <w:rPr>
@@ -974,7 +974,7 @@
             <w:noProof/>
             <w:webHidden/>
           </w:rPr>
-          <w:t>6</w:t>
+          <w:t>7</w:t>
         </w:r>
         <w:r>
           <w:rPr>
@@ -995,7 +995,7 @@
           <w:noProof/>
         </w:rPr>
       </w:pPr>
-      <w:hyperlink w:anchor="_Toc242715111" w:history="1">
+      <w:hyperlink w:anchor="_Toc242715895" w:history="1">
         <w:r>
           <w:rPr>
             <w:rStyle w:val="Hyperlink"/>
@@ -1022,7 +1022,7 @@
             <w:noProof/>
             <w:webHidden/>
           </w:rPr>
-          <w:instrText xml:space="preserve"> PAGEREF _Toc242715111 \h </w:instrText>
+          <w:instrText xml:space="preserve"> PAGEREF _Toc242715895 \h </w:instrText>
         </w:r>
         <w:r>
           <w:rPr>
@@ -1042,7 +1042,7 @@
             <w:noProof/>
             <w:webHidden/>
           </w:rPr>
-          <w:t>6</w:t>
+          <w:t>7</w:t>
         </w:r>
         <w:r>
           <w:rPr>
@@ -1063,7 +1063,7 @@
           <w:noProof/>
         </w:rPr>
       </w:pPr>
-      <w:hyperlink w:anchor="_Toc242715112" w:history="1">
+      <w:hyperlink w:anchor="_Toc242715896" w:history="1">
         <w:r>
           <w:rPr>
             <w:rStyle w:val="Hyperlink"/>
@@ -1090,7 +1090,7 @@
             <w:noProof/>
             <w:webHidden/>
           </w:rPr>
-          <w:instrText xml:space="preserve"> PAGEREF _Toc242715112 \h </w:instrText>
+          <w:instrText xml:space="preserve"> PAGEREF _Toc242715896 \h </w:instrText>
         </w:r>
         <w:r>
           <w:rPr>
@@ -1110,7 +1110,7 @@
             <w:noProof/>
             <w:webHidden/>
           </w:rPr>
-          <w:t>6</w:t>
+          <w:t>7</w:t>
         </w:r>
         <w:r>
           <w:rPr>
@@ -1131,7 +1131,7 @@
           <w:noProof/>
         </w:rPr>
       </w:pPr>
-      <w:hyperlink w:anchor="_Toc242715113" w:history="1">
+      <w:hyperlink w:anchor="_Toc242715897" w:history="1">
         <w:r>
           <w:rPr>
             <w:rStyle w:val="Hyperlink"/>
@@ -1158,7 +1158,7 @@
             <w:noProof/>
             <w:webHidden/>
           </w:rPr>
-          <w:instrText xml:space="preserve"> PAGEREF _Toc242715113 \h </w:instrText>
+          <w:instrText xml:space="preserve"> PAGEREF _Toc242715897 \h </w:instrText>
         </w:r>
         <w:r>
           <w:rPr>
@@ -1178,7 +1178,7 @@
             <w:noProof/>
             <w:webHidden/>
           </w:rPr>
-          <w:t>7</w:t>
+          <w:t>8</w:t>
         </w:r>
         <w:r>
           <w:rPr>
@@ -1199,7 +1199,7 @@
           <w:noProof/>
         </w:rPr>
       </w:pPr>
-      <w:hyperlink w:anchor="_Toc242715114" w:history="1">
+      <w:hyperlink w:anchor="_Toc242715898" w:history="1">
         <w:r>
           <w:rPr>
             <w:rStyle w:val="Hyperlink"/>
@@ -1226,7 +1226,7 @@
             <w:noProof/>
             <w:webHidden/>
           </w:rPr>
-          <w:instrText xml:space="preserve"> PAGEREF _Toc242715114 \h </w:instrText>
+          <w:instrText xml:space="preserve"> PAGEREF _Toc242715898 \h </w:instrText>
         </w:r>
         <w:r>
           <w:rPr>
@@ -1246,7 +1246,7 @@
             <w:noProof/>
             <w:webHidden/>
           </w:rPr>
-          <w:t>8</w:t>
+          <w:t>9</w:t>
         </w:r>
         <w:r>
           <w:rPr>
@@ -1267,7 +1267,7 @@
           <w:noProof/>
         </w:rPr>
       </w:pPr>
-      <w:hyperlink w:anchor="_Toc242715115" w:history="1">
+      <w:hyperlink w:anchor="_Toc242715899" w:history="1">
         <w:r>
           <w:rPr>
             <w:rStyle w:val="Hyperlink"/>
@@ -1294,7 +1294,7 @@
             <w:noProof/>
             <w:webHidden/>
           </w:rPr>
-          <w:instrText xml:space="preserve"> PAGEREF _Toc242715115 \h </w:instrText>
+          <w:instrText xml:space="preserve"> PAGEREF _Toc242715899 \h </w:instrText>
         </w:r>
         <w:r>
           <w:rPr>
@@ -1314,7 +1314,7 @@
             <w:noProof/>
             <w:webHidden/>
           </w:rPr>
-          <w:t>9</w:t>
+          <w:t>10</w:t>
         </w:r>
         <w:r>
           <w:rPr>
@@ -1335,7 +1335,7 @@
           <w:noProof/>
         </w:rPr>
       </w:pPr>
-      <w:hyperlink w:anchor="_Toc242715116" w:history="1">
+      <w:hyperlink w:anchor="_Toc242715900" w:history="1">
         <w:r>
           <w:rPr>
             <w:rStyle w:val="Hyperlink"/>
@@ -1362,7 +1362,7 @@
             <w:noProof/>
             <w:webHidden/>
           </w:rPr>
-          <w:instrText xml:space="preserve"> PAGEREF _Toc242715116 \h </w:instrText>
+          <w:instrText xml:space="preserve"> PAGEREF _Toc242715900 \h </w:instrText>
         </w:r>
         <w:r>
           <w:rPr>
@@ -1382,7 +1382,7 @@
             <w:noProof/>
             <w:webHidden/>
           </w:rPr>
-          <w:t>10</w:t>
+          <w:t>11</w:t>
         </w:r>
         <w:r>
           <w:rPr>
@@ -1403,7 +1403,7 @@
           <w:noProof/>
         </w:rPr>
       </w:pPr>
-      <w:hyperlink w:anchor="_Toc242715117" w:history="1">
+      <w:hyperlink w:anchor="_Toc242715901" w:history="1">
         <w:r>
           <w:rPr>
             <w:rStyle w:val="Hyperlink"/>
@@ -1430,7 +1430,7 @@
             <w:noProof/>
             <w:webHidden/>
           </w:rPr>
-          <w:instrText xml:space="preserve"> PAGEREF _Toc242715117 \h </w:instrText>
+          <w:instrText xml:space="preserve"> PAGEREF _Toc242715901 \h </w:instrText>
         </w:r>
         <w:r>
           <w:rPr>
@@ -1450,7 +1450,7 @@
             <w:noProof/>
             <w:webHidden/>
           </w:rPr>
-          <w:t>11</w:t>
+          <w:t>12</w:t>
         </w:r>
         <w:r>
           <w:rPr>
@@ -1471,7 +1471,7 @@
           <w:noProof/>
         </w:rPr>
       </w:pPr>
-      <w:hyperlink w:anchor="_Toc242715118" w:history="1">
+      <w:hyperlink w:anchor="_Toc242715902" w:history="1">
         <w:r>
           <w:rPr>
             <w:rStyle w:val="Hyperlink"/>
@@ -1498,7 +1498,7 @@
             <w:noProof/>
             <w:webHidden/>
           </w:rPr>
-          <w:instrText xml:space="preserve"> PAGEREF _Toc242715118 \h </w:instrText>
+          <w:instrText xml:space="preserve"> PAGEREF _Toc242715902 \h </w:instrText>
         </w:r>
         <w:r>
           <w:rPr>
@@ -1518,7 +1518,7 @@
             <w:noProof/>
             <w:webHidden/>
           </w:rPr>
-          <w:t>11</w:t>
+          <w:t>12</w:t>
         </w:r>
         <w:r>
           <w:rPr>
@@ -1539,7 +1539,7 @@
           <w:noProof/>
         </w:rPr>
       </w:pPr>
-      <w:hyperlink w:anchor="_Toc242715119" w:history="1">
+      <w:hyperlink w:anchor="_Toc242715903" w:history="1">
         <w:r>
           <w:rPr>
             <w:rStyle w:val="Hyperlink"/>
@@ -1566,7 +1566,7 @@
             <w:noProof/>
             <w:webHidden/>
           </w:rPr>
-          <w:instrText xml:space="preserve"> PAGEREF _Toc242715119 \h </w:instrText>
+          <w:instrText xml:space="preserve"> PAGEREF _Toc242715903 \h </w:instrText>
         </w:r>
         <w:r>
           <w:rPr>
@@ -1586,7 +1586,7 @@
             <w:noProof/>
             <w:webHidden/>
           </w:rPr>
-          <w:t>11</w:t>
+          <w:t>12</w:t>
         </w:r>
         <w:r>
           <w:rPr>
@@ -1607,7 +1607,7 @@
           <w:noProof/>
         </w:rPr>
       </w:pPr>
-      <w:hyperlink w:anchor="_Toc242715120" w:history="1">
+      <w:hyperlink w:anchor="_Toc242715904" w:history="1">
         <w:r>
           <w:rPr>
             <w:rStyle w:val="Hyperlink"/>
@@ -1634,7 +1634,7 @@
             <w:noProof/>
             <w:webHidden/>
           </w:rPr>
-          <w:instrText xml:space="preserve"> PAGEREF _Toc242715120 \h </w:instrText>
+          <w:instrText xml:space="preserve"> PAGEREF _Toc242715904 \h </w:instrText>
         </w:r>
         <w:r>
           <w:rPr>
@@ -1654,7 +1654,7 @@
             <w:noProof/>
             <w:webHidden/>
           </w:rPr>
-          <w:t>11</w:t>
+          <w:t>13</w:t>
         </w:r>
         <w:r>
           <w:rPr>
@@ -1675,7 +1675,7 @@
           <w:noProof/>
         </w:rPr>
       </w:pPr>
-      <w:hyperlink w:anchor="_Toc242715121" w:history="1">
+      <w:hyperlink w:anchor="_Toc242715905" w:history="1">
         <w:r>
           <w:rPr>
             <w:rStyle w:val="Hyperlink"/>
@@ -1702,7 +1702,7 @@
             <w:noProof/>
             <w:webHidden/>
           </w:rPr>
-          <w:instrText xml:space="preserve"> PAGEREF _Toc242715121 \h </w:instrText>
+          <w:instrText xml:space="preserve"> PAGEREF _Toc242715905 \h </w:instrText>
         </w:r>
         <w:r>
           <w:rPr>
@@ -1722,7 +1722,7 @@
             <w:noProof/>
             <w:webHidden/>
           </w:rPr>
-          <w:t>12</w:t>
+          <w:t>13</w:t>
         </w:r>
         <w:r>
           <w:rPr>
@@ -1743,7 +1743,7 @@
           <w:noProof/>
         </w:rPr>
       </w:pPr>
-      <w:hyperlink w:anchor="_Toc242715122" w:history="1">
+      <w:hyperlink w:anchor="_Toc242715906" w:history="1">
         <w:r>
           <w:rPr>
             <w:rStyle w:val="Hyperlink"/>
@@ -1770,7 +1770,7 @@
             <w:noProof/>
             <w:webHidden/>
           </w:rPr>
-          <w:instrText xml:space="preserve"> PAGEREF _Toc242715122 \h </w:instrText>
+          <w:instrText xml:space="preserve"> PAGEREF _Toc242715906 \h </w:instrText>
         </w:r>
         <w:r>
           <w:rPr>
@@ -1790,7 +1790,7 @@
             <w:noProof/>
             <w:webHidden/>
           </w:rPr>
-          <w:t>12</w:t>
+          <w:t>13</w:t>
         </w:r>
         <w:r>
           <w:rPr>
@@ -1811,7 +1811,7 @@
           <w:noProof/>
         </w:rPr>
       </w:pPr>
-      <w:hyperlink w:anchor="_Toc242715123" w:history="1">
+      <w:hyperlink w:anchor="_Toc242715907" w:history="1">
         <w:r>
           <w:rPr>
             <w:rStyle w:val="Hyperlink"/>
@@ -1838,7 +1838,7 @@
             <w:noProof/>
             <w:webHidden/>
           </w:rPr>
-          <w:instrText xml:space="preserve"> PAGEREF _Toc242715123 \h </w:instrText>
+          <w:instrText xml:space="preserve"> PAGEREF _Toc242715907 \h </w:instrText>
         </w:r>
         <w:r>
           <w:rPr>
@@ -1858,7 +1858,7 @@
             <w:noProof/>
             <w:webHidden/>
           </w:rPr>
-          <w:t>12</w:t>
+          <w:t>13</w:t>
         </w:r>
         <w:r>
           <w:rPr>
@@ -1879,7 +1879,7 @@
           <w:noProof/>
         </w:rPr>
       </w:pPr>
-      <w:hyperlink w:anchor="_Toc242715124" w:history="1">
+      <w:hyperlink w:anchor="_Toc242715908" w:history="1">
         <w:r>
           <w:rPr>
             <w:rStyle w:val="Hyperlink"/>
@@ -1906,7 +1906,7 @@
             <w:noProof/>
             <w:webHidden/>
           </w:rPr>
-          <w:instrText xml:space="preserve"> PAGEREF _Toc242715124 \h </w:instrText>
+          <w:instrText xml:space="preserve"> PAGEREF _Toc242715908 \h </w:instrText>
         </w:r>
         <w:r>
           <w:rPr>
@@ -1926,7 +1926,7 @@
             <w:noProof/>
             <w:webHidden/>
           </w:rPr>
-          <w:t>12</w:t>
+          <w:t>13</w:t>
         </w:r>
         <w:r>
           <w:rPr>
@@ -1947,7 +1947,7 @@
           <w:noProof/>
         </w:rPr>
       </w:pPr>
-      <w:hyperlink w:anchor="_Toc242715125" w:history="1">
+      <w:hyperlink w:anchor="_Toc242715909" w:history="1">
         <w:r>
           <w:rPr>
             <w:rStyle w:val="Hyperlink"/>
@@ -1974,7 +1974,7 @@
             <w:noProof/>
             <w:webHidden/>
           </w:rPr>
-          <w:instrText xml:space="preserve"> PAGEREF _Toc242715125 \h </w:instrText>
+          <w:instrText xml:space="preserve"> PAGEREF _Toc242715909 \h </w:instrText>
         </w:r>
         <w:r>
           <w:rPr>
@@ -1994,7 +1994,7 @@
             <w:noProof/>
             <w:webHidden/>
           </w:rPr>
-          <w:t>14</w:t>
+          <w:t>15</w:t>
         </w:r>
         <w:r>
           <w:rPr>
@@ -2015,7 +2015,7 @@
           <w:noProof/>
         </w:rPr>
       </w:pPr>
-      <w:hyperlink w:anchor="_Toc242715126" w:history="1">
+      <w:hyperlink w:anchor="_Toc242715910" w:history="1">
         <w:r>
           <w:rPr>
             <w:rStyle w:val="Hyperlink"/>
@@ -2042,7 +2042,7 @@
             <w:noProof/>
             <w:webHidden/>
           </w:rPr>
-          <w:instrText xml:space="preserve"> PAGEREF _Toc242715126 \h </w:instrText>
+          <w:instrText xml:space="preserve"> PAGEREF _Toc242715910 \h </w:instrText>
         </w:r>
         <w:r>
           <w:rPr>
@@ -2062,7 +2062,7 @@
             <w:noProof/>
             <w:webHidden/>
           </w:rPr>
-          <w:t>16</w:t>
+          <w:t>17</w:t>
         </w:r>
         <w:r>
           <w:rPr>
@@ -2083,7 +2083,7 @@
           <w:noProof/>
         </w:rPr>
       </w:pPr>
-      <w:hyperlink w:anchor="_Toc242715127" w:history="1">
+      <w:hyperlink w:anchor="_Toc242715911" w:history="1">
         <w:r>
           <w:rPr>
             <w:rStyle w:val="Hyperlink"/>
@@ -2110,7 +2110,7 @@
             <w:noProof/>
             <w:webHidden/>
           </w:rPr>
-          <w:instrText xml:space="preserve"> PAGEREF _Toc242715127 \h </w:instrText>
+          <w:instrText xml:space="preserve"> PAGEREF _Toc242715911 \h </w:instrText>
         </w:r>
         <w:r>
           <w:rPr>
@@ -2130,7 +2130,7 @@
             <w:noProof/>
             <w:webHidden/>
           </w:rPr>
-          <w:t>17</w:t>
+          <w:t>18</w:t>
         </w:r>
         <w:r>
           <w:rPr>
@@ -2151,7 +2151,7 @@
           <w:noProof/>
         </w:rPr>
       </w:pPr>
-      <w:hyperlink w:anchor="_Toc242715128" w:history="1">
+      <w:hyperlink w:anchor="_Toc242715912" w:history="1">
         <w:r>
           <w:rPr>
             <w:rStyle w:val="Hyperlink"/>
@@ -2178,7 +2178,7 @@
             <w:noProof/>
             <w:webHidden/>
           </w:rPr>
-          <w:instrText xml:space="preserve"> PAGEREF _Toc242715128 \h </w:instrText>
+          <w:instrText xml:space="preserve"> PAGEREF _Toc242715912 \h </w:instrText>
         </w:r>
         <w:r>
           <w:rPr>
@@ -2198,7 +2198,7 @@
             <w:noProof/>
             <w:webHidden/>
           </w:rPr>
-          <w:t>19</w:t>
+          <w:t>20</w:t>
         </w:r>
         <w:r>
           <w:rPr>
@@ -2219,7 +2219,7 @@
           <w:noProof/>
         </w:rPr>
       </w:pPr>
-      <w:hyperlink w:anchor="_Toc242715129" w:history="1">
+      <w:hyperlink w:anchor="_Toc242715913" w:history="1">
         <w:r>
           <w:rPr>
             <w:rStyle w:val="Hyperlink"/>
@@ -2246,7 +2246,7 @@
             <w:noProof/>
             <w:webHidden/>
           </w:rPr>
-          <w:instrText xml:space="preserve"> PAGEREF _Toc242715129 \h </w:instrText>
+          <w:instrText xml:space="preserve"> PAGEREF _Toc242715913 \h </w:instrText>
         </w:r>
         <w:r>
           <w:rPr>
@@ -2266,7 +2266,7 @@
             <w:noProof/>
             <w:webHidden/>
           </w:rPr>
-          <w:t>19</w:t>
+          <w:t>20</w:t>
         </w:r>
         <w:r>
           <w:rPr>
@@ -2287,7 +2287,7 @@
           <w:noProof/>
         </w:rPr>
       </w:pPr>
-      <w:hyperlink w:anchor="_Toc242715130" w:history="1">
+      <w:hyperlink w:anchor="_Toc242715914" w:history="1">
         <w:r>
           <w:rPr>
             <w:rStyle w:val="Hyperlink"/>
@@ -2314,7 +2314,7 @@
             <w:noProof/>
             <w:webHidden/>
           </w:rPr>
-          <w:instrText xml:space="preserve"> PAGEREF _Toc242715130 \h </w:instrText>
+          <w:instrText xml:space="preserve"> PAGEREF _Toc242715914 \h </w:instrText>
         </w:r>
         <w:r>
           <w:rPr>
@@ -2334,7 +2334,7 @@
             <w:noProof/>
             <w:webHidden/>
           </w:rPr>
-          <w:t>19</w:t>
+          <w:t>20</w:t>
         </w:r>
         <w:r>
           <w:rPr>
@@ -2355,7 +2355,7 @@
           <w:noProof/>
         </w:rPr>
       </w:pPr>
-      <w:hyperlink w:anchor="_Toc242715131" w:history="1">
+      <w:hyperlink w:anchor="_Toc242715915" w:history="1">
         <w:r>
           <w:rPr>
             <w:rStyle w:val="Hyperlink"/>
@@ -2382,7 +2382,7 @@
             <w:noProof/>
             <w:webHidden/>
           </w:rPr>
-          <w:instrText xml:space="preserve"> PAGEREF _Toc242715131 \h </w:instrText>
+          <w:instrText xml:space="preserve"> PAGEREF _Toc242715915 \h </w:instrText>
         </w:r>
         <w:r>
           <w:rPr>
@@ -2402,7 +2402,7 @@
             <w:noProof/>
             <w:webHidden/>
           </w:rPr>
-          <w:t>20</w:t>
+          <w:t>21</w:t>
         </w:r>
         <w:r>
           <w:rPr>
@@ -2423,7 +2423,7 @@
           <w:noProof/>
         </w:rPr>
       </w:pPr>
-      <w:hyperlink w:anchor="_Toc242715132" w:history="1">
+      <w:hyperlink w:anchor="_Toc242715916" w:history="1">
         <w:r>
           <w:rPr>
             <w:rStyle w:val="Hyperlink"/>
@@ -2450,7 +2450,7 @@
             <w:noProof/>
             <w:webHidden/>
           </w:rPr>
-          <w:instrText xml:space="preserve"> PAGEREF _Toc242715132 \h </w:instrText>
+          <w:instrText xml:space="preserve"> PAGEREF _Toc242715916 \h </w:instrText>
         </w:r>
         <w:r>
           <w:rPr>
@@ -2470,7 +2470,7 @@
             <w:noProof/>
             <w:webHidden/>
           </w:rPr>
-          <w:t>20</w:t>
+          <w:t>21</w:t>
         </w:r>
         <w:r>
           <w:rPr>
@@ -2491,7 +2491,7 @@
           <w:noProof/>
         </w:rPr>
       </w:pPr>
-      <w:hyperlink w:anchor="_Toc242715133" w:history="1">
+      <w:hyperlink w:anchor="_Toc242715917" w:history="1">
         <w:r>
           <w:rPr>
             <w:rStyle w:val="Hyperlink"/>
@@ -2518,7 +2518,7 @@
             <w:noProof/>
             <w:webHidden/>
           </w:rPr>
-          <w:instrText xml:space="preserve"> PAGEREF _Toc242715133 \h </w:instrText>
+          <w:instrText xml:space="preserve"> PAGEREF _Toc242715917 \h </w:instrText>
         </w:r>
         <w:r>
           <w:rPr>
@@ -2538,7 +2538,7 @@
             <w:noProof/>
             <w:webHidden/>
           </w:rPr>
-          <w:t>20</w:t>
+          <w:t>21</w:t>
         </w:r>
         <w:r>
           <w:rPr>
@@ -2559,7 +2559,7 @@
           <w:noProof/>
         </w:rPr>
       </w:pPr>
-      <w:hyperlink w:anchor="_Toc242715134" w:history="1">
+      <w:hyperlink w:anchor="_Toc242715918" w:history="1">
         <w:r>
           <w:rPr>
             <w:rStyle w:val="Hyperlink"/>
@@ -2586,7 +2586,7 @@
             <w:noProof/>
             <w:webHidden/>
           </w:rPr>
-          <w:instrText xml:space="preserve"> PAGEREF _Toc242715134 \h </w:instrText>
+          <w:instrText xml:space="preserve"> PAGEREF _Toc242715918 \h </w:instrText>
         </w:r>
         <w:r>
           <w:rPr>
@@ -2606,7 +2606,7 @@
             <w:noProof/>
             <w:webHidden/>
           </w:rPr>
-          <w:t>20</w:t>
+          <w:t>21</w:t>
         </w:r>
         <w:r>
           <w:rPr>
@@ -2627,7 +2627,7 @@
           <w:noProof/>
         </w:rPr>
       </w:pPr>
-      <w:hyperlink w:anchor="_Toc242715135" w:history="1">
+      <w:hyperlink w:anchor="_Toc242715919" w:history="1">
         <w:r>
           <w:rPr>
             <w:rStyle w:val="Hyperlink"/>
@@ -2654,7 +2654,7 @@
             <w:noProof/>
             <w:webHidden/>
           </w:rPr>
-          <w:instrText xml:space="preserve"> PAGEREF _Toc242715135 \h </w:instrText>
+          <w:instrText xml:space="preserve"> PAGEREF _Toc242715919 \h </w:instrText>
         </w:r>
         <w:r>
           <w:rPr>
@@ -2674,7 +2674,7 @@
             <w:noProof/>
             <w:webHidden/>
           </w:rPr>
-          <w:t>21</w:t>
+          <w:t>22</w:t>
         </w:r>
         <w:r>
           <w:rPr>
@@ -2695,7 +2695,7 @@
           <w:noProof/>
         </w:rPr>
       </w:pPr>
-      <w:hyperlink w:anchor="_Toc242715136" w:history="1">
+      <w:hyperlink w:anchor="_Toc242715920" w:history="1">
         <w:r>
           <w:rPr>
             <w:rStyle w:val="Hyperlink"/>
@@ -2722,7 +2722,7 @@
             <w:noProof/>
             <w:webHidden/>
           </w:rPr>
-          <w:instrText xml:space="preserve"> PAGEREF _Toc242715136 \h </w:instrText>
+          <w:instrText xml:space="preserve"> PAGEREF _Toc242715920 \h </w:instrText>
         </w:r>
         <w:r>
           <w:rPr>
@@ -2742,7 +2742,7 @@
             <w:noProof/>
             <w:webHidden/>
           </w:rPr>
-          <w:t>21</w:t>
+          <w:t>22</w:t>
         </w:r>
         <w:r>
           <w:rPr>
@@ -2763,7 +2763,7 @@
           <w:noProof/>
         </w:rPr>
       </w:pPr>
-      <w:hyperlink w:anchor="_Toc242715137" w:history="1">
+      <w:hyperlink w:anchor="_Toc242715921" w:history="1">
         <w:r>
           <w:rPr>
             <w:rStyle w:val="Hyperlink"/>
@@ -2790,7 +2790,7 @@
             <w:noProof/>
             <w:webHidden/>
           </w:rPr>
-          <w:instrText xml:space="preserve"> PAGEREF _Toc242715137 \h </w:instrText>
+          <w:instrText xml:space="preserve"> PAGEREF _Toc242715921 \h </w:instrText>
         </w:r>
         <w:r>
           <w:rPr>
@@ -2810,7 +2810,7 @@
             <w:noProof/>
             <w:webHidden/>
           </w:rPr>
-          <w:t>22</w:t>
+          <w:t>23</w:t>
         </w:r>
         <w:r>
           <w:rPr>
@@ -2831,7 +2831,7 @@
           <w:noProof/>
         </w:rPr>
       </w:pPr>
-      <w:hyperlink w:anchor="_Toc242715138" w:history="1">
+      <w:hyperlink w:anchor="_Toc242715922" w:history="1">
         <w:r>
           <w:rPr>
             <w:rStyle w:val="Hyperlink"/>
@@ -2858,7 +2858,7 @@
             <w:noProof/>
             <w:webHidden/>
           </w:rPr>
-          <w:instrText xml:space="preserve"> PAGEREF _Toc242715138 \h </w:instrText>
+          <w:instrText xml:space="preserve"> PAGEREF _Toc242715922 \h </w:instrText>
         </w:r>
         <w:r>
           <w:rPr>
@@ -2878,7 +2878,7 @@
             <w:noProof/>
             <w:webHidden/>
           </w:rPr>
-          <w:t>23</w:t>
+          <w:t>24</w:t>
         </w:r>
         <w:r>
           <w:rPr>
@@ -2899,7 +2899,7 @@
           <w:noProof/>
         </w:rPr>
       </w:pPr>
-      <w:hyperlink w:anchor="_Toc242715139" w:history="1">
+      <w:hyperlink w:anchor="_Toc242715923" w:history="1">
         <w:r>
           <w:rPr>
             <w:rStyle w:val="Hyperlink"/>
@@ -2926,7 +2926,7 @@
             <w:noProof/>
             <w:webHidden/>
           </w:rPr>
-          <w:instrText xml:space="preserve"> PAGEREF _Toc242715139 \h </w:instrText>
+          <w:instrText xml:space="preserve"> PAGEREF _Toc242715923 \h </w:instrText>
         </w:r>
         <w:r>
           <w:rPr>
@@ -2946,7 +2946,7 @@
             <w:noProof/>
             <w:webHidden/>
           </w:rPr>
-          <w:t>23</w:t>
+          <w:t>24</w:t>
         </w:r>
         <w:r>
           <w:rPr>
@@ -2967,7 +2967,7 @@
           <w:noProof/>
         </w:rPr>
       </w:pPr>
-      <w:hyperlink w:anchor="_Toc242715140" w:history="1">
+      <w:hyperlink w:anchor="_Toc242715924" w:history="1">
         <w:r>
           <w:rPr>
             <w:rStyle w:val="Hyperlink"/>
@@ -2994,7 +2994,7 @@
             <w:noProof/>
             <w:webHidden/>
           </w:rPr>
-          <w:instrText xml:space="preserve"> PAGEREF _Toc242715140 \h </w:instrText>
+          <w:instrText xml:space="preserve"> PAGEREF _Toc242715924 \h </w:instrText>
         </w:r>
         <w:r>
           <w:rPr>
@@ -3014,7 +3014,7 @@
             <w:noProof/>
             <w:webHidden/>
           </w:rPr>
-          <w:t>23</w:t>
+          <w:t>24</w:t>
         </w:r>
         <w:r>
           <w:rPr>
@@ -3035,7 +3035,7 @@
           <w:noProof/>
         </w:rPr>
       </w:pPr>
-      <w:hyperlink w:anchor="_Toc242715141" w:history="1">
+      <w:hyperlink w:anchor="_Toc242715925" w:history="1">
         <w:r>
           <w:rPr>
             <w:rStyle w:val="Hyperlink"/>
@@ -3062,7 +3062,7 @@
             <w:noProof/>
             <w:webHidden/>
           </w:rPr>
-          <w:instrText xml:space="preserve"> PAGEREF _Toc242715141 \h </w:instrText>
+          <w:instrText xml:space="preserve"> PAGEREF _Toc242715925 \h </w:instrText>
         </w:r>
         <w:r>
           <w:rPr>
@@ -3082,7 +3082,7 @@
             <w:noProof/>
             <w:webHidden/>
           </w:rPr>
-          <w:t>23</w:t>
+          <w:t>24</w:t>
         </w:r>
         <w:r>
           <w:rPr>
@@ -3103,7 +3103,7 @@
           <w:noProof/>
         </w:rPr>
       </w:pPr>
-      <w:hyperlink w:anchor="_Toc242715142" w:history="1">
+      <w:hyperlink w:anchor="_Toc242715926" w:history="1">
         <w:r>
           <w:rPr>
             <w:rStyle w:val="Hyperlink"/>
@@ -3130,7 +3130,7 @@
             <w:noProof/>
             <w:webHidden/>
           </w:rPr>
-          <w:instrText xml:space="preserve"> PAGEREF _Toc242715142 \h </w:instrText>
+          <w:instrText xml:space="preserve"> PAGEREF _Toc242715926 \h </w:instrText>
         </w:r>
         <w:r>
           <w:rPr>
@@ -3150,7 +3150,7 @@
             <w:noProof/>
             <w:webHidden/>
           </w:rPr>
-          <w:t>24</w:t>
+          <w:t>25</w:t>
         </w:r>
         <w:r>
           <w:rPr>
@@ -3171,7 +3171,7 @@
           <w:noProof/>
         </w:rPr>
       </w:pPr>
-      <w:hyperlink w:anchor="_Toc242715143" w:history="1">
+      <w:hyperlink w:anchor="_Toc242715927" w:history="1">
         <w:r>
           <w:rPr>
             <w:rStyle w:val="Hyperlink"/>
@@ -3198,7 +3198,7 @@
             <w:noProof/>
             <w:webHidden/>
           </w:rPr>
-          <w:instrText xml:space="preserve"> PAGEREF _Toc242715143 \h </w:instrText>
+          <w:instrText xml:space="preserve"> PAGEREF _Toc242715927 \h </w:instrText>
         </w:r>
         <w:r>
           <w:rPr>
@@ -3218,7 +3218,7 @@
             <w:noProof/>
             <w:webHidden/>
           </w:rPr>
-          <w:t>31</w:t>
+          <w:t>32</w:t>
         </w:r>
         <w:r>
           <w:rPr>
@@ -3239,7 +3239,7 @@
           <w:noProof/>
         </w:rPr>
       </w:pPr>
-      <w:hyperlink w:anchor="_Toc242715144" w:history="1">
+      <w:hyperlink w:anchor="_Toc242715928" w:history="1">
         <w:r>
           <w:rPr>
             <w:rStyle w:val="Hyperlink"/>
@@ -3266,7 +3266,7 @@
             <w:noProof/>
             <w:webHidden/>
           </w:rPr>
-          <w:instrText xml:space="preserve"> PAGEREF _Toc242715144 \h </w:instrText>
+          <w:instrText xml:space="preserve"> PAGEREF _Toc242715928 \h </w:instrText>
         </w:r>
         <w:r>
           <w:rPr>
@@ -3286,7 +3286,7 @@
             <w:noProof/>
             <w:webHidden/>
           </w:rPr>
-          <w:t>33</w:t>
+          <w:t>34</w:t>
         </w:r>
         <w:r>
           <w:rPr>
@@ -3307,7 +3307,7 @@
           <w:noProof/>
         </w:rPr>
       </w:pPr>
-      <w:hyperlink w:anchor="_Toc242715145" w:history="1">
+      <w:hyperlink w:anchor="_Toc242715929" w:history="1">
         <w:r>
           <w:rPr>
             <w:rStyle w:val="Hyperlink"/>
@@ -3334,7 +3334,7 @@
             <w:noProof/>
             <w:webHidden/>
           </w:rPr>
-          <w:instrText xml:space="preserve"> PAGEREF _Toc242715145 \h </w:instrText>
+          <w:instrText xml:space="preserve"> PAGEREF _Toc242715929 \h </w:instrText>
         </w:r>
         <w:r>
           <w:rPr>
@@ -3354,7 +3354,7 @@
             <w:noProof/>
             <w:webHidden/>
           </w:rPr>
-          <w:t>33</w:t>
+          <w:t>34</w:t>
         </w:r>
         <w:r>
           <w:rPr>
@@ -3375,7 +3375,7 @@
           <w:noProof/>
         </w:rPr>
       </w:pPr>
-      <w:hyperlink w:anchor="_Toc242715146" w:history="1">
+      <w:hyperlink w:anchor="_Toc242715930" w:history="1">
         <w:r>
           <w:rPr>
             <w:rStyle w:val="Hyperlink"/>
@@ -3402,7 +3402,7 @@
             <w:noProof/>
             <w:webHidden/>
           </w:rPr>
-          <w:instrText xml:space="preserve"> PAGEREF _Toc242715146 \h </w:instrText>
+          <w:instrText xml:space="preserve"> PAGEREF _Toc242715930 \h </w:instrText>
         </w:r>
         <w:r>
           <w:rPr>
@@ -3422,7 +3422,7 @@
             <w:noProof/>
             <w:webHidden/>
           </w:rPr>
-          <w:t>33</w:t>
+          <w:t>34</w:t>
         </w:r>
         <w:r>
           <w:rPr>
@@ -3443,7 +3443,7 @@
           <w:noProof/>
         </w:rPr>
       </w:pPr>
-      <w:hyperlink w:anchor="_Toc242715147" w:history="1">
+      <w:hyperlink w:anchor="_Toc242715931" w:history="1">
         <w:r>
           <w:rPr>
             <w:rStyle w:val="Hyperlink"/>
@@ -3470,7 +3470,7 @@
             <w:noProof/>
             <w:webHidden/>
           </w:rPr>
-          <w:instrText xml:space="preserve"> PAGEREF _Toc242715147 \h </w:instrText>
+          <w:instrText xml:space="preserve"> PAGEREF _Toc242715931 \h </w:instrText>
         </w:r>
         <w:r>
           <w:rPr>
@@ -3490,7 +3490,7 @@
             <w:noProof/>
             <w:webHidden/>
           </w:rPr>
-          <w:t>33</w:t>
+          <w:t>34</w:t>
         </w:r>
         <w:r>
           <w:rPr>
@@ -3511,7 +3511,7 @@
           <w:noProof/>
         </w:rPr>
       </w:pPr>
-      <w:hyperlink w:anchor="_Toc242715148" w:history="1">
+      <w:hyperlink w:anchor="_Toc242715932" w:history="1">
         <w:r>
           <w:rPr>
             <w:rStyle w:val="Hyperlink"/>
@@ -3538,7 +3538,7 @@
             <w:noProof/>
             <w:webHidden/>
           </w:rPr>
-          <w:instrText xml:space="preserve"> PAGEREF _Toc242715148 \h </w:instrText>
+          <w:instrText xml:space="preserve"> PAGEREF _Toc242715932 \h </w:instrText>
         </w:r>
         <w:r>
           <w:rPr>
@@ -3558,7 +3558,7 @@
             <w:noProof/>
             <w:webHidden/>
           </w:rPr>
-          <w:t>33</w:t>
+          <w:t>34</w:t>
         </w:r>
         <w:r>
           <w:rPr>
@@ -3579,7 +3579,7 @@
           <w:noProof/>
         </w:rPr>
       </w:pPr>
-      <w:hyperlink w:anchor="_Toc242715149" w:history="1">
+      <w:hyperlink w:anchor="_Toc242715933" w:history="1">
         <w:r>
           <w:rPr>
             <w:rStyle w:val="Hyperlink"/>
@@ -3606,7 +3606,7 @@
             <w:noProof/>
             <w:webHidden/>
           </w:rPr>
-          <w:instrText xml:space="preserve"> PAGEREF _Toc242715149 \h </w:instrText>
+          <w:instrText xml:space="preserve"> PAGEREF _Toc242715933 \h </w:instrText>
         </w:r>
         <w:r>
           <w:rPr>
@@ -3626,7 +3626,7 @@
             <w:noProof/>
             <w:webHidden/>
           </w:rPr>
-          <w:t>33</w:t>
+          <w:t>34</w:t>
         </w:r>
         <w:r>
           <w:rPr>
@@ -3647,7 +3647,7 @@
           <w:noProof/>
         </w:rPr>
       </w:pPr>
-      <w:hyperlink w:anchor="_Toc242715150" w:history="1">
+      <w:hyperlink w:anchor="_Toc242715934" w:history="1">
         <w:r>
           <w:rPr>
             <w:rStyle w:val="Hyperlink"/>
@@ -3674,7 +3674,7 @@
             <w:noProof/>
             <w:webHidden/>
           </w:rPr>
-          <w:instrText xml:space="preserve"> PAGEREF _Toc242715150 \h </w:instrText>
+          <w:instrText xml:space="preserve"> PAGEREF _Toc242715934 \h </w:instrText>
         </w:r>
         <w:r>
           <w:rPr>
@@ -3694,7 +3694,7 @@
             <w:noProof/>
             <w:webHidden/>
           </w:rPr>
-          <w:t>34</w:t>
+          <w:t>35</w:t>
         </w:r>
         <w:r>
           <w:rPr>
@@ -3714,7 +3714,7 @@
       <w:pPr>
         <w:pStyle w:val="Heading1"/>
       </w:pPr>
-      <w:bookmarkStart w:id="1" w:name="_Toc242715103"/>
+      <w:bookmarkStart w:id="1" w:name="_Toc242715887"/>
       <w:r>
         <w:lastRenderedPageBreak/>
         <w:t>Step 01 – What sbom-fixer does</w:t>
@@ -4366,7 +4366,27 @@
         <w:t>pkg:type/[namespace/]name@version</w:t>
       </w:r>
       <w:r>
-        <w:t xml:space="preserve"> without qualifiers. A missing purl is built from the component's registry URL, then from the SBOM's single ecosystem (Erlang → </w:t>
+        <w:t xml:space="preserve"> without qualifiers. A DLL or JAR found in a NuGet or Maven cache gets that package's purl and version (</w:t>
+      </w:r>
+      <w:r>
+        <w:rPr>
+          <w:rFonts w:ascii="Consolas" w:hAnsi="Consolas"/>
+          <w:color w:val="8B1A1A"/>
+        </w:rPr>
+        <w:t>.nuget/packages/newtonsoft.json/13.0.3/...</w:t>
+      </w:r>
+      <w:r>
+        <w:t xml:space="preserve"> → </w:t>
+      </w:r>
+      <w:r>
+        <w:rPr>
+          <w:rFonts w:ascii="Consolas" w:hAnsi="Consolas"/>
+          <w:color w:val="8B1A1A"/>
+        </w:rPr>
+        <w:t>pkg:nuget/newtonsoft.json@13.0.3</w:t>
+      </w:r>
+      <w:r>
+        <w:t xml:space="preserve">). Any other missing purl is built from the component's registry URL (when it names the same package), then from the SBOM's single ecosystem (Erlang → </w:t>
       </w:r>
       <w:r>
         <w:rPr>
@@ -4386,7 +4406,17 @@
         <w:t>pkg:nuget</w:t>
       </w:r>
       <w:r>
-        <w:t xml:space="preserve">, ...), and only then </w:t>
+        <w:t xml:space="preserve">, ...; never for a file name such as </w:t>
+      </w:r>
+      <w:r>
+        <w:rPr>
+          <w:rFonts w:ascii="Consolas" w:hAnsi="Consolas"/>
+          <w:color w:val="8B1A1A"/>
+        </w:rPr>
+        <w:t>Foo.dll</w:t>
+      </w:r>
+      <w:r>
+        <w:t xml:space="preserve">), and only then </w:t>
       </w:r>
       <w:r>
         <w:rPr>
@@ -4423,7 +4453,27 @@
         <w:pStyle w:val="ListBullet2"/>
       </w:pPr>
       <w:r>
-        <w:t>dependencies only between components in the file, without self-dependencies or duplicates.</w:t>
+        <w:t>dependencies only between components in the file, without self-dependencies or duplicates; every component has an entry (</w:t>
+      </w:r>
+      <w:r>
+        <w:rPr>
+          <w:rFonts w:ascii="Consolas" w:hAnsi="Consolas"/>
+          <w:color w:val="8B1A1A"/>
+        </w:rPr>
+        <w:t>dependsOn: []</w:t>
+      </w:r>
+      <w:r>
+        <w:t xml:space="preserve"> when unknown), so running </w:t>
+      </w:r>
+      <w:r>
+        <w:rPr>
+          <w:rFonts w:ascii="Consolas" w:hAnsi="Consolas"/>
+          <w:color w:val="8B1A1A"/>
+        </w:rPr>
+        <w:t>fix</w:t>
+      </w:r>
+      <w:r>
+        <w:t xml:space="preserve"> on its own output changes nothing.</w:t>
       </w:r>
     </w:p>
     <w:p>
@@ -4432,6 +4482,7 @@
         <w:ind w:left="510" w:hanging="340"/>
       </w:pPr>
       <w:r>
+        <w:lastRenderedPageBreak/>
         <w:t>5.</w:t>
       </w:r>
       <w:r>
@@ -4476,7 +4527,7 @@
       <w:pPr>
         <w:pStyle w:val="Heading1"/>
       </w:pPr>
-      <w:bookmarkStart w:id="2" w:name="_Toc242715104"/>
+      <w:bookmarkStart w:id="2" w:name="_Toc242715888"/>
       <w:r>
         <w:lastRenderedPageBreak/>
         <w:t>Step 02 – Check the prerequisites on the new machine</w:t>
@@ -4952,6 +5003,8 @@
       </w:r>
       <w:r>
         <w:tab/>
+      </w:r>
+      <w:r>
         <w:t>Download Python 3.12 from python.org, or install it from the company software portal.</w:t>
       </w:r>
     </w:p>
@@ -5034,7 +5087,7 @@
       <w:pPr>
         <w:pStyle w:val="Heading1"/>
       </w:pPr>
-      <w:bookmarkStart w:id="3" w:name="_Toc242715105"/>
+      <w:bookmarkStart w:id="3" w:name="_Toc242715889"/>
       <w:r>
         <w:lastRenderedPageBreak/>
         <w:t>Step 03 – Get the code onto the machine</w:t>
@@ -5284,7 +5337,7 @@
       <w:pPr>
         <w:pStyle w:val="Heading1"/>
       </w:pPr>
-      <w:bookmarkStart w:id="4" w:name="_Toc242715106"/>
+      <w:bookmarkStart w:id="4" w:name="_Toc242715890"/>
       <w:r>
         <w:lastRenderedPageBreak/>
         <w:t>Step 04 – Install on Windows</w:t>
@@ -5295,7 +5348,7 @@
       <w:pPr>
         <w:pStyle w:val="Heading2"/>
       </w:pPr>
-      <w:bookmarkStart w:id="5" w:name="_Toc242715107"/>
+      <w:bookmarkStart w:id="5" w:name="_Toc242715891"/>
       <w:r>
         <w:t>4.1 Open a terminal in the folder</w:t>
       </w:r>
@@ -5333,7 +5386,7 @@
       <w:pPr>
         <w:pStyle w:val="Heading2"/>
       </w:pPr>
-      <w:bookmarkStart w:id="6" w:name="_Toc242715108"/>
+      <w:bookmarkStart w:id="6" w:name="_Toc242715892"/>
       <w:r>
         <w:t>4.2 Create a virtual environment</w:t>
       </w:r>
@@ -5372,7 +5425,7 @@
       <w:pPr>
         <w:pStyle w:val="Heading2"/>
       </w:pPr>
-      <w:bookmarkStart w:id="7" w:name="_Toc242715109"/>
+      <w:bookmarkStart w:id="7" w:name="_Toc242715893"/>
       <w:r>
         <w:t>4.3 Activate it</w:t>
       </w:r>
@@ -5411,7 +5464,7 @@
       <w:pPr>
         <w:pStyle w:val="Heading2"/>
       </w:pPr>
-      <w:bookmarkStart w:id="8" w:name="_Toc242715110"/>
+      <w:bookmarkStart w:id="8" w:name="_Toc242715894"/>
       <w:r>
         <w:t>4.4 Install the tool</w:t>
       </w:r>
@@ -5464,7 +5517,7 @@
       <w:pPr>
         <w:pStyle w:val="Heading2"/>
       </w:pPr>
-      <w:bookmarkStart w:id="9" w:name="_Toc242715111"/>
+      <w:bookmarkStart w:id="9" w:name="_Toc242715895"/>
       <w:r>
         <w:t>4.5 Activation in other terminals</w:t>
       </w:r>
@@ -5692,7 +5745,7 @@
       <w:pPr>
         <w:pStyle w:val="Heading2"/>
       </w:pPr>
-      <w:bookmarkStart w:id="10" w:name="_Toc242715112"/>
+      <w:bookmarkStart w:id="10" w:name="_Toc242715896"/>
       <w:r>
         <w:t>4.6 Offline install (machine without internet)</w:t>
       </w:r>
@@ -5826,7 +5879,7 @@
       <w:pPr>
         <w:pStyle w:val="Heading2"/>
       </w:pPr>
-      <w:bookmarkStart w:id="11" w:name="_Toc242715113"/>
+      <w:bookmarkStart w:id="11" w:name="_Toc242715897"/>
       <w:r>
         <w:lastRenderedPageBreak/>
         <w:t>4.7 Make the command available everywhere (optional)</w:t>
@@ -5877,7 +5930,7 @@
       <w:pPr>
         <w:pStyle w:val="Heading1"/>
       </w:pPr>
-      <w:bookmarkStart w:id="12" w:name="_Toc242715114"/>
+      <w:bookmarkStart w:id="12" w:name="_Toc242715898"/>
       <w:r>
         <w:lastRenderedPageBreak/>
         <w:t>Step 05 – Install on Linux or macOS</w:t>
@@ -6002,7 +6055,7 @@
       <w:pPr>
         <w:pStyle w:val="Heading1"/>
       </w:pPr>
-      <w:bookmarkStart w:id="13" w:name="_Toc242715115"/>
+      <w:bookmarkStart w:id="13" w:name="_Toc242715899"/>
       <w:r>
         <w:lastRenderedPageBreak/>
         <w:t>Step 06 – Install with Docker (no Python needed)</w:t>
@@ -6215,7 +6268,7 @@
       <w:pPr>
         <w:pStyle w:val="Heading1"/>
       </w:pPr>
-      <w:bookmarkStart w:id="14" w:name="_Toc242715116"/>
+      <w:bookmarkStart w:id="14" w:name="_Toc242715900"/>
       <w:r>
         <w:lastRenderedPageBreak/>
         <w:t>Step 07 – Verify the installation</w:t>
@@ -6499,7 +6552,7 @@
       <w:pPr>
         <w:pStyle w:val="Heading1"/>
       </w:pPr>
-      <w:bookmarkStart w:id="15" w:name="_Toc242715117"/>
+      <w:bookmarkStart w:id="15" w:name="_Toc242715901"/>
       <w:r>
         <w:lastRenderedPageBreak/>
         <w:t>Step 08 – Daily workflow: fix an SBOM step by step</w:t>
@@ -6510,7 +6563,7 @@
       <w:pPr>
         <w:pStyle w:val="Heading2"/>
       </w:pPr>
-      <w:bookmarkStart w:id="16" w:name="_Toc242715118"/>
+      <w:bookmarkStart w:id="16" w:name="_Toc242715902"/>
       <w:r>
         <w:t>8.1 Generate the SBOM with your normal tool</w:t>
       </w:r>
@@ -6567,14 +6620,24 @@
         <w:t>cyclonedx-npm</w:t>
       </w:r>
       <w:r>
-        <w:t>): they write a purl for every package. Scans of binaries (DLL, JAR files) often give components without purls (Step 16, "DLL components").</w:t>
+        <w:t xml:space="preserve">): they write a purl for every package. Scans of binaries (DLL, JAR files) often give components without purls; </w:t>
+      </w:r>
+      <w:r>
+        <w:rPr>
+          <w:rFonts w:ascii="Consolas" w:hAnsi="Consolas"/>
+          <w:color w:val="8B1A1A"/>
+        </w:rPr>
+        <w:t>fix</w:t>
+      </w:r>
+      <w:r>
+        <w:t xml:space="preserve"> recovers the purl when the file path is in a NuGet or Maven cache (Step 16, "DLL components").</w:t>
       </w:r>
     </w:p>
     <w:p>
       <w:pPr>
         <w:pStyle w:val="Heading2"/>
       </w:pPr>
-      <w:bookmarkStart w:id="17" w:name="_Toc242715119"/>
+      <w:bookmarkStart w:id="17" w:name="_Toc242715903"/>
       <w:r>
         <w:t>8.2 Fix the file</w:t>
       </w:r>
@@ -7289,8 +7352,9 @@
       <w:pPr>
         <w:pStyle w:val="Heading2"/>
       </w:pPr>
-      <w:bookmarkStart w:id="18" w:name="_Toc242715120"/>
-      <w:r>
+      <w:bookmarkStart w:id="18" w:name="_Toc242715904"/>
+      <w:r>
+        <w:lastRenderedPageBreak/>
         <w:t>8.3 Read the exit code</w:t>
       </w:r>
       <w:bookmarkEnd w:id="18"/>
@@ -7363,7 +7427,6 @@
               <w:rPr>
                 <w:sz w:val="18"/>
               </w:rPr>
-              <w:lastRenderedPageBreak/>
               <w:t>cmd</w:t>
             </w:r>
           </w:p>
@@ -7463,7 +7526,7 @@
       <w:pPr>
         <w:pStyle w:val="Heading2"/>
       </w:pPr>
-      <w:bookmarkStart w:id="19" w:name="_Toc242715121"/>
+      <w:bookmarkStart w:id="19" w:name="_Toc242715905"/>
       <w:r>
         <w:t>8.4 Read the two Markdown files</w:t>
       </w:r>
@@ -7508,7 +7571,7 @@
       <w:pPr>
         <w:pStyle w:val="Heading2"/>
       </w:pPr>
-      <w:bookmarkStart w:id="20" w:name="_Toc242715122"/>
+      <w:bookmarkStart w:id="20" w:name="_Toc242715906"/>
       <w:r>
         <w:t>8.5 Upload to Checkmarx</w:t>
       </w:r>
@@ -7572,7 +7635,7 @@
       <w:pPr>
         <w:pStyle w:val="Heading2"/>
       </w:pPr>
-      <w:bookmarkStart w:id="21" w:name="_Toc242715123"/>
+      <w:bookmarkStart w:id="21" w:name="_Toc242715907"/>
       <w:r>
         <w:t>8.6 Keep the original</w:t>
       </w:r>
@@ -7587,7 +7650,7 @@
       <w:pPr>
         <w:pStyle w:val="Heading2"/>
       </w:pPr>
-      <w:bookmarkStart w:id="22" w:name="_Toc242715124"/>
+      <w:bookmarkStart w:id="22" w:name="_Toc242715908"/>
       <w:r>
         <w:t>8.7 Fill every schema field (any JSON)</w:t>
       </w:r>
@@ -7841,7 +7904,11 @@
         <w:t>other</w:t>
       </w:r>
       <w:r>
-        <w:t xml:space="preserve"> first), else a </w:t>
+        <w:t xml:space="preserve"> first), </w:t>
+      </w:r>
+      <w:r>
+        <w:lastRenderedPageBreak/>
+        <w:t xml:space="preserve">else a </w:t>
       </w:r>
       <w:r>
         <w:rPr>
@@ -7910,7 +7977,6 @@
         <w:ind w:left="510" w:hanging="340"/>
       </w:pPr>
       <w:r>
-        <w:lastRenderedPageBreak/>
         <w:t>4.</w:t>
       </w:r>
       <w:r>
@@ -8185,7 +8251,7 @@
       <w:pPr>
         <w:pStyle w:val="Heading1"/>
       </w:pPr>
-      <w:bookmarkStart w:id="23" w:name="_Toc242715125"/>
+      <w:bookmarkStart w:id="23" w:name="_Toc242715909"/>
       <w:r>
         <w:lastRenderedPageBreak/>
         <w:t>Step 09 – Understand the output files</w:t>
@@ -9110,7 +9176,7 @@
       <w:pPr>
         <w:pStyle w:val="Heading1"/>
       </w:pPr>
-      <w:bookmarkStart w:id="24" w:name="_Toc242715126"/>
+      <w:bookmarkStart w:id="24" w:name="_Toc242715910"/>
       <w:r>
         <w:lastRenderedPageBreak/>
         <w:t>Step 10 – Exit codes and what to do</w:t>
@@ -9539,7 +9605,7 @@
       <w:pPr>
         <w:pStyle w:val="Heading1"/>
       </w:pPr>
-      <w:bookmarkStart w:id="25" w:name="_Toc242715127"/>
+      <w:bookmarkStart w:id="25" w:name="_Toc242715911"/>
       <w:r>
         <w:lastRenderedPageBreak/>
         <w:t>Step 11 – Profiles and configuration</w:t>
@@ -11217,7 +11283,7 @@
       <w:pPr>
         <w:pStyle w:val="Heading1"/>
       </w:pPr>
-      <w:bookmarkStart w:id="26" w:name="_Toc242715128"/>
+      <w:bookmarkStart w:id="26" w:name="_Toc242715912"/>
       <w:r>
         <w:lastRenderedPageBreak/>
         <w:t>Step 12 – Checkmarx integration</w:t>
@@ -11250,7 +11316,7 @@
       <w:pPr>
         <w:pStyle w:val="Heading2"/>
       </w:pPr>
-      <w:bookmarkStart w:id="27" w:name="_Toc242715129"/>
+      <w:bookmarkStart w:id="27" w:name="_Toc242715913"/>
       <w:r>
         <w:t>12.1 Set up once</w:t>
       </w:r>
@@ -11634,7 +11700,7 @@
       <w:pPr>
         <w:pStyle w:val="Heading2"/>
       </w:pPr>
-      <w:bookmarkStart w:id="28" w:name="_Toc242715130"/>
+      <w:bookmarkStart w:id="28" w:name="_Toc242715914"/>
       <w:r>
         <w:t>12.2 Upload and check a file</w:t>
       </w:r>
@@ -11685,7 +11751,7 @@
       <w:pPr>
         <w:pStyle w:val="Heading1"/>
       </w:pPr>
-      <w:bookmarkStart w:id="29" w:name="_Toc242715131"/>
+      <w:bookmarkStart w:id="29" w:name="_Toc242715915"/>
       <w:r>
         <w:lastRenderedPageBreak/>
         <w:t>Step 13 – Quality audit (NTIA and sbomqs)</w:t>
@@ -11761,7 +11827,7 @@
       <w:pPr>
         <w:pStyle w:val="Heading2"/>
       </w:pPr>
-      <w:bookmarkStart w:id="30" w:name="_Toc242715132"/>
+      <w:bookmarkStart w:id="30" w:name="_Toc242715916"/>
       <w:r>
         <w:t>13.1 sbomqs is bundled in the repository</w:t>
       </w:r>
@@ -12062,7 +12128,7 @@
       <w:pPr>
         <w:pStyle w:val="Heading2"/>
       </w:pPr>
-      <w:bookmarkStart w:id="31" w:name="_Toc242715133"/>
+      <w:bookmarkStart w:id="31" w:name="_Toc242715917"/>
       <w:r>
         <w:t>13.2 How sbom-fixer finds sbomqs</w:t>
       </w:r>
@@ -12364,7 +12430,7 @@
       <w:pPr>
         <w:pStyle w:val="Heading2"/>
       </w:pPr>
-      <w:bookmarkStart w:id="32" w:name="_Toc242715134"/>
+      <w:bookmarkStart w:id="32" w:name="_Toc242715918"/>
       <w:r>
         <w:t>13.3 Use sbomqs directly</w:t>
       </w:r>
@@ -12485,7 +12551,7 @@
       <w:pPr>
         <w:pStyle w:val="Heading2"/>
       </w:pPr>
-      <w:bookmarkStart w:id="33" w:name="_Toc242715135"/>
+      <w:bookmarkStart w:id="33" w:name="_Toc242715919"/>
       <w:r>
         <w:t>13.4 Check that the bundled copy is genuine</w:t>
       </w:r>
@@ -12568,7 +12634,7 @@
       <w:pPr>
         <w:pStyle w:val="Heading2"/>
       </w:pPr>
-      <w:bookmarkStart w:id="34" w:name="_Toc242715136"/>
+      <w:bookmarkStart w:id="34" w:name="_Toc242715920"/>
       <w:r>
         <w:t>13.5 When there is no score</w:t>
       </w:r>
@@ -12809,7 +12875,7 @@
       <w:pPr>
         <w:pStyle w:val="Heading1"/>
       </w:pPr>
-      <w:bookmarkStart w:id="35" w:name="_Toc242715137"/>
+      <w:bookmarkStart w:id="35" w:name="_Toc242715921"/>
       <w:r>
         <w:lastRenderedPageBreak/>
         <w:t>Step 14 – Use in Jenkins</w:t>
@@ -12924,7 +12990,7 @@
       <w:pPr>
         <w:pStyle w:val="Heading1"/>
       </w:pPr>
-      <w:bookmarkStart w:id="36" w:name="_Toc242715138"/>
+      <w:bookmarkStart w:id="36" w:name="_Toc242715922"/>
       <w:r>
         <w:lastRenderedPageBreak/>
         <w:t>Step 15 – Rule reference</w:t>
@@ -12935,7 +13001,7 @@
       <w:pPr>
         <w:pStyle w:val="Heading2"/>
       </w:pPr>
-      <w:bookmarkStart w:id="37" w:name="_Toc242715139"/>
+      <w:bookmarkStart w:id="37" w:name="_Toc242715923"/>
       <w:r>
         <w:t>15.1 How to read a rule ID</w:t>
       </w:r>
@@ -13509,7 +13575,7 @@
       <w:pPr>
         <w:pStyle w:val="Heading2"/>
       </w:pPr>
-      <w:bookmarkStart w:id="38" w:name="_Toc242715140"/>
+      <w:bookmarkStart w:id="38" w:name="_Toc242715924"/>
       <w:r>
         <w:t>15.2 Rules every rule follows</w:t>
       </w:r>
@@ -13613,7 +13679,7 @@
       <w:pPr>
         <w:pStyle w:val="Heading2"/>
       </w:pPr>
-      <w:bookmarkStart w:id="39" w:name="_Toc242715141"/>
+      <w:bookmarkStart w:id="39" w:name="_Toc242715925"/>
       <w:r>
         <w:t>15.3 Where the rules come from</w:t>
       </w:r>
@@ -13861,7 +13927,7 @@
       <w:pPr>
         <w:pStyle w:val="Heading2"/>
       </w:pPr>
-      <w:bookmarkStart w:id="40" w:name="_Toc242715142"/>
+      <w:bookmarkStart w:id="40" w:name="_Toc242715926"/>
       <w:r>
         <w:t>15.4 All rules</w:t>
       </w:r>
@@ -17907,13 +17973,13 @@
               <w:rPr>
                 <w:sz w:val="15"/>
               </w:rPr>
-              <w:t>Every component got a purl of the form pkg:type/[namespace/]name@version: the type in lower case, qualifiers and subpath removed (Checkmarx does not use them), the version filled from the component. A missing purl was built from the bom-ref, the component's registry URL, or the SBOM's one ecosystem (Erlang -&gt; pkg:hex, .NET -&gt; pkg:nuget, ...; not when the SBOM mixes ecosystems), otherwise as pkg:generic/&lt;name&gt;@&lt;version&gt; (Checkmarx skips generic components but no purl is ever null). A purl never holds a web U</w:t>
-            </w:r>
-            <w:r>
-              <w:rPr>
-                <w:sz w:val="15"/>
-              </w:rPr>
-              <w:t>RL (http/https): URLs are converted to the registry purl or dropped.</w:t>
+              <w:t>Every component got a purl of the form pkg:type/[namespace/]name@version: the type in lower case, qualifiers and subpath removed (Checkmarx does not use them), the version filled from the component. A missing (or generic) purl of a DLL/JAR in a NuGet or Maven cache path became that package's purl. A missing purl was built from the bom-ref, the component's registry URL, or the SBOM's one ecosystem (Erlang -&gt; pkg:hex, .NET -&gt; pkg:nuget, ...; not when the SBOM mixes ecosystems, and never for a file name such a</w:t>
+            </w:r>
+            <w:r>
+              <w:rPr>
+                <w:sz w:val="15"/>
+              </w:rPr>
+              <w:t>s Foo.dll), otherwise as pkg:generic/&lt;name&gt;@&lt;version&gt; (Checkmarx skips generic components but no purl is ever null). A purl never holds a web URL (http/https): URLs are converted to the registry purl or dropped.</w:t>
             </w:r>
           </w:p>
         </w:tc>
@@ -18098,14 +18164,14 @@
               <w:rPr>
                 <w:sz w:val="15"/>
               </w:rPr>
-              <w:t xml:space="preserve">Each component was reduced to bom-ref, type, name, version, purl and licenses (profile key canonical.component_fields). Hashes, evidence, properties, externalReferences, descriptions and the other fields Checkmarx does not read were dropped; the original SBOM still has them. A missing bom-ref (or one holding a web URL, renamed in dependencies too) was set to the purl (or the name), a </w:t>
+              <w:t xml:space="preserve">Each component was reduced to bom-ref, type, name, version, purl and licenses (profile key canonical.component_fields). Hashes, evidence, properties, externalReferences, descriptions and the other fields Checkmarx does not read were dropped; the original SBOM still has them. A missing bom-ref (or one </w:t>
             </w:r>
             <w:r>
               <w:rPr>
                 <w:sz w:val="15"/>
               </w:rPr>
               <w:lastRenderedPageBreak/>
-              <w:t>missing type to library.</w:t>
+              <w:t>holding a web URL, renamed in dependencies too) was set to the purl (or the name), a missing type to library.</w:t>
             </w:r>
           </w:p>
         </w:tc>
@@ -19152,6 +19218,7 @@
               <w:rPr>
                 <w:sz w:val="15"/>
               </w:rPr>
+              <w:lastRenderedPageBreak/>
               <w:t>CDX15-004</w:t>
             </w:r>
           </w:p>
@@ -19222,14 +19289,7 @@
               <w:rPr>
                 <w:sz w:val="15"/>
               </w:rPr>
-              <w:t>Component types added in 1.5 were mapped to their nearest 1.4 type (device-driver to device, data to file, platform and machine-</w:t>
-            </w:r>
-            <w:r>
-              <w:rPr>
-                <w:sz w:val="15"/>
-              </w:rPr>
-              <w:lastRenderedPageBreak/>
-              <w:t>learning-model to application); the original type is kept in a property.</w:t>
+              <w:t>Component types added in 1.5 were mapped to their nearest 1.4 type (device-driver to device, data to file, platform and machine-learning-model to application); the original type is kept in a property.</w:t>
             </w:r>
           </w:p>
         </w:tc>
@@ -20824,6 +20884,7 @@
               <w:rPr>
                 <w:sz w:val="15"/>
               </w:rPr>
+              <w:lastRenderedPageBreak/>
               <w:t>CDX16-011</w:t>
             </w:r>
           </w:p>
@@ -20880,14 +20941,7 @@
               <w:rPr>
                 <w:sz w:val="15"/>
               </w:rPr>
-              <w:t xml:space="preserve">1.6-only external reference types to </w:t>
-            </w:r>
-            <w:r>
-              <w:rPr>
-                <w:sz w:val="15"/>
-              </w:rPr>
-              <w:lastRenderedPageBreak/>
-              <w:t>other</w:t>
+              <w:t>1.6-only external reference types to other</w:t>
             </w:r>
           </w:p>
         </w:tc>
@@ -20901,15 +20955,7 @@
               <w:rPr>
                 <w:sz w:val="15"/>
               </w:rPr>
-              <w:lastRenderedPageBreak/>
-              <w:t xml:space="preserve">External reference types added in 1.6 (source-distribution, digital-signature, electronic-signature, rfc-9116) became 'other'; the </w:t>
-            </w:r>
-            <w:r>
-              <w:rPr>
-                <w:sz w:val="15"/>
-              </w:rPr>
-              <w:lastRenderedPageBreak/>
-              <w:t>original type is kept in comment.</w:t>
+              <w:t>External reference types added in 1.6 (source-distribution, digital-signature, electronic-signature, rfc-9116) became 'other'; the original type is kept in comment.</w:t>
             </w:r>
           </w:p>
         </w:tc>
@@ -21658,7 +21704,7 @@
       <w:pPr>
         <w:pStyle w:val="Heading1"/>
       </w:pPr>
-      <w:bookmarkStart w:id="41" w:name="_Toc242715143"/>
+      <w:bookmarkStart w:id="41" w:name="_Toc242715927"/>
       <w:r>
         <w:lastRenderedPageBreak/>
         <w:t>Step 16 – Troubleshooting</w:t>
@@ -21682,7 +21728,7 @@
       <w:tblGrid>
         <w:gridCol w:w="3213"/>
         <w:gridCol w:w="3213"/>
-        <w:gridCol w:w="3213"/>
+        <w:gridCol w:w="3329"/>
       </w:tblGrid>
       <w:tr>
         <w:trPr>
@@ -22616,33 +22662,7 @@
               <w:rPr>
                 <w:sz w:val="18"/>
               </w:rPr>
-              <w:t>)</w:t>
-            </w:r>
-          </w:p>
-        </w:tc>
-        <w:tc>
-          <w:tcPr>
-            <w:tcW w:w="3213" w:type="dxa"/>
-          </w:tcPr>
-          <w:p>
-            <w:r>
-              <w:rPr>
-                <w:sz w:val="18"/>
-              </w:rPr>
-              <w:t>The SBOM was made from binaries; the assembly version is not the NuGet package version</w:t>
-            </w:r>
-          </w:p>
-        </w:tc>
-        <w:tc>
-          <w:tcPr>
-            <w:tcW w:w="3213" w:type="dxa"/>
-          </w:tcPr>
-          <w:p>
-            <w:r>
-              <w:rPr>
-                <w:sz w:val="18"/>
-              </w:rPr>
-              <w:t>Generate from the project (</w:t>
+              <w:t xml:space="preserve">) stay </w:t>
             </w:r>
             <w:r>
               <w:rPr>
@@ -22650,21 +22670,139 @@
                 <w:color w:val="8B1A1A"/>
                 <w:sz w:val="18"/>
               </w:rPr>
-              <w:t>dotnet CycloneDX MyApp.sln</w:t>
-            </w:r>
-            <w:r>
-              <w:rPr>
-                <w:sz w:val="18"/>
-              </w:rPr>
-              <w:t xml:space="preserve">), or scan the publish folder with Syft, which reads </w:t>
-            </w:r>
+              <w:t>pkg:generic</w:t>
+            </w:r>
+          </w:p>
+        </w:tc>
+        <w:tc>
+          <w:tcPr>
+            <w:tcW w:w="3213" w:type="dxa"/>
+          </w:tcPr>
+          <w:p>
+            <w:r>
+              <w:rPr>
+                <w:sz w:val="18"/>
+              </w:rPr>
+              <w:t>The SBOM was made from binaries and the file path is not in a package cache; the assembly version is not the NuGet package version</w:t>
+            </w:r>
+          </w:p>
+        </w:tc>
+        <w:tc>
+          <w:tcPr>
+            <w:tcW w:w="3213" w:type="dxa"/>
+          </w:tcPr>
+          <w:p>
             <w:r>
               <w:rPr>
                 <w:rFonts w:ascii="Consolas" w:hAnsi="Consolas"/>
                 <w:color w:val="8B1A1A"/>
                 <w:sz w:val="18"/>
               </w:rPr>
+              <w:t>fix</w:t>
+            </w:r>
+            <w:r>
+              <w:rPr>
+                <w:sz w:val="18"/>
+              </w:rPr>
+              <w:t xml:space="preserve"> uses the path when it is in </w:t>
+            </w:r>
+            <w:r>
+              <w:rPr>
+                <w:rFonts w:ascii="Consolas" w:hAnsi="Consolas"/>
+                <w:color w:val="8B1A1A"/>
+                <w:sz w:val="18"/>
+              </w:rPr>
+              <w:t>.nuget/packages/&lt;id&gt;/&lt;version&gt;/</w:t>
+            </w:r>
+            <w:r>
+              <w:rPr>
+                <w:sz w:val="18"/>
+              </w:rPr>
+              <w:t xml:space="preserve">, </w:t>
+            </w:r>
+            <w:r>
+              <w:rPr>
+                <w:rFonts w:ascii="Consolas" w:hAnsi="Consolas"/>
+                <w:color w:val="8B1A1A"/>
+                <w:sz w:val="18"/>
+              </w:rPr>
+              <w:t>packages/&lt;Id&gt;.&lt;Version&gt;/lib/</w:t>
+            </w:r>
+            <w:r>
+              <w:rPr>
+                <w:sz w:val="18"/>
+              </w:rPr>
+              <w:t xml:space="preserve">, </w:t>
+            </w:r>
+            <w:r>
+              <w:rPr>
+                <w:rFonts w:ascii="Consolas" w:hAnsi="Consolas"/>
+                <w:color w:val="8B1A1A"/>
+                <w:sz w:val="18"/>
+              </w:rPr>
+              <w:t>.m2/repository/</w:t>
+            </w:r>
+            <w:r>
+              <w:rPr>
+                <w:sz w:val="18"/>
+              </w:rPr>
+              <w:t xml:space="preserve"> or the Gradle cache (properties such as </w:t>
+            </w:r>
+            <w:r>
+              <w:rPr>
+                <w:rFonts w:ascii="Consolas" w:hAnsi="Consolas"/>
+                <w:color w:val="8B1A1A"/>
+                <w:sz w:val="18"/>
+              </w:rPr>
+              <w:t>syft:location:0:path</w:t>
+            </w:r>
+            <w:r>
+              <w:rPr>
+                <w:sz w:val="18"/>
+              </w:rPr>
+              <w:t xml:space="preserve"> or </w:t>
+            </w:r>
+            <w:r>
+              <w:rPr>
+                <w:rFonts w:ascii="Consolas" w:hAnsi="Consolas"/>
+                <w:color w:val="8B1A1A"/>
+                <w:sz w:val="18"/>
+              </w:rPr>
+              <w:t>evidence.occurrences</w:t>
+            </w:r>
+            <w:r>
+              <w:rPr>
+                <w:sz w:val="18"/>
+              </w:rPr>
+              <w:t>). Otherwise generate from the project (</w:t>
+            </w:r>
+            <w:r>
+              <w:rPr>
+                <w:rFonts w:ascii="Consolas" w:hAnsi="Consolas"/>
+                <w:color w:val="8B1A1A"/>
+                <w:sz w:val="18"/>
+              </w:rPr>
+              <w:t>dotnet CycloneDX MyApp.sln</w:t>
+            </w:r>
+            <w:r>
+              <w:rPr>
+                <w:sz w:val="18"/>
+              </w:rPr>
+              <w:t xml:space="preserve">), or scan the publish folder with Syft, which reads </w:t>
+            </w:r>
+            <w:r>
+              <w:rPr>
+                <w:rFonts w:ascii="Consolas" w:hAnsi="Consolas"/>
+                <w:color w:val="8B1A1A"/>
+                <w:sz w:val="18"/>
+              </w:rPr>
               <w:t>*.deps.json</w:t>
+            </w:r>
+            <w:r>
+              <w:rPr>
+                <w:sz w:val="18"/>
+              </w:rPr>
+              <w:t>. Company DLLs stay generic: they are in no public registry</w:t>
             </w:r>
           </w:p>
         </w:tc>
@@ -22683,6 +22821,7 @@
               <w:rPr>
                 <w:sz w:val="18"/>
               </w:rPr>
+              <w:lastRenderedPageBreak/>
               <w:t>Exit 7 for an Erlang or Rust SBOM</w:t>
             </w:r>
           </w:p>
@@ -22882,7 +23021,6 @@
               <w:rPr>
                 <w:sz w:val="18"/>
               </w:rPr>
-              <w:lastRenderedPageBreak/>
               <w:t>Checkmarx still rejects the corrected file</w:t>
             </w:r>
           </w:p>
@@ -23000,7 +23138,7 @@
       <w:pPr>
         <w:pStyle w:val="Heading1"/>
       </w:pPr>
-      <w:bookmarkStart w:id="42" w:name="_Toc242715144"/>
+      <w:bookmarkStart w:id="42" w:name="_Toc242715928"/>
       <w:r>
         <w:lastRenderedPageBreak/>
         <w:t>Step 17 – Updating the tool</w:t>
@@ -23011,7 +23149,7 @@
       <w:pPr>
         <w:pStyle w:val="Heading2"/>
       </w:pPr>
-      <w:bookmarkStart w:id="43" w:name="_Toc242715145"/>
+      <w:bookmarkStart w:id="43" w:name="_Toc242715929"/>
       <w:r>
         <w:t>17.1 Install a newer version</w:t>
       </w:r>
@@ -23106,7 +23244,7 @@
       <w:pPr>
         <w:pStyle w:val="Heading2"/>
       </w:pPr>
-      <w:bookmarkStart w:id="44" w:name="_Toc242715146"/>
+      <w:bookmarkStart w:id="44" w:name="_Toc242715930"/>
       <w:r>
         <w:t>17.2 When CycloneDX releases a new version</w:t>
       </w:r>
@@ -23199,7 +23337,7 @@
       <w:pPr>
         <w:pStyle w:val="Heading2"/>
       </w:pPr>
-      <w:bookmarkStart w:id="45" w:name="_Toc242715147"/>
+      <w:bookmarkStart w:id="45" w:name="_Toc242715931"/>
       <w:r>
         <w:t>17.3 When Checkmarx supports a newer version</w:t>
       </w:r>
@@ -23234,7 +23372,7 @@
       <w:pPr>
         <w:pStyle w:val="Heading2"/>
       </w:pPr>
-      <w:bookmarkStart w:id="46" w:name="_Toc242715148"/>
+      <w:bookmarkStart w:id="46" w:name="_Toc242715932"/>
       <w:r>
         <w:t>17.4 When a new sbomqs is released</w:t>
       </w:r>
@@ -23385,7 +23523,7 @@
       <w:pPr>
         <w:pStyle w:val="Heading2"/>
       </w:pPr>
-      <w:bookmarkStart w:id="47" w:name="_Toc242715149"/>
+      <w:bookmarkStart w:id="47" w:name="_Toc242715933"/>
       <w:r>
         <w:t>17.5 Adding a new rule (developers)</w:t>
       </w:r>
@@ -23543,7 +23681,7 @@
       <w:pPr>
         <w:pStyle w:val="Heading1"/>
       </w:pPr>
-      <w:bookmarkStart w:id="48" w:name="_Toc242715150"/>
+      <w:bookmarkStart w:id="48" w:name="_Toc242715934"/>
       <w:r>
         <w:lastRenderedPageBreak/>
         <w:t>Step 18 – Command cheat sheet</w:t>
@@ -24362,31 +24500,31 @@
       </w:rPr>
     </w:lvl>
   </w:abstractNum>
-  <w:num w:numId="1" w16cid:durableId="1445148996">
+  <w:num w:numId="1" w16cid:durableId="1471244401">
     <w:abstractNumId w:val="8"/>
   </w:num>
-  <w:num w:numId="2" w16cid:durableId="1410536709">
+  <w:num w:numId="2" w16cid:durableId="2053574711">
     <w:abstractNumId w:val="6"/>
   </w:num>
-  <w:num w:numId="3" w16cid:durableId="551580332">
+  <w:num w:numId="3" w16cid:durableId="650520540">
     <w:abstractNumId w:val="5"/>
   </w:num>
-  <w:num w:numId="4" w16cid:durableId="810295323">
+  <w:num w:numId="4" w16cid:durableId="2059477817">
     <w:abstractNumId w:val="4"/>
   </w:num>
-  <w:num w:numId="5" w16cid:durableId="656154348">
+  <w:num w:numId="5" w16cid:durableId="375088830">
     <w:abstractNumId w:val="7"/>
   </w:num>
-  <w:num w:numId="6" w16cid:durableId="33971346">
+  <w:num w:numId="6" w16cid:durableId="2117746170">
     <w:abstractNumId w:val="3"/>
   </w:num>
-  <w:num w:numId="7" w16cid:durableId="755512863">
+  <w:num w:numId="7" w16cid:durableId="216548490">
     <w:abstractNumId w:val="2"/>
   </w:num>
-  <w:num w:numId="8" w16cid:durableId="2127969373">
+  <w:num w:numId="8" w16cid:durableId="1285037708">
     <w:abstractNumId w:val="1"/>
   </w:num>
-  <w:num w:numId="9" w16cid:durableId="1560818829">
+  <w:num w:numId="9" w16cid:durableId="957028888">
     <w:abstractNumId w:val="0"/>
   </w:num>
 </w:numbering>
@@ -35783,7 +35921,7 @@
     <w:autoRedefine/>
     <w:uiPriority w:val="39"/>
     <w:unhideWhenUsed/>
-    <w:rsid w:val="00B67551"/>
+    <w:rsid w:val="00EE1920"/>
     <w:pPr>
       <w:spacing w:after="100"/>
     </w:pPr>
@@ -35795,7 +35933,7 @@
     <w:autoRedefine/>
     <w:uiPriority w:val="39"/>
     <w:unhideWhenUsed/>
-    <w:rsid w:val="00B67551"/>
+    <w:rsid w:val="00EE1920"/>
     <w:pPr>
       <w:spacing w:after="100"/>
       <w:ind w:left="210"/>
@@ -35806,7 +35944,7 @@
     <w:basedOn w:val="DefaultParagraphFont"/>
     <w:uiPriority w:val="99"/>
     <w:unhideWhenUsed/>
-    <w:rsid w:val="00B67551"/>
+    <w:rsid w:val="00EE1920"/>
     <w:rPr>
       <w:color w:val="0000FF" w:themeColor="hyperlink"/>
       <w:u w:val="single"/>

</xml_diff>

<commit_message>
Short suggestions file: one table of what is missing and how to fix it
<name>.suggestions.md is now one table, one row per problem of the original:
Missing / wrong (plain words), Count (components), Components (name@version,
up to 5) and Fix (what to change in the generator or manifest). Schema errors
come first and their repairs are not listed again; no rule IDs, change paths
or reason counts. Docs, examples and the wheel updated.
</commit_message>
<xml_diff>
--- a/SBOM_Fixer_Rule_Book_And_Installation_guide.docx
+++ b/SBOM_Fixer_Rule_Book_And_Installation_guide.docx
@@ -358,7 +358,7 @@
       <w:pPr>
         <w:pStyle w:val="Heading1"/>
       </w:pPr>
-      <w:bookmarkStart w:id="0" w:name="_Toc242715886"/>
+      <w:bookmarkStart w:id="0" w:name="_Toc242716459"/>
       <w:r>
         <w:t>Contents</w:t>
       </w:r>
@@ -383,7 +383,7 @@
       <w:r>
         <w:fldChar w:fldCharType="separate"/>
       </w:r>
-      <w:hyperlink w:anchor="_Toc242715886" w:history="1">
+      <w:hyperlink w:anchor="_Toc242716459" w:history="1">
         <w:r>
           <w:rPr>
             <w:rStyle w:val="Hyperlink"/>
@@ -410,7 +410,7 @@
             <w:noProof/>
             <w:webHidden/>
           </w:rPr>
-          <w:instrText xml:space="preserve"> PAGEREF _Toc242715886 \h </w:instrText>
+          <w:instrText xml:space="preserve"> PAGEREF _Toc242716459 \h </w:instrText>
         </w:r>
         <w:r>
           <w:rPr>
@@ -451,7 +451,7 @@
           <w:noProof/>
         </w:rPr>
       </w:pPr>
-      <w:hyperlink w:anchor="_Toc242715887" w:history="1">
+      <w:hyperlink w:anchor="_Toc242716460" w:history="1">
         <w:r>
           <w:rPr>
             <w:rStyle w:val="Hyperlink"/>
@@ -478,7 +478,7 @@
             <w:noProof/>
             <w:webHidden/>
           </w:rPr>
-          <w:instrText xml:space="preserve"> PAGEREF _Toc242715887 \h </w:instrText>
+          <w:instrText xml:space="preserve"> PAGEREF _Toc242716460 \h </w:instrText>
         </w:r>
         <w:r>
           <w:rPr>
@@ -519,7 +519,7 @@
           <w:noProof/>
         </w:rPr>
       </w:pPr>
-      <w:hyperlink w:anchor="_Toc242715888" w:history="1">
+      <w:hyperlink w:anchor="_Toc242716461" w:history="1">
         <w:r>
           <w:rPr>
             <w:rStyle w:val="Hyperlink"/>
@@ -546,7 +546,7 @@
             <w:noProof/>
             <w:webHidden/>
           </w:rPr>
-          <w:instrText xml:space="preserve"> PAGEREF _Toc242715888 \h </w:instrText>
+          <w:instrText xml:space="preserve"> PAGEREF _Toc242716461 \h </w:instrText>
         </w:r>
         <w:r>
           <w:rPr>
@@ -587,7 +587,7 @@
           <w:noProof/>
         </w:rPr>
       </w:pPr>
-      <w:hyperlink w:anchor="_Toc242715889" w:history="1">
+      <w:hyperlink w:anchor="_Toc242716462" w:history="1">
         <w:r>
           <w:rPr>
             <w:rStyle w:val="Hyperlink"/>
@@ -614,7 +614,7 @@
             <w:noProof/>
             <w:webHidden/>
           </w:rPr>
-          <w:instrText xml:space="preserve"> PAGEREF _Toc242715889 \h </w:instrText>
+          <w:instrText xml:space="preserve"> PAGEREF _Toc242716462 \h </w:instrText>
         </w:r>
         <w:r>
           <w:rPr>
@@ -655,7 +655,7 @@
           <w:noProof/>
         </w:rPr>
       </w:pPr>
-      <w:hyperlink w:anchor="_Toc242715890" w:history="1">
+      <w:hyperlink w:anchor="_Toc242716463" w:history="1">
         <w:r>
           <w:rPr>
             <w:rStyle w:val="Hyperlink"/>
@@ -682,7 +682,7 @@
             <w:noProof/>
             <w:webHidden/>
           </w:rPr>
-          <w:instrText xml:space="preserve"> PAGEREF _Toc242715890 \h </w:instrText>
+          <w:instrText xml:space="preserve"> PAGEREF _Toc242716463 \h </w:instrText>
         </w:r>
         <w:r>
           <w:rPr>
@@ -723,7 +723,7 @@
           <w:noProof/>
         </w:rPr>
       </w:pPr>
-      <w:hyperlink w:anchor="_Toc242715891" w:history="1">
+      <w:hyperlink w:anchor="_Toc242716464" w:history="1">
         <w:r>
           <w:rPr>
             <w:rStyle w:val="Hyperlink"/>
@@ -750,7 +750,7 @@
             <w:noProof/>
             <w:webHidden/>
           </w:rPr>
-          <w:instrText xml:space="preserve"> PAGEREF _Toc242715891 \h </w:instrText>
+          <w:instrText xml:space="preserve"> PAGEREF _Toc242716464 \h </w:instrText>
         </w:r>
         <w:r>
           <w:rPr>
@@ -791,7 +791,7 @@
           <w:noProof/>
         </w:rPr>
       </w:pPr>
-      <w:hyperlink w:anchor="_Toc242715892" w:history="1">
+      <w:hyperlink w:anchor="_Toc242716465" w:history="1">
         <w:r>
           <w:rPr>
             <w:rStyle w:val="Hyperlink"/>
@@ -818,7 +818,7 @@
             <w:noProof/>
             <w:webHidden/>
           </w:rPr>
-          <w:instrText xml:space="preserve"> PAGEREF _Toc242715892 \h </w:instrText>
+          <w:instrText xml:space="preserve"> PAGEREF _Toc242716465 \h </w:instrText>
         </w:r>
         <w:r>
           <w:rPr>
@@ -859,7 +859,7 @@
           <w:noProof/>
         </w:rPr>
       </w:pPr>
-      <w:hyperlink w:anchor="_Toc242715893" w:history="1">
+      <w:hyperlink w:anchor="_Toc242716466" w:history="1">
         <w:r>
           <w:rPr>
             <w:rStyle w:val="Hyperlink"/>
@@ -886,7 +886,7 @@
             <w:noProof/>
             <w:webHidden/>
           </w:rPr>
-          <w:instrText xml:space="preserve"> PAGEREF _Toc242715893 \h </w:instrText>
+          <w:instrText xml:space="preserve"> PAGEREF _Toc242716466 \h </w:instrText>
         </w:r>
         <w:r>
           <w:rPr>
@@ -927,7 +927,7 @@
           <w:noProof/>
         </w:rPr>
       </w:pPr>
-      <w:hyperlink w:anchor="_Toc242715894" w:history="1">
+      <w:hyperlink w:anchor="_Toc242716467" w:history="1">
         <w:r>
           <w:rPr>
             <w:rStyle w:val="Hyperlink"/>
@@ -954,7 +954,7 @@
             <w:noProof/>
             <w:webHidden/>
           </w:rPr>
-          <w:instrText xml:space="preserve"> PAGEREF _Toc242715894 \h </w:instrText>
+          <w:instrText xml:space="preserve"> PAGEREF _Toc242716467 \h </w:instrText>
         </w:r>
         <w:r>
           <w:rPr>
@@ -995,7 +995,7 @@
           <w:noProof/>
         </w:rPr>
       </w:pPr>
-      <w:hyperlink w:anchor="_Toc242715895" w:history="1">
+      <w:hyperlink w:anchor="_Toc242716468" w:history="1">
         <w:r>
           <w:rPr>
             <w:rStyle w:val="Hyperlink"/>
@@ -1022,7 +1022,7 @@
             <w:noProof/>
             <w:webHidden/>
           </w:rPr>
-          <w:instrText xml:space="preserve"> PAGEREF _Toc242715895 \h </w:instrText>
+          <w:instrText xml:space="preserve"> PAGEREF _Toc242716468 \h </w:instrText>
         </w:r>
         <w:r>
           <w:rPr>
@@ -1063,7 +1063,7 @@
           <w:noProof/>
         </w:rPr>
       </w:pPr>
-      <w:hyperlink w:anchor="_Toc242715896" w:history="1">
+      <w:hyperlink w:anchor="_Toc242716469" w:history="1">
         <w:r>
           <w:rPr>
             <w:rStyle w:val="Hyperlink"/>
@@ -1090,7 +1090,7 @@
             <w:noProof/>
             <w:webHidden/>
           </w:rPr>
-          <w:instrText xml:space="preserve"> PAGEREF _Toc242715896 \h </w:instrText>
+          <w:instrText xml:space="preserve"> PAGEREF _Toc242716469 \h </w:instrText>
         </w:r>
         <w:r>
           <w:rPr>
@@ -1131,7 +1131,7 @@
           <w:noProof/>
         </w:rPr>
       </w:pPr>
-      <w:hyperlink w:anchor="_Toc242715897" w:history="1">
+      <w:hyperlink w:anchor="_Toc242716470" w:history="1">
         <w:r>
           <w:rPr>
             <w:rStyle w:val="Hyperlink"/>
@@ -1158,7 +1158,7 @@
             <w:noProof/>
             <w:webHidden/>
           </w:rPr>
-          <w:instrText xml:space="preserve"> PAGEREF _Toc242715897 \h </w:instrText>
+          <w:instrText xml:space="preserve"> PAGEREF _Toc242716470 \h </w:instrText>
         </w:r>
         <w:r>
           <w:rPr>
@@ -1199,7 +1199,7 @@
           <w:noProof/>
         </w:rPr>
       </w:pPr>
-      <w:hyperlink w:anchor="_Toc242715898" w:history="1">
+      <w:hyperlink w:anchor="_Toc242716471" w:history="1">
         <w:r>
           <w:rPr>
             <w:rStyle w:val="Hyperlink"/>
@@ -1226,7 +1226,7 @@
             <w:noProof/>
             <w:webHidden/>
           </w:rPr>
-          <w:instrText xml:space="preserve"> PAGEREF _Toc242715898 \h </w:instrText>
+          <w:instrText xml:space="preserve"> PAGEREF _Toc242716471 \h </w:instrText>
         </w:r>
         <w:r>
           <w:rPr>
@@ -1267,7 +1267,7 @@
           <w:noProof/>
         </w:rPr>
       </w:pPr>
-      <w:hyperlink w:anchor="_Toc242715899" w:history="1">
+      <w:hyperlink w:anchor="_Toc242716472" w:history="1">
         <w:r>
           <w:rPr>
             <w:rStyle w:val="Hyperlink"/>
@@ -1294,7 +1294,7 @@
             <w:noProof/>
             <w:webHidden/>
           </w:rPr>
-          <w:instrText xml:space="preserve"> PAGEREF _Toc242715899 \h </w:instrText>
+          <w:instrText xml:space="preserve"> PAGEREF _Toc242716472 \h </w:instrText>
         </w:r>
         <w:r>
           <w:rPr>
@@ -1335,7 +1335,7 @@
           <w:noProof/>
         </w:rPr>
       </w:pPr>
-      <w:hyperlink w:anchor="_Toc242715900" w:history="1">
+      <w:hyperlink w:anchor="_Toc242716473" w:history="1">
         <w:r>
           <w:rPr>
             <w:rStyle w:val="Hyperlink"/>
@@ -1362,7 +1362,7 @@
             <w:noProof/>
             <w:webHidden/>
           </w:rPr>
-          <w:instrText xml:space="preserve"> PAGEREF _Toc242715900 \h </w:instrText>
+          <w:instrText xml:space="preserve"> PAGEREF _Toc242716473 \h </w:instrText>
         </w:r>
         <w:r>
           <w:rPr>
@@ -1403,7 +1403,7 @@
           <w:noProof/>
         </w:rPr>
       </w:pPr>
-      <w:hyperlink w:anchor="_Toc242715901" w:history="1">
+      <w:hyperlink w:anchor="_Toc242716474" w:history="1">
         <w:r>
           <w:rPr>
             <w:rStyle w:val="Hyperlink"/>
@@ -1430,7 +1430,7 @@
             <w:noProof/>
             <w:webHidden/>
           </w:rPr>
-          <w:instrText xml:space="preserve"> PAGEREF _Toc242715901 \h </w:instrText>
+          <w:instrText xml:space="preserve"> PAGEREF _Toc242716474 \h </w:instrText>
         </w:r>
         <w:r>
           <w:rPr>
@@ -1471,7 +1471,7 @@
           <w:noProof/>
         </w:rPr>
       </w:pPr>
-      <w:hyperlink w:anchor="_Toc242715902" w:history="1">
+      <w:hyperlink w:anchor="_Toc242716475" w:history="1">
         <w:r>
           <w:rPr>
             <w:rStyle w:val="Hyperlink"/>
@@ -1498,7 +1498,7 @@
             <w:noProof/>
             <w:webHidden/>
           </w:rPr>
-          <w:instrText xml:space="preserve"> PAGEREF _Toc242715902 \h </w:instrText>
+          <w:instrText xml:space="preserve"> PAGEREF _Toc242716475 \h </w:instrText>
         </w:r>
         <w:r>
           <w:rPr>
@@ -1539,7 +1539,7 @@
           <w:noProof/>
         </w:rPr>
       </w:pPr>
-      <w:hyperlink w:anchor="_Toc242715903" w:history="1">
+      <w:hyperlink w:anchor="_Toc242716476" w:history="1">
         <w:r>
           <w:rPr>
             <w:rStyle w:val="Hyperlink"/>
@@ -1566,7 +1566,7 @@
             <w:noProof/>
             <w:webHidden/>
           </w:rPr>
-          <w:instrText xml:space="preserve"> PAGEREF _Toc242715903 \h </w:instrText>
+          <w:instrText xml:space="preserve"> PAGEREF _Toc242716476 \h </w:instrText>
         </w:r>
         <w:r>
           <w:rPr>
@@ -1607,7 +1607,7 @@
           <w:noProof/>
         </w:rPr>
       </w:pPr>
-      <w:hyperlink w:anchor="_Toc242715904" w:history="1">
+      <w:hyperlink w:anchor="_Toc242716477" w:history="1">
         <w:r>
           <w:rPr>
             <w:rStyle w:val="Hyperlink"/>
@@ -1634,7 +1634,7 @@
             <w:noProof/>
             <w:webHidden/>
           </w:rPr>
-          <w:instrText xml:space="preserve"> PAGEREF _Toc242715904 \h </w:instrText>
+          <w:instrText xml:space="preserve"> PAGEREF _Toc242716477 \h </w:instrText>
         </w:r>
         <w:r>
           <w:rPr>
@@ -1675,7 +1675,7 @@
           <w:noProof/>
         </w:rPr>
       </w:pPr>
-      <w:hyperlink w:anchor="_Toc242715905" w:history="1">
+      <w:hyperlink w:anchor="_Toc242716478" w:history="1">
         <w:r>
           <w:rPr>
             <w:rStyle w:val="Hyperlink"/>
@@ -1702,7 +1702,7 @@
             <w:noProof/>
             <w:webHidden/>
           </w:rPr>
-          <w:instrText xml:space="preserve"> PAGEREF _Toc242715905 \h </w:instrText>
+          <w:instrText xml:space="preserve"> PAGEREF _Toc242716478 \h </w:instrText>
         </w:r>
         <w:r>
           <w:rPr>
@@ -1743,7 +1743,7 @@
           <w:noProof/>
         </w:rPr>
       </w:pPr>
-      <w:hyperlink w:anchor="_Toc242715906" w:history="1">
+      <w:hyperlink w:anchor="_Toc242716479" w:history="1">
         <w:r>
           <w:rPr>
             <w:rStyle w:val="Hyperlink"/>
@@ -1770,7 +1770,7 @@
             <w:noProof/>
             <w:webHidden/>
           </w:rPr>
-          <w:instrText xml:space="preserve"> PAGEREF _Toc242715906 \h </w:instrText>
+          <w:instrText xml:space="preserve"> PAGEREF _Toc242716479 \h </w:instrText>
         </w:r>
         <w:r>
           <w:rPr>
@@ -1811,7 +1811,7 @@
           <w:noProof/>
         </w:rPr>
       </w:pPr>
-      <w:hyperlink w:anchor="_Toc242715907" w:history="1">
+      <w:hyperlink w:anchor="_Toc242716480" w:history="1">
         <w:r>
           <w:rPr>
             <w:rStyle w:val="Hyperlink"/>
@@ -1838,7 +1838,7 @@
             <w:noProof/>
             <w:webHidden/>
           </w:rPr>
-          <w:instrText xml:space="preserve"> PAGEREF _Toc242715907 \h </w:instrText>
+          <w:instrText xml:space="preserve"> PAGEREF _Toc242716480 \h </w:instrText>
         </w:r>
         <w:r>
           <w:rPr>
@@ -1879,7 +1879,7 @@
           <w:noProof/>
         </w:rPr>
       </w:pPr>
-      <w:hyperlink w:anchor="_Toc242715908" w:history="1">
+      <w:hyperlink w:anchor="_Toc242716481" w:history="1">
         <w:r>
           <w:rPr>
             <w:rStyle w:val="Hyperlink"/>
@@ -1906,7 +1906,7 @@
             <w:noProof/>
             <w:webHidden/>
           </w:rPr>
-          <w:instrText xml:space="preserve"> PAGEREF _Toc242715908 \h </w:instrText>
+          <w:instrText xml:space="preserve"> PAGEREF _Toc242716481 \h </w:instrText>
         </w:r>
         <w:r>
           <w:rPr>
@@ -1947,7 +1947,7 @@
           <w:noProof/>
         </w:rPr>
       </w:pPr>
-      <w:hyperlink w:anchor="_Toc242715909" w:history="1">
+      <w:hyperlink w:anchor="_Toc242716482" w:history="1">
         <w:r>
           <w:rPr>
             <w:rStyle w:val="Hyperlink"/>
@@ -1974,7 +1974,7 @@
             <w:noProof/>
             <w:webHidden/>
           </w:rPr>
-          <w:instrText xml:space="preserve"> PAGEREF _Toc242715909 \h </w:instrText>
+          <w:instrText xml:space="preserve"> PAGEREF _Toc242716482 \h </w:instrText>
         </w:r>
         <w:r>
           <w:rPr>
@@ -2015,7 +2015,7 @@
           <w:noProof/>
         </w:rPr>
       </w:pPr>
-      <w:hyperlink w:anchor="_Toc242715910" w:history="1">
+      <w:hyperlink w:anchor="_Toc242716483" w:history="1">
         <w:r>
           <w:rPr>
             <w:rStyle w:val="Hyperlink"/>
@@ -2042,7 +2042,7 @@
             <w:noProof/>
             <w:webHidden/>
           </w:rPr>
-          <w:instrText xml:space="preserve"> PAGEREF _Toc242715910 \h </w:instrText>
+          <w:instrText xml:space="preserve"> PAGEREF _Toc242716483 \h </w:instrText>
         </w:r>
         <w:r>
           <w:rPr>
@@ -2083,7 +2083,7 @@
           <w:noProof/>
         </w:rPr>
       </w:pPr>
-      <w:hyperlink w:anchor="_Toc242715911" w:history="1">
+      <w:hyperlink w:anchor="_Toc242716484" w:history="1">
         <w:r>
           <w:rPr>
             <w:rStyle w:val="Hyperlink"/>
@@ -2110,7 +2110,7 @@
             <w:noProof/>
             <w:webHidden/>
           </w:rPr>
-          <w:instrText xml:space="preserve"> PAGEREF _Toc242715911 \h </w:instrText>
+          <w:instrText xml:space="preserve"> PAGEREF _Toc242716484 \h </w:instrText>
         </w:r>
         <w:r>
           <w:rPr>
@@ -2151,7 +2151,7 @@
           <w:noProof/>
         </w:rPr>
       </w:pPr>
-      <w:hyperlink w:anchor="_Toc242715912" w:history="1">
+      <w:hyperlink w:anchor="_Toc242716485" w:history="1">
         <w:r>
           <w:rPr>
             <w:rStyle w:val="Hyperlink"/>
@@ -2178,7 +2178,7 @@
             <w:noProof/>
             <w:webHidden/>
           </w:rPr>
-          <w:instrText xml:space="preserve"> PAGEREF _Toc242715912 \h </w:instrText>
+          <w:instrText xml:space="preserve"> PAGEREF _Toc242716485 \h </w:instrText>
         </w:r>
         <w:r>
           <w:rPr>
@@ -2219,7 +2219,7 @@
           <w:noProof/>
         </w:rPr>
       </w:pPr>
-      <w:hyperlink w:anchor="_Toc242715913" w:history="1">
+      <w:hyperlink w:anchor="_Toc242716486" w:history="1">
         <w:r>
           <w:rPr>
             <w:rStyle w:val="Hyperlink"/>
@@ -2246,7 +2246,7 @@
             <w:noProof/>
             <w:webHidden/>
           </w:rPr>
-          <w:instrText xml:space="preserve"> PAGEREF _Toc242715913 \h </w:instrText>
+          <w:instrText xml:space="preserve"> PAGEREF _Toc242716486 \h </w:instrText>
         </w:r>
         <w:r>
           <w:rPr>
@@ -2287,7 +2287,7 @@
           <w:noProof/>
         </w:rPr>
       </w:pPr>
-      <w:hyperlink w:anchor="_Toc242715914" w:history="1">
+      <w:hyperlink w:anchor="_Toc242716487" w:history="1">
         <w:r>
           <w:rPr>
             <w:rStyle w:val="Hyperlink"/>
@@ -2314,7 +2314,7 @@
             <w:noProof/>
             <w:webHidden/>
           </w:rPr>
-          <w:instrText xml:space="preserve"> PAGEREF _Toc242715914 \h </w:instrText>
+          <w:instrText xml:space="preserve"> PAGEREF _Toc242716487 \h </w:instrText>
         </w:r>
         <w:r>
           <w:rPr>
@@ -2355,7 +2355,7 @@
           <w:noProof/>
         </w:rPr>
       </w:pPr>
-      <w:hyperlink w:anchor="_Toc242715915" w:history="1">
+      <w:hyperlink w:anchor="_Toc242716488" w:history="1">
         <w:r>
           <w:rPr>
             <w:rStyle w:val="Hyperlink"/>
@@ -2382,7 +2382,7 @@
             <w:noProof/>
             <w:webHidden/>
           </w:rPr>
-          <w:instrText xml:space="preserve"> PAGEREF _Toc242715915 \h </w:instrText>
+          <w:instrText xml:space="preserve"> PAGEREF _Toc242716488 \h </w:instrText>
         </w:r>
         <w:r>
           <w:rPr>
@@ -2423,7 +2423,7 @@
           <w:noProof/>
         </w:rPr>
       </w:pPr>
-      <w:hyperlink w:anchor="_Toc242715916" w:history="1">
+      <w:hyperlink w:anchor="_Toc242716489" w:history="1">
         <w:r>
           <w:rPr>
             <w:rStyle w:val="Hyperlink"/>
@@ -2450,7 +2450,7 @@
             <w:noProof/>
             <w:webHidden/>
           </w:rPr>
-          <w:instrText xml:space="preserve"> PAGEREF _Toc242715916 \h </w:instrText>
+          <w:instrText xml:space="preserve"> PAGEREF _Toc242716489 \h </w:instrText>
         </w:r>
         <w:r>
           <w:rPr>
@@ -2491,7 +2491,7 @@
           <w:noProof/>
         </w:rPr>
       </w:pPr>
-      <w:hyperlink w:anchor="_Toc242715917" w:history="1">
+      <w:hyperlink w:anchor="_Toc242716490" w:history="1">
         <w:r>
           <w:rPr>
             <w:rStyle w:val="Hyperlink"/>
@@ -2518,7 +2518,7 @@
             <w:noProof/>
             <w:webHidden/>
           </w:rPr>
-          <w:instrText xml:space="preserve"> PAGEREF _Toc242715917 \h </w:instrText>
+          <w:instrText xml:space="preserve"> PAGEREF _Toc242716490 \h </w:instrText>
         </w:r>
         <w:r>
           <w:rPr>
@@ -2559,7 +2559,7 @@
           <w:noProof/>
         </w:rPr>
       </w:pPr>
-      <w:hyperlink w:anchor="_Toc242715918" w:history="1">
+      <w:hyperlink w:anchor="_Toc242716491" w:history="1">
         <w:r>
           <w:rPr>
             <w:rStyle w:val="Hyperlink"/>
@@ -2586,7 +2586,7 @@
             <w:noProof/>
             <w:webHidden/>
           </w:rPr>
-          <w:instrText xml:space="preserve"> PAGEREF _Toc242715918 \h </w:instrText>
+          <w:instrText xml:space="preserve"> PAGEREF _Toc242716491 \h </w:instrText>
         </w:r>
         <w:r>
           <w:rPr>
@@ -2627,7 +2627,7 @@
           <w:noProof/>
         </w:rPr>
       </w:pPr>
-      <w:hyperlink w:anchor="_Toc242715919" w:history="1">
+      <w:hyperlink w:anchor="_Toc242716492" w:history="1">
         <w:r>
           <w:rPr>
             <w:rStyle w:val="Hyperlink"/>
@@ -2654,7 +2654,7 @@
             <w:noProof/>
             <w:webHidden/>
           </w:rPr>
-          <w:instrText xml:space="preserve"> PAGEREF _Toc242715919 \h </w:instrText>
+          <w:instrText xml:space="preserve"> PAGEREF _Toc242716492 \h </w:instrText>
         </w:r>
         <w:r>
           <w:rPr>
@@ -2695,7 +2695,7 @@
           <w:noProof/>
         </w:rPr>
       </w:pPr>
-      <w:hyperlink w:anchor="_Toc242715920" w:history="1">
+      <w:hyperlink w:anchor="_Toc242716493" w:history="1">
         <w:r>
           <w:rPr>
             <w:rStyle w:val="Hyperlink"/>
@@ -2722,7 +2722,7 @@
             <w:noProof/>
             <w:webHidden/>
           </w:rPr>
-          <w:instrText xml:space="preserve"> PAGEREF _Toc242715920 \h </w:instrText>
+          <w:instrText xml:space="preserve"> PAGEREF _Toc242716493 \h </w:instrText>
         </w:r>
         <w:r>
           <w:rPr>
@@ -2763,7 +2763,7 @@
           <w:noProof/>
         </w:rPr>
       </w:pPr>
-      <w:hyperlink w:anchor="_Toc242715921" w:history="1">
+      <w:hyperlink w:anchor="_Toc242716494" w:history="1">
         <w:r>
           <w:rPr>
             <w:rStyle w:val="Hyperlink"/>
@@ -2790,7 +2790,7 @@
             <w:noProof/>
             <w:webHidden/>
           </w:rPr>
-          <w:instrText xml:space="preserve"> PAGEREF _Toc242715921 \h </w:instrText>
+          <w:instrText xml:space="preserve"> PAGEREF _Toc242716494 \h </w:instrText>
         </w:r>
         <w:r>
           <w:rPr>
@@ -2831,7 +2831,7 @@
           <w:noProof/>
         </w:rPr>
       </w:pPr>
-      <w:hyperlink w:anchor="_Toc242715922" w:history="1">
+      <w:hyperlink w:anchor="_Toc242716495" w:history="1">
         <w:r>
           <w:rPr>
             <w:rStyle w:val="Hyperlink"/>
@@ -2858,7 +2858,7 @@
             <w:noProof/>
             <w:webHidden/>
           </w:rPr>
-          <w:instrText xml:space="preserve"> PAGEREF _Toc242715922 \h </w:instrText>
+          <w:instrText xml:space="preserve"> PAGEREF _Toc242716495 \h </w:instrText>
         </w:r>
         <w:r>
           <w:rPr>
@@ -2899,7 +2899,7 @@
           <w:noProof/>
         </w:rPr>
       </w:pPr>
-      <w:hyperlink w:anchor="_Toc242715923" w:history="1">
+      <w:hyperlink w:anchor="_Toc242716496" w:history="1">
         <w:r>
           <w:rPr>
             <w:rStyle w:val="Hyperlink"/>
@@ -2926,7 +2926,7 @@
             <w:noProof/>
             <w:webHidden/>
           </w:rPr>
-          <w:instrText xml:space="preserve"> PAGEREF _Toc242715923 \h </w:instrText>
+          <w:instrText xml:space="preserve"> PAGEREF _Toc242716496 \h </w:instrText>
         </w:r>
         <w:r>
           <w:rPr>
@@ -2967,7 +2967,7 @@
           <w:noProof/>
         </w:rPr>
       </w:pPr>
-      <w:hyperlink w:anchor="_Toc242715924" w:history="1">
+      <w:hyperlink w:anchor="_Toc242716497" w:history="1">
         <w:r>
           <w:rPr>
             <w:rStyle w:val="Hyperlink"/>
@@ -2994,7 +2994,7 @@
             <w:noProof/>
             <w:webHidden/>
           </w:rPr>
-          <w:instrText xml:space="preserve"> PAGEREF _Toc242715924 \h </w:instrText>
+          <w:instrText xml:space="preserve"> PAGEREF _Toc242716497 \h </w:instrText>
         </w:r>
         <w:r>
           <w:rPr>
@@ -3035,7 +3035,7 @@
           <w:noProof/>
         </w:rPr>
       </w:pPr>
-      <w:hyperlink w:anchor="_Toc242715925" w:history="1">
+      <w:hyperlink w:anchor="_Toc242716498" w:history="1">
         <w:r>
           <w:rPr>
             <w:rStyle w:val="Hyperlink"/>
@@ -3062,7 +3062,7 @@
             <w:noProof/>
             <w:webHidden/>
           </w:rPr>
-          <w:instrText xml:space="preserve"> PAGEREF _Toc242715925 \h </w:instrText>
+          <w:instrText xml:space="preserve"> PAGEREF _Toc242716498 \h </w:instrText>
         </w:r>
         <w:r>
           <w:rPr>
@@ -3103,7 +3103,7 @@
           <w:noProof/>
         </w:rPr>
       </w:pPr>
-      <w:hyperlink w:anchor="_Toc242715926" w:history="1">
+      <w:hyperlink w:anchor="_Toc242716499" w:history="1">
         <w:r>
           <w:rPr>
             <w:rStyle w:val="Hyperlink"/>
@@ -3130,7 +3130,7 @@
             <w:noProof/>
             <w:webHidden/>
           </w:rPr>
-          <w:instrText xml:space="preserve"> PAGEREF _Toc242715926 \h </w:instrText>
+          <w:instrText xml:space="preserve"> PAGEREF _Toc242716499 \h </w:instrText>
         </w:r>
         <w:r>
           <w:rPr>
@@ -3171,7 +3171,7 @@
           <w:noProof/>
         </w:rPr>
       </w:pPr>
-      <w:hyperlink w:anchor="_Toc242715927" w:history="1">
+      <w:hyperlink w:anchor="_Toc242716500" w:history="1">
         <w:r>
           <w:rPr>
             <w:rStyle w:val="Hyperlink"/>
@@ -3198,7 +3198,7 @@
             <w:noProof/>
             <w:webHidden/>
           </w:rPr>
-          <w:instrText xml:space="preserve"> PAGEREF _Toc242715927 \h </w:instrText>
+          <w:instrText xml:space="preserve"> PAGEREF _Toc242716500 \h </w:instrText>
         </w:r>
         <w:r>
           <w:rPr>
@@ -3239,7 +3239,7 @@
           <w:noProof/>
         </w:rPr>
       </w:pPr>
-      <w:hyperlink w:anchor="_Toc242715928" w:history="1">
+      <w:hyperlink w:anchor="_Toc242716501" w:history="1">
         <w:r>
           <w:rPr>
             <w:rStyle w:val="Hyperlink"/>
@@ -3266,7 +3266,7 @@
             <w:noProof/>
             <w:webHidden/>
           </w:rPr>
-          <w:instrText xml:space="preserve"> PAGEREF _Toc242715928 \h </w:instrText>
+          <w:instrText xml:space="preserve"> PAGEREF _Toc242716501 \h </w:instrText>
         </w:r>
         <w:r>
           <w:rPr>
@@ -3307,7 +3307,7 @@
           <w:noProof/>
         </w:rPr>
       </w:pPr>
-      <w:hyperlink w:anchor="_Toc242715929" w:history="1">
+      <w:hyperlink w:anchor="_Toc242716502" w:history="1">
         <w:r>
           <w:rPr>
             <w:rStyle w:val="Hyperlink"/>
@@ -3334,7 +3334,7 @@
             <w:noProof/>
             <w:webHidden/>
           </w:rPr>
-          <w:instrText xml:space="preserve"> PAGEREF _Toc242715929 \h </w:instrText>
+          <w:instrText xml:space="preserve"> PAGEREF _Toc242716502 \h </w:instrText>
         </w:r>
         <w:r>
           <w:rPr>
@@ -3375,7 +3375,7 @@
           <w:noProof/>
         </w:rPr>
       </w:pPr>
-      <w:hyperlink w:anchor="_Toc242715930" w:history="1">
+      <w:hyperlink w:anchor="_Toc242716503" w:history="1">
         <w:r>
           <w:rPr>
             <w:rStyle w:val="Hyperlink"/>
@@ -3402,7 +3402,7 @@
             <w:noProof/>
             <w:webHidden/>
           </w:rPr>
-          <w:instrText xml:space="preserve"> PAGEREF _Toc242715930 \h </w:instrText>
+          <w:instrText xml:space="preserve"> PAGEREF _Toc242716503 \h </w:instrText>
         </w:r>
         <w:r>
           <w:rPr>
@@ -3443,7 +3443,7 @@
           <w:noProof/>
         </w:rPr>
       </w:pPr>
-      <w:hyperlink w:anchor="_Toc242715931" w:history="1">
+      <w:hyperlink w:anchor="_Toc242716504" w:history="1">
         <w:r>
           <w:rPr>
             <w:rStyle w:val="Hyperlink"/>
@@ -3470,7 +3470,7 @@
             <w:noProof/>
             <w:webHidden/>
           </w:rPr>
-          <w:instrText xml:space="preserve"> PAGEREF _Toc242715931 \h </w:instrText>
+          <w:instrText xml:space="preserve"> PAGEREF _Toc242716504 \h </w:instrText>
         </w:r>
         <w:r>
           <w:rPr>
@@ -3511,7 +3511,7 @@
           <w:noProof/>
         </w:rPr>
       </w:pPr>
-      <w:hyperlink w:anchor="_Toc242715932" w:history="1">
+      <w:hyperlink w:anchor="_Toc242716505" w:history="1">
         <w:r>
           <w:rPr>
             <w:rStyle w:val="Hyperlink"/>
@@ -3538,7 +3538,7 @@
             <w:noProof/>
             <w:webHidden/>
           </w:rPr>
-          <w:instrText xml:space="preserve"> PAGEREF _Toc242715932 \h </w:instrText>
+          <w:instrText xml:space="preserve"> PAGEREF _Toc242716505 \h </w:instrText>
         </w:r>
         <w:r>
           <w:rPr>
@@ -3579,7 +3579,7 @@
           <w:noProof/>
         </w:rPr>
       </w:pPr>
-      <w:hyperlink w:anchor="_Toc242715933" w:history="1">
+      <w:hyperlink w:anchor="_Toc242716506" w:history="1">
         <w:r>
           <w:rPr>
             <w:rStyle w:val="Hyperlink"/>
@@ -3606,7 +3606,7 @@
             <w:noProof/>
             <w:webHidden/>
           </w:rPr>
-          <w:instrText xml:space="preserve"> PAGEREF _Toc242715933 \h </w:instrText>
+          <w:instrText xml:space="preserve"> PAGEREF _Toc242716506 \h </w:instrText>
         </w:r>
         <w:r>
           <w:rPr>
@@ -3647,7 +3647,7 @@
           <w:noProof/>
         </w:rPr>
       </w:pPr>
-      <w:hyperlink w:anchor="_Toc242715934" w:history="1">
+      <w:hyperlink w:anchor="_Toc242716507" w:history="1">
         <w:r>
           <w:rPr>
             <w:rStyle w:val="Hyperlink"/>
@@ -3674,7 +3674,7 @@
             <w:noProof/>
             <w:webHidden/>
           </w:rPr>
-          <w:instrText xml:space="preserve"> PAGEREF _Toc242715934 \h </w:instrText>
+          <w:instrText xml:space="preserve"> PAGEREF _Toc242716507 \h </w:instrText>
         </w:r>
         <w:r>
           <w:rPr>
@@ -3714,9 +3714,8 @@
       <w:pPr>
         <w:pStyle w:val="Heading1"/>
       </w:pPr>
-      <w:bookmarkStart w:id="1" w:name="_Toc242715887"/>
-      <w:r>
-        <w:lastRenderedPageBreak/>
+      <w:bookmarkStart w:id="1" w:name="_Toc242716460"/>
+      <w:r>
         <w:t>Step 01 – What sbom-fixer does</w:t>
       </w:r>
       <w:bookmarkEnd w:id="1"/>
@@ -3982,7 +3981,11 @@
         <w:t>licenseDeclared</w:t>
       </w:r>
       <w:r>
-        <w:t xml:space="preserve"> the licences, checksums the hashes, </w:t>
+        <w:t xml:space="preserve"> the licences, </w:t>
+      </w:r>
+      <w:r>
+        <w:lastRenderedPageBreak/>
+        <w:t xml:space="preserve">checksums the hashes, </w:t>
       </w:r>
       <w:r>
         <w:rPr>
@@ -4482,7 +4485,6 @@
         <w:ind w:left="510" w:hanging="340"/>
       </w:pPr>
       <w:r>
-        <w:lastRenderedPageBreak/>
         <w:t>5.</w:t>
       </w:r>
       <w:r>
@@ -4527,7 +4529,7 @@
       <w:pPr>
         <w:pStyle w:val="Heading1"/>
       </w:pPr>
-      <w:bookmarkStart w:id="2" w:name="_Toc242715888"/>
+      <w:bookmarkStart w:id="2" w:name="_Toc242716461"/>
       <w:r>
         <w:lastRenderedPageBreak/>
         <w:t>Step 02 – Check the prerequisites on the new machine</w:t>
@@ -5087,9 +5089,8 @@
       <w:pPr>
         <w:pStyle w:val="Heading1"/>
       </w:pPr>
-      <w:bookmarkStart w:id="3" w:name="_Toc242715889"/>
-      <w:r>
-        <w:lastRenderedPageBreak/>
+      <w:bookmarkStart w:id="3" w:name="_Toc242716462"/>
+      <w:r>
         <w:t>Step 03 – Get the code onto the machine</w:t>
       </w:r>
       <w:bookmarkEnd w:id="3"/>
@@ -5337,9 +5338,8 @@
       <w:pPr>
         <w:pStyle w:val="Heading1"/>
       </w:pPr>
-      <w:bookmarkStart w:id="4" w:name="_Toc242715890"/>
-      <w:r>
-        <w:lastRenderedPageBreak/>
+      <w:bookmarkStart w:id="4" w:name="_Toc242716463"/>
+      <w:r>
         <w:t>Step 04 – Install on Windows</w:t>
       </w:r>
       <w:bookmarkEnd w:id="4"/>
@@ -5348,7 +5348,7 @@
       <w:pPr>
         <w:pStyle w:val="Heading2"/>
       </w:pPr>
-      <w:bookmarkStart w:id="5" w:name="_Toc242715891"/>
+      <w:bookmarkStart w:id="5" w:name="_Toc242716464"/>
       <w:r>
         <w:t>4.1 Open a terminal in the folder</w:t>
       </w:r>
@@ -5386,7 +5386,7 @@
       <w:pPr>
         <w:pStyle w:val="Heading2"/>
       </w:pPr>
-      <w:bookmarkStart w:id="6" w:name="_Toc242715892"/>
+      <w:bookmarkStart w:id="6" w:name="_Toc242716465"/>
       <w:r>
         <w:t>4.2 Create a virtual environment</w:t>
       </w:r>
@@ -5425,7 +5425,7 @@
       <w:pPr>
         <w:pStyle w:val="Heading2"/>
       </w:pPr>
-      <w:bookmarkStart w:id="7" w:name="_Toc242715893"/>
+      <w:bookmarkStart w:id="7" w:name="_Toc242716466"/>
       <w:r>
         <w:t>4.3 Activate it</w:t>
       </w:r>
@@ -5464,7 +5464,7 @@
       <w:pPr>
         <w:pStyle w:val="Heading2"/>
       </w:pPr>
-      <w:bookmarkStart w:id="8" w:name="_Toc242715894"/>
+      <w:bookmarkStart w:id="8" w:name="_Toc242716467"/>
       <w:r>
         <w:t>4.4 Install the tool</w:t>
       </w:r>
@@ -5517,7 +5517,7 @@
       <w:pPr>
         <w:pStyle w:val="Heading2"/>
       </w:pPr>
-      <w:bookmarkStart w:id="9" w:name="_Toc242715895"/>
+      <w:bookmarkStart w:id="9" w:name="_Toc242716468"/>
       <w:r>
         <w:t>4.5 Activation in other terminals</w:t>
       </w:r>
@@ -5745,7 +5745,7 @@
       <w:pPr>
         <w:pStyle w:val="Heading2"/>
       </w:pPr>
-      <w:bookmarkStart w:id="10" w:name="_Toc242715896"/>
+      <w:bookmarkStart w:id="10" w:name="_Toc242716469"/>
       <w:r>
         <w:t>4.6 Offline install (machine without internet)</w:t>
       </w:r>
@@ -5879,9 +5879,8 @@
       <w:pPr>
         <w:pStyle w:val="Heading2"/>
       </w:pPr>
-      <w:bookmarkStart w:id="11" w:name="_Toc242715897"/>
-      <w:r>
-        <w:lastRenderedPageBreak/>
+      <w:bookmarkStart w:id="11" w:name="_Toc242716470"/>
+      <w:r>
         <w:t>4.7 Make the command available everywhere (optional)</w:t>
       </w:r>
       <w:bookmarkEnd w:id="11"/>
@@ -5930,9 +5929,8 @@
       <w:pPr>
         <w:pStyle w:val="Heading1"/>
       </w:pPr>
-      <w:bookmarkStart w:id="12" w:name="_Toc242715898"/>
-      <w:r>
-        <w:lastRenderedPageBreak/>
+      <w:bookmarkStart w:id="12" w:name="_Toc242716471"/>
+      <w:r>
         <w:t>Step 05 – Install on Linux or macOS</w:t>
       </w:r>
       <w:bookmarkEnd w:id="12"/>
@@ -6055,9 +6053,8 @@
       <w:pPr>
         <w:pStyle w:val="Heading1"/>
       </w:pPr>
-      <w:bookmarkStart w:id="13" w:name="_Toc242715899"/>
-      <w:r>
-        <w:lastRenderedPageBreak/>
+      <w:bookmarkStart w:id="13" w:name="_Toc242716472"/>
+      <w:r>
         <w:t>Step 06 – Install with Docker (no Python needed)</w:t>
       </w:r>
       <w:bookmarkEnd w:id="13"/>
@@ -6268,9 +6265,8 @@
       <w:pPr>
         <w:pStyle w:val="Heading1"/>
       </w:pPr>
-      <w:bookmarkStart w:id="14" w:name="_Toc242715900"/>
-      <w:r>
-        <w:lastRenderedPageBreak/>
+      <w:bookmarkStart w:id="14" w:name="_Toc242716473"/>
+      <w:r>
         <w:t>Step 07 – Verify the installation</w:t>
       </w:r>
       <w:bookmarkEnd w:id="14"/>
@@ -6552,9 +6548,8 @@
       <w:pPr>
         <w:pStyle w:val="Heading1"/>
       </w:pPr>
-      <w:bookmarkStart w:id="15" w:name="_Toc242715901"/>
-      <w:r>
-        <w:lastRenderedPageBreak/>
+      <w:bookmarkStart w:id="15" w:name="_Toc242716474"/>
+      <w:r>
         <w:t>Step 08 – Daily workflow: fix an SBOM step by step</w:t>
       </w:r>
       <w:bookmarkEnd w:id="15"/>
@@ -6563,7 +6558,7 @@
       <w:pPr>
         <w:pStyle w:val="Heading2"/>
       </w:pPr>
-      <w:bookmarkStart w:id="16" w:name="_Toc242715902"/>
+      <w:bookmarkStart w:id="16" w:name="_Toc242716475"/>
       <w:r>
         <w:t>8.1 Generate the SBOM with your normal tool</w:t>
       </w:r>
@@ -6637,7 +6632,7 @@
       <w:pPr>
         <w:pStyle w:val="Heading2"/>
       </w:pPr>
-      <w:bookmarkStart w:id="17" w:name="_Toc242715903"/>
+      <w:bookmarkStart w:id="17" w:name="_Toc242716476"/>
       <w:r>
         <w:t>8.2 Fix the file</w:t>
       </w:r>
@@ -7352,9 +7347,8 @@
       <w:pPr>
         <w:pStyle w:val="Heading2"/>
       </w:pPr>
-      <w:bookmarkStart w:id="18" w:name="_Toc242715904"/>
-      <w:r>
-        <w:lastRenderedPageBreak/>
+      <w:bookmarkStart w:id="18" w:name="_Toc242716477"/>
+      <w:r>
         <w:t>8.3 Read the exit code</w:t>
       </w:r>
       <w:bookmarkEnd w:id="18"/>
@@ -7526,7 +7520,7 @@
       <w:pPr>
         <w:pStyle w:val="Heading2"/>
       </w:pPr>
-      <w:bookmarkStart w:id="19" w:name="_Toc242715905"/>
+      <w:bookmarkStart w:id="19" w:name="_Toc242716478"/>
       <w:r>
         <w:t>8.4 Read the two Markdown files</w:t>
       </w:r>
@@ -7571,7 +7565,7 @@
       <w:pPr>
         <w:pStyle w:val="Heading2"/>
       </w:pPr>
-      <w:bookmarkStart w:id="20" w:name="_Toc242715906"/>
+      <w:bookmarkStart w:id="20" w:name="_Toc242716479"/>
       <w:r>
         <w:t>8.5 Upload to Checkmarx</w:t>
       </w:r>
@@ -7635,7 +7629,7 @@
       <w:pPr>
         <w:pStyle w:val="Heading2"/>
       </w:pPr>
-      <w:bookmarkStart w:id="21" w:name="_Toc242715907"/>
+      <w:bookmarkStart w:id="21" w:name="_Toc242716480"/>
       <w:r>
         <w:t>8.6 Keep the original</w:t>
       </w:r>
@@ -7650,7 +7644,7 @@
       <w:pPr>
         <w:pStyle w:val="Heading2"/>
       </w:pPr>
-      <w:bookmarkStart w:id="22" w:name="_Toc242715908"/>
+      <w:bookmarkStart w:id="22" w:name="_Toc242716481"/>
       <w:r>
         <w:t>8.7 Fill every schema field (any JSON)</w:t>
       </w:r>
@@ -7904,11 +7898,7 @@
         <w:t>other</w:t>
       </w:r>
       <w:r>
-        <w:t xml:space="preserve"> first), </w:t>
-      </w:r>
-      <w:r>
-        <w:lastRenderedPageBreak/>
-        <w:t xml:space="preserve">else a </w:t>
+        <w:t xml:space="preserve"> first), else a </w:t>
       </w:r>
       <w:r>
         <w:rPr>
@@ -8251,9 +8241,8 @@
       <w:pPr>
         <w:pStyle w:val="Heading1"/>
       </w:pPr>
-      <w:bookmarkStart w:id="23" w:name="_Toc242715909"/>
-      <w:r>
-        <w:lastRenderedPageBreak/>
+      <w:bookmarkStart w:id="23" w:name="_Toc242716482"/>
+      <w:r>
         <w:t>Step 09 – Understand the output files</w:t>
       </w:r>
       <w:bookmarkEnd w:id="23"/>
@@ -8728,7 +8717,7 @@
         <w:t>Suggestions</w:t>
       </w:r>
       <w:r>
-        <w:t xml:space="preserve"> sections:</w:t>
+        <w:t xml:space="preserve"> is one short table, one row per problem of the original:</w:t>
       </w:r>
     </w:p>
     <w:tbl>
@@ -8746,8 +8735,11 @@
         <w:tblLook w:val="04A0" w:firstRow="1" w:lastRow="0" w:firstColumn="1" w:lastColumn="0" w:noHBand="0" w:noVBand="1"/>
       </w:tblPr>
       <w:tblGrid>
-        <w:gridCol w:w="4819"/>
-        <w:gridCol w:w="4819"/>
+        <w:gridCol w:w="1928"/>
+        <w:gridCol w:w="1928"/>
+        <w:gridCol w:w="1928"/>
+        <w:gridCol w:w="1928"/>
+        <w:gridCol w:w="1928"/>
       </w:tblGrid>
       <w:tr>
         <w:trPr>
@@ -8755,7 +8747,7 @@
         </w:trPr>
         <w:tc>
           <w:tcPr>
-            <w:tcW w:w="4819" w:type="dxa"/>
+            <w:tcW w:w="1928" w:type="dxa"/>
             <w:shd w:val="clear" w:color="auto" w:fill="1F4E79"/>
           </w:tcPr>
           <w:p>
@@ -8765,13 +8757,13 @@
                 <w:color w:val="FFFFFF"/>
                 <w:sz w:val="18"/>
               </w:rPr>
-              <w:t>Section</w:t>
-            </w:r>
-          </w:p>
-        </w:tc>
-        <w:tc>
-          <w:tcPr>
-            <w:tcW w:w="4819" w:type="dxa"/>
+              <w:t>#</w:t>
+            </w:r>
+          </w:p>
+        </w:tc>
+        <w:tc>
+          <w:tcPr>
+            <w:tcW w:w="1928" w:type="dxa"/>
             <w:shd w:val="clear" w:color="auto" w:fill="1F4E79"/>
           </w:tcPr>
           <w:p>
@@ -8781,7 +8773,55 @@
                 <w:color w:val="FFFFFF"/>
                 <w:sz w:val="18"/>
               </w:rPr>
-              <w:t>What it tells you</w:t>
+              <w:t>Missing / wrong</w:t>
+            </w:r>
+          </w:p>
+        </w:tc>
+        <w:tc>
+          <w:tcPr>
+            <w:tcW w:w="1928" w:type="dxa"/>
+            <w:shd w:val="clear" w:color="auto" w:fill="1F4E79"/>
+          </w:tcPr>
+          <w:p>
+            <w:r>
+              <w:rPr>
+                <w:b/>
+                <w:color w:val="FFFFFF"/>
+                <w:sz w:val="18"/>
+              </w:rPr>
+              <w:t>Count</w:t>
+            </w:r>
+          </w:p>
+        </w:tc>
+        <w:tc>
+          <w:tcPr>
+            <w:tcW w:w="1928" w:type="dxa"/>
+            <w:shd w:val="clear" w:color="auto" w:fill="1F4E79"/>
+          </w:tcPr>
+          <w:p>
+            <w:r>
+              <w:rPr>
+                <w:b/>
+                <w:color w:val="FFFFFF"/>
+                <w:sz w:val="18"/>
+              </w:rPr>
+              <w:t>Components</w:t>
+            </w:r>
+          </w:p>
+        </w:tc>
+        <w:tc>
+          <w:tcPr>
+            <w:tcW w:w="1928" w:type="dxa"/>
+            <w:shd w:val="clear" w:color="auto" w:fill="1F4E79"/>
+          </w:tcPr>
+          <w:p>
+            <w:r>
+              <w:rPr>
+                <w:b/>
+                <w:color w:val="FFFFFF"/>
+                <w:sz w:val="18"/>
+              </w:rPr>
+              <w:t>Fix</w:t>
             </w:r>
           </w:p>
         </w:tc>
@@ -8792,27 +8832,66 @@
         </w:trPr>
         <w:tc>
           <w:tcPr>
-            <w:tcW w:w="4819" w:type="dxa"/>
-          </w:tcPr>
-          <w:p>
-            <w:r>
-              <w:rPr>
-                <w:sz w:val="18"/>
-              </w:rPr>
-              <w:t>Headline</w:t>
-            </w:r>
-          </w:p>
-        </w:tc>
-        <w:tc>
-          <w:tcPr>
-            <w:tcW w:w="4819" w:type="dxa"/>
-          </w:tcPr>
-          <w:p>
-            <w:r>
-              <w:rPr>
-                <w:sz w:val="18"/>
-              </w:rPr>
-              <w:t>Number of schema errors in the original and of values sbom-fixer had to repair</w:t>
+            <w:tcW w:w="1928" w:type="dxa"/>
+          </w:tcPr>
+          <w:p>
+            <w:r>
+              <w:rPr>
+                <w:sz w:val="18"/>
+              </w:rPr>
+              <w:t>1</w:t>
+            </w:r>
+          </w:p>
+        </w:tc>
+        <w:tc>
+          <w:tcPr>
+            <w:tcW w:w="1928" w:type="dxa"/>
+          </w:tcPr>
+          <w:p>
+            <w:r>
+              <w:rPr>
+                <w:sz w:val="18"/>
+              </w:rPr>
+              <w:t>No licence</w:t>
+            </w:r>
+          </w:p>
+        </w:tc>
+        <w:tc>
+          <w:tcPr>
+            <w:tcW w:w="1928" w:type="dxa"/>
+          </w:tcPr>
+          <w:p>
+            <w:r>
+              <w:rPr>
+                <w:sz w:val="18"/>
+              </w:rPr>
+              <w:t>13</w:t>
+            </w:r>
+          </w:p>
+        </w:tc>
+        <w:tc>
+          <w:tcPr>
+            <w:tcW w:w="1928" w:type="dxa"/>
+          </w:tcPr>
+          <w:p>
+            <w:r>
+              <w:rPr>
+                <w:sz w:val="18"/>
+              </w:rPr>
+              <w:t>antlr-runtime@3.4, aos-common-models@SB3-0.0.1, api-commons@SB3-0.0.1, ... +8 more</w:t>
+            </w:r>
+          </w:p>
+        </w:tc>
+        <w:tc>
+          <w:tcPr>
+            <w:tcW w:w="1928" w:type="dxa"/>
+          </w:tcPr>
+          <w:p>
+            <w:r>
+              <w:rPr>
+                <w:sz w:val="18"/>
+              </w:rPr>
+              <w:t>Add the licence (SPDX id, e.g. MIT, Apache-2.0) to the package manifest (pom, csproj, package.json); for own libraries set it in the build.</w:t>
             </w:r>
           </w:p>
         </w:tc>
@@ -8823,29 +8902,85 @@
         </w:trPr>
         <w:tc>
           <w:tcPr>
-            <w:tcW w:w="4819" w:type="dxa"/>
-            <w:shd w:val="clear" w:color="auto" w:fill="F2F6FA"/>
-          </w:tcPr>
-          <w:p>
-            <w:r>
-              <w:rPr>
-                <w:sz w:val="18"/>
-              </w:rPr>
-              <w:t>1. Schema errors in the original</w:t>
-            </w:r>
-          </w:p>
-        </w:tc>
-        <w:tc>
-          <w:tcPr>
-            <w:tcW w:w="4819" w:type="dxa"/>
-            <w:shd w:val="clear" w:color="auto" w:fill="F2F6FA"/>
-          </w:tcPr>
-          <w:p>
-            <w:r>
-              <w:rPr>
-                <w:sz w:val="18"/>
-              </w:rPr>
-              <w:t>Errors of the original against its own schema, grouped, each with "How to fix"</w:t>
+            <w:tcW w:w="1928" w:type="dxa"/>
+            <w:shd w:val="clear" w:color="auto" w:fill="F2F6FA"/>
+          </w:tcPr>
+          <w:p>
+            <w:r>
+              <w:rPr>
+                <w:sz w:val="18"/>
+              </w:rPr>
+              <w:t>2</w:t>
+            </w:r>
+          </w:p>
+        </w:tc>
+        <w:tc>
+          <w:tcPr>
+            <w:tcW w:w="1928" w:type="dxa"/>
+            <w:shd w:val="clear" w:color="auto" w:fill="F2F6FA"/>
+          </w:tcPr>
+          <w:p>
+            <w:r>
+              <w:rPr>
+                <w:sz w:val="18"/>
+              </w:rPr>
+              <w:t xml:space="preserve">Schema error at </w:t>
+            </w:r>
+            <w:r>
+              <w:rPr>
+                <w:rFonts w:ascii="Consolas" w:hAnsi="Consolas"/>
+                <w:color w:val="8B1A1A"/>
+                <w:sz w:val="18"/>
+              </w:rPr>
+              <w:t>/serialNumber</w:t>
+            </w:r>
+            <w:r>
+              <w:rPr>
+                <w:sz w:val="18"/>
+              </w:rPr>
+              <w:t>: 'ACME-0001' does not match '^urn:uuid:...'</w:t>
+            </w:r>
+          </w:p>
+        </w:tc>
+        <w:tc>
+          <w:tcPr>
+            <w:tcW w:w="1928" w:type="dxa"/>
+            <w:shd w:val="clear" w:color="auto" w:fill="F2F6FA"/>
+          </w:tcPr>
+          <w:p>
+            <w:r>
+              <w:rPr>
+                <w:sz w:val="18"/>
+              </w:rPr>
+              <w:t>1</w:t>
+            </w:r>
+          </w:p>
+        </w:tc>
+        <w:tc>
+          <w:tcPr>
+            <w:tcW w:w="1928" w:type="dxa"/>
+            <w:shd w:val="clear" w:color="auto" w:fill="F2F6FA"/>
+          </w:tcPr>
+          <w:p>
+            <w:r>
+              <w:rPr>
+                <w:sz w:val="18"/>
+              </w:rPr>
+              <w:t>-</w:t>
+            </w:r>
+          </w:p>
+        </w:tc>
+        <w:tc>
+          <w:tcPr>
+            <w:tcW w:w="1928" w:type="dxa"/>
+            <w:shd w:val="clear" w:color="auto" w:fill="F2F6FA"/>
+          </w:tcPr>
+          <w:p>
+            <w:r>
+              <w:rPr>
+                <w:sz w:val="18"/>
+              </w:rPr>
+              <w:t>Write the value in the expected pattern (for example urn:uuid:... for serialNumber).</w:t>
             </w:r>
           </w:p>
         </w:tc>
@@ -8856,87 +8991,87 @@
         </w:trPr>
         <w:tc>
           <w:tcPr>
-            <w:tcW w:w="4819" w:type="dxa"/>
-          </w:tcPr>
-          <w:p>
-            <w:r>
-              <w:rPr>
-                <w:sz w:val="18"/>
-              </w:rPr>
-              <w:t>2. Data problems sbom-fixer had to repair</w:t>
-            </w:r>
-          </w:p>
-        </w:tc>
-        <w:tc>
-          <w:tcPr>
-            <w:tcW w:w="4819" w:type="dxa"/>
-          </w:tcPr>
-          <w:p>
-            <w:r>
-              <w:rPr>
-                <w:sz w:val="18"/>
-              </w:rPr>
-              <w:t xml:space="preserve">One block per rule: how often, why, examples and </w:t>
-            </w:r>
-            <w:r>
-              <w:rPr>
-                <w:b/>
-                <w:sz w:val="18"/>
-              </w:rPr>
-              <w:t>Fix at the source</w:t>
-            </w:r>
-          </w:p>
-        </w:tc>
-      </w:tr>
-      <w:tr>
-        <w:trPr>
-          <w:jc w:val="center"/>
-        </w:trPr>
-        <w:tc>
-          <w:tcPr>
-            <w:tcW w:w="4819" w:type="dxa"/>
-            <w:shd w:val="clear" w:color="auto" w:fill="F2F6FA"/>
-          </w:tcPr>
-          <w:p>
-            <w:r>
-              <w:rPr>
-                <w:sz w:val="18"/>
-              </w:rPr>
-              <w:t>3. Generator and pipeline</w:t>
-            </w:r>
-          </w:p>
-        </w:tc>
-        <w:tc>
-          <w:tcPr>
-            <w:tcW w:w="4819" w:type="dxa"/>
-            <w:shd w:val="clear" w:color="auto" w:fill="F2F6FA"/>
-          </w:tcPr>
-          <w:p>
-            <w:r>
-              <w:rPr>
-                <w:sz w:val="18"/>
-              </w:rPr>
-              <w:t xml:space="preserve">Pipeline hints, for example set </w:t>
-            </w:r>
-            <w:r>
-              <w:rPr>
-                <w:rFonts w:ascii="Consolas" w:hAnsi="Consolas"/>
-                <w:color w:val="8B1A1A"/>
-                <w:sz w:val="18"/>
-              </w:rPr>
-              <w:t>metadata.authors</w:t>
-            </w:r>
-            <w:r>
-              <w:rPr>
-                <w:sz w:val="18"/>
-              </w:rPr>
-              <w:t xml:space="preserve"> or use the generator's own output option</w:t>
+            <w:tcW w:w="1928" w:type="dxa"/>
+          </w:tcPr>
+          <w:p>
+            <w:r>
+              <w:rPr>
+                <w:sz w:val="18"/>
+              </w:rPr>
+              <w:t>3</w:t>
+            </w:r>
+          </w:p>
+        </w:tc>
+        <w:tc>
+          <w:tcPr>
+            <w:tcW w:w="1928" w:type="dxa"/>
+          </w:tcPr>
+          <w:p>
+            <w:r>
+              <w:rPr>
+                <w:sz w:val="18"/>
+              </w:rPr>
+              <w:t>No root component (metadata.component)</w:t>
+            </w:r>
+          </w:p>
+        </w:tc>
+        <w:tc>
+          <w:tcPr>
+            <w:tcW w:w="1928" w:type="dxa"/>
+          </w:tcPr>
+          <w:p>
+            <w:r>
+              <w:rPr>
+                <w:sz w:val="18"/>
+              </w:rPr>
+              <w:t>1</w:t>
+            </w:r>
+          </w:p>
+        </w:tc>
+        <w:tc>
+          <w:tcPr>
+            <w:tcW w:w="1928" w:type="dxa"/>
+          </w:tcPr>
+          <w:p>
+            <w:r>
+              <w:rPr>
+                <w:sz w:val="18"/>
+              </w:rPr>
+              <w:t>root component</w:t>
+            </w:r>
+          </w:p>
+        </w:tc>
+        <w:tc>
+          <w:tcPr>
+            <w:tcW w:w="1928" w:type="dxa"/>
+          </w:tcPr>
+          <w:p>
+            <w:r>
+              <w:rPr>
+                <w:sz w:val="18"/>
+              </w:rPr>
+              <w:t>Let the generator write the application itself as metadata.component (name, version).</w:t>
             </w:r>
           </w:p>
         </w:tc>
       </w:tr>
     </w:tbl>
     <w:p/>
+    <w:p>
+      <w:r>
+        <w:t>Schema errors of the original come first (grouped by cause), then the data problems, then pipeline hints. A problem</w:t>
+      </w:r>
+    </w:p>
+    <w:p>
+      <w:r>
+        <w:t>is listed once: the repair of a schema error is not listed again. With nothing to fix the file says</w:t>
+      </w:r>
+    </w:p>
+    <w:p>
+      <w:r>
+        <w:t>"No issues found. Nothing to fix."</w:t>
+      </w:r>
+    </w:p>
     <w:p>
       <w:r>
         <w:t xml:space="preserve">Layout changes (dropped hashes, properties, qualifiers, the reshaped </w:t>
@@ -8992,7 +9127,6 @@
                 <w:color w:val="FFFFFF"/>
                 <w:sz w:val="18"/>
               </w:rPr>
-              <w:lastRenderedPageBreak/>
               <w:t>Severity</w:t>
             </w:r>
           </w:p>
@@ -9176,9 +9310,8 @@
       <w:pPr>
         <w:pStyle w:val="Heading1"/>
       </w:pPr>
-      <w:bookmarkStart w:id="24" w:name="_Toc242715910"/>
-      <w:r>
-        <w:lastRenderedPageBreak/>
+      <w:bookmarkStart w:id="24" w:name="_Toc242716483"/>
+      <w:r>
         <w:t>Step 10 – Exit codes and what to do</w:t>
       </w:r>
       <w:bookmarkEnd w:id="24"/>
@@ -9605,9 +9738,8 @@
       <w:pPr>
         <w:pStyle w:val="Heading1"/>
       </w:pPr>
-      <w:bookmarkStart w:id="25" w:name="_Toc242715911"/>
-      <w:r>
-        <w:lastRenderedPageBreak/>
+      <w:bookmarkStart w:id="25" w:name="_Toc242716484"/>
+      <w:r>
         <w:t>Step 11 – Profiles and configuration</w:t>
       </w:r>
       <w:bookmarkEnd w:id="25"/>
@@ -10594,7 +10726,6 @@
                 <w:color w:val="8B1A1A"/>
                 <w:sz w:val="18"/>
               </w:rPr>
-              <w:lastRenderedPageBreak/>
               <w:t>purl.supported_types</w:t>
             </w:r>
           </w:p>
@@ -11283,9 +11414,8 @@
       <w:pPr>
         <w:pStyle w:val="Heading1"/>
       </w:pPr>
-      <w:bookmarkStart w:id="26" w:name="_Toc242715912"/>
-      <w:r>
-        <w:lastRenderedPageBreak/>
+      <w:bookmarkStart w:id="26" w:name="_Toc242716485"/>
+      <w:r>
         <w:t>Step 12 – Checkmarx integration</w:t>
       </w:r>
       <w:bookmarkEnd w:id="26"/>
@@ -11316,7 +11446,7 @@
       <w:pPr>
         <w:pStyle w:val="Heading2"/>
       </w:pPr>
-      <w:bookmarkStart w:id="27" w:name="_Toc242715913"/>
+      <w:bookmarkStart w:id="27" w:name="_Toc242716486"/>
       <w:r>
         <w:t>12.1 Set up once</w:t>
       </w:r>
@@ -11700,7 +11830,7 @@
       <w:pPr>
         <w:pStyle w:val="Heading2"/>
       </w:pPr>
-      <w:bookmarkStart w:id="28" w:name="_Toc242715914"/>
+      <w:bookmarkStart w:id="28" w:name="_Toc242716487"/>
       <w:r>
         <w:t>12.2 Upload and check a file</w:t>
       </w:r>
@@ -11751,9 +11881,8 @@
       <w:pPr>
         <w:pStyle w:val="Heading1"/>
       </w:pPr>
-      <w:bookmarkStart w:id="29" w:name="_Toc242715915"/>
-      <w:r>
-        <w:lastRenderedPageBreak/>
+      <w:bookmarkStart w:id="29" w:name="_Toc242716488"/>
+      <w:r>
         <w:t>Step 13 – Quality audit (NTIA and sbomqs)</w:t>
       </w:r>
       <w:bookmarkEnd w:id="29"/>
@@ -11827,7 +11956,7 @@
       <w:pPr>
         <w:pStyle w:val="Heading2"/>
       </w:pPr>
-      <w:bookmarkStart w:id="30" w:name="_Toc242715916"/>
+      <w:bookmarkStart w:id="30" w:name="_Toc242716489"/>
       <w:r>
         <w:t>13.1 sbomqs is bundled in the repository</w:t>
       </w:r>
@@ -12128,7 +12257,7 @@
       <w:pPr>
         <w:pStyle w:val="Heading2"/>
       </w:pPr>
-      <w:bookmarkStart w:id="31" w:name="_Toc242715917"/>
+      <w:bookmarkStart w:id="31" w:name="_Toc242716490"/>
       <w:r>
         <w:t>13.2 How sbom-fixer finds sbomqs</w:t>
       </w:r>
@@ -12430,7 +12559,7 @@
       <w:pPr>
         <w:pStyle w:val="Heading2"/>
       </w:pPr>
-      <w:bookmarkStart w:id="32" w:name="_Toc242715918"/>
+      <w:bookmarkStart w:id="32" w:name="_Toc242716491"/>
       <w:r>
         <w:t>13.3 Use sbomqs directly</w:t>
       </w:r>
@@ -12452,7 +12581,6 @@
           <w:rFonts w:ascii="Consolas" w:hAnsi="Consolas"/>
           <w:sz w:val="17"/>
         </w:rPr>
-        <w:lastRenderedPageBreak/>
         <w:t>tools\sbomqs\windows-amd64\sbomqs.exe version</w:t>
       </w:r>
     </w:p>
@@ -12551,7 +12679,7 @@
       <w:pPr>
         <w:pStyle w:val="Heading2"/>
       </w:pPr>
-      <w:bookmarkStart w:id="33" w:name="_Toc242715919"/>
+      <w:bookmarkStart w:id="33" w:name="_Toc242716492"/>
       <w:r>
         <w:t>13.4 Check that the bundled copy is genuine</w:t>
       </w:r>
@@ -12634,7 +12762,7 @@
       <w:pPr>
         <w:pStyle w:val="Heading2"/>
       </w:pPr>
-      <w:bookmarkStart w:id="34" w:name="_Toc242715920"/>
+      <w:bookmarkStart w:id="34" w:name="_Toc242716493"/>
       <w:r>
         <w:t>13.5 When there is no score</w:t>
       </w:r>
@@ -12875,9 +13003,8 @@
       <w:pPr>
         <w:pStyle w:val="Heading1"/>
       </w:pPr>
-      <w:bookmarkStart w:id="35" w:name="_Toc242715921"/>
-      <w:r>
-        <w:lastRenderedPageBreak/>
+      <w:bookmarkStart w:id="35" w:name="_Toc242716494"/>
+      <w:r>
         <w:t>Step 14 – Use in Jenkins</w:t>
       </w:r>
       <w:bookmarkEnd w:id="35"/>
@@ -12990,9 +13117,8 @@
       <w:pPr>
         <w:pStyle w:val="Heading1"/>
       </w:pPr>
-      <w:bookmarkStart w:id="36" w:name="_Toc242715922"/>
-      <w:r>
-        <w:lastRenderedPageBreak/>
+      <w:bookmarkStart w:id="36" w:name="_Toc242716495"/>
+      <w:r>
         <w:t>Step 15 – Rule reference</w:t>
       </w:r>
       <w:bookmarkEnd w:id="36"/>
@@ -13001,7 +13127,7 @@
       <w:pPr>
         <w:pStyle w:val="Heading2"/>
       </w:pPr>
-      <w:bookmarkStart w:id="37" w:name="_Toc242715923"/>
+      <w:bookmarkStart w:id="37" w:name="_Toc242716496"/>
       <w:r>
         <w:t>15.1 How to read a rule ID</w:t>
       </w:r>
@@ -13575,7 +13701,7 @@
       <w:pPr>
         <w:pStyle w:val="Heading2"/>
       </w:pPr>
-      <w:bookmarkStart w:id="38" w:name="_Toc242715924"/>
+      <w:bookmarkStart w:id="38" w:name="_Toc242716497"/>
       <w:r>
         <w:t>15.2 Rules every rule follows</w:t>
       </w:r>
@@ -13679,7 +13805,7 @@
       <w:pPr>
         <w:pStyle w:val="Heading2"/>
       </w:pPr>
-      <w:bookmarkStart w:id="39" w:name="_Toc242715925"/>
+      <w:bookmarkStart w:id="39" w:name="_Toc242716498"/>
       <w:r>
         <w:t>15.3 Where the rules come from</w:t>
       </w:r>
@@ -13894,7 +14020,6 @@
               <w:rPr>
                 <w:sz w:val="18"/>
               </w:rPr>
-              <w:lastRenderedPageBreak/>
               <w:t>Checkmarx purl and version research</w:t>
             </w:r>
           </w:p>
@@ -13927,7 +14052,7 @@
       <w:pPr>
         <w:pStyle w:val="Heading2"/>
       </w:pPr>
-      <w:bookmarkStart w:id="40" w:name="_Toc242715926"/>
+      <w:bookmarkStart w:id="40" w:name="_Toc242716499"/>
       <w:r>
         <w:t>15.4 All rules</w:t>
       </w:r>
@@ -15134,7 +15259,6 @@
               <w:rPr>
                 <w:sz w:val="15"/>
               </w:rPr>
-              <w:lastRenderedPageBreak/>
               <w:t>SAN-001</w:t>
             </w:r>
           </w:p>
@@ -16374,7 +16498,6 @@
               <w:rPr>
                 <w:sz w:val="15"/>
               </w:rPr>
-              <w:lastRenderedPageBreak/>
               <w:t>SAN-050</w:t>
             </w:r>
           </w:p>
@@ -17425,14 +17548,7 @@
               <w:rPr>
                 <w:sz w:val="15"/>
               </w:rPr>
-              <w:t>A supported purl carried URL-valued qualifiers or subpath (for example repository_url=https://...). Checkmarx documents purls as pkg:type/[namespace/]name@version and matches by name and version, so they were removed; the original purl is kept in sbom-</w:t>
-            </w:r>
-            <w:r>
-              <w:rPr>
-                <w:sz w:val="15"/>
-              </w:rPr>
-              <w:lastRenderedPageBreak/>
-              <w:t>fixer:original-purl.</w:t>
+              <w:t>A supported purl carried URL-valued qualifiers or subpath (for example repository_url=https://...). Checkmarx documents purls as pkg:type/[namespace/]name@version and matches by name and version, so they were removed; the original purl is kept in sbom-fixer:original-purl.</w:t>
             </w:r>
           </w:p>
         </w:tc>
@@ -18164,14 +18280,7 @@
               <w:rPr>
                 <w:sz w:val="15"/>
               </w:rPr>
-              <w:t xml:space="preserve">Each component was reduced to bom-ref, type, name, version, purl and licenses (profile key canonical.component_fields). Hashes, evidence, properties, externalReferences, descriptions and the other fields Checkmarx does not read were dropped; the original SBOM still has them. A missing bom-ref (or one </w:t>
-            </w:r>
-            <w:r>
-              <w:rPr>
-                <w:sz w:val="15"/>
-              </w:rPr>
-              <w:lastRenderedPageBreak/>
-              <w:t>holding a web URL, renamed in dependencies too) was set to the purl (or the name), a missing type to library.</w:t>
+              <w:t>Each component was reduced to bom-ref, type, name, version, purl and licenses (profile key canonical.component_fields). Hashes, evidence, properties, externalReferences, descriptions and the other fields Checkmarx does not read were dropped; the original SBOM still has them. A missing bom-ref (or one holding a web URL, renamed in dependencies too) was set to the purl (or the name), a missing type to library.</w:t>
             </w:r>
           </w:p>
         </w:tc>
@@ -18185,7 +18294,6 @@
               <w:rPr>
                 <w:sz w:val="15"/>
               </w:rPr>
-              <w:lastRenderedPageBreak/>
               <w:t>Give every component a bom-ref (cdxgen uses the purl) and a type; never a web URL as bom-ref.</w:t>
             </w:r>
           </w:p>
@@ -19218,7 +19326,6 @@
               <w:rPr>
                 <w:sz w:val="15"/>
               </w:rPr>
-              <w:lastRenderedPageBreak/>
               <w:t>CDX15-004</w:t>
             </w:r>
           </w:p>
@@ -20884,7 +20991,6 @@
               <w:rPr>
                 <w:sz w:val="15"/>
               </w:rPr>
-              <w:lastRenderedPageBreak/>
               <w:t>CDX16-011</w:t>
             </w:r>
           </w:p>
@@ -21704,9 +21810,8 @@
       <w:pPr>
         <w:pStyle w:val="Heading1"/>
       </w:pPr>
-      <w:bookmarkStart w:id="41" w:name="_Toc242715927"/>
-      <w:r>
-        <w:lastRenderedPageBreak/>
+      <w:bookmarkStart w:id="41" w:name="_Toc242716500"/>
+      <w:r>
         <w:t>Step 16 – Troubleshooting</w:t>
       </w:r>
       <w:bookmarkEnd w:id="41"/>
@@ -22821,7 +22926,6 @@
               <w:rPr>
                 <w:sz w:val="18"/>
               </w:rPr>
-              <w:lastRenderedPageBreak/>
               <w:t>Exit 7 for an Erlang or Rust SBOM</w:t>
             </w:r>
           </w:p>
@@ -23138,9 +23242,8 @@
       <w:pPr>
         <w:pStyle w:val="Heading1"/>
       </w:pPr>
-      <w:bookmarkStart w:id="42" w:name="_Toc242715928"/>
-      <w:r>
-        <w:lastRenderedPageBreak/>
+      <w:bookmarkStart w:id="42" w:name="_Toc242716501"/>
+      <w:r>
         <w:t>Step 17 – Updating the tool</w:t>
       </w:r>
       <w:bookmarkEnd w:id="42"/>
@@ -23149,7 +23252,7 @@
       <w:pPr>
         <w:pStyle w:val="Heading2"/>
       </w:pPr>
-      <w:bookmarkStart w:id="43" w:name="_Toc242715929"/>
+      <w:bookmarkStart w:id="43" w:name="_Toc242716502"/>
       <w:r>
         <w:t>17.1 Install a newer version</w:t>
       </w:r>
@@ -23244,7 +23347,7 @@
       <w:pPr>
         <w:pStyle w:val="Heading2"/>
       </w:pPr>
-      <w:bookmarkStart w:id="44" w:name="_Toc242715930"/>
+      <w:bookmarkStart w:id="44" w:name="_Toc242716503"/>
       <w:r>
         <w:t>17.2 When CycloneDX releases a new version</w:t>
       </w:r>
@@ -23337,7 +23440,7 @@
       <w:pPr>
         <w:pStyle w:val="Heading2"/>
       </w:pPr>
-      <w:bookmarkStart w:id="45" w:name="_Toc242715931"/>
+      <w:bookmarkStart w:id="45" w:name="_Toc242716504"/>
       <w:r>
         <w:t>17.3 When Checkmarx supports a newer version</w:t>
       </w:r>
@@ -23372,7 +23475,7 @@
       <w:pPr>
         <w:pStyle w:val="Heading2"/>
       </w:pPr>
-      <w:bookmarkStart w:id="46" w:name="_Toc242715932"/>
+      <w:bookmarkStart w:id="46" w:name="_Toc242716505"/>
       <w:r>
         <w:t>17.4 When a new sbomqs is released</w:t>
       </w:r>
@@ -23523,7 +23626,7 @@
       <w:pPr>
         <w:pStyle w:val="Heading2"/>
       </w:pPr>
-      <w:bookmarkStart w:id="47" w:name="_Toc242715933"/>
+      <w:bookmarkStart w:id="47" w:name="_Toc242716506"/>
       <w:r>
         <w:t>17.5 Adding a new rule (developers)</w:t>
       </w:r>
@@ -23681,9 +23784,8 @@
       <w:pPr>
         <w:pStyle w:val="Heading1"/>
       </w:pPr>
-      <w:bookmarkStart w:id="48" w:name="_Toc242715934"/>
-      <w:r>
-        <w:lastRenderedPageBreak/>
+      <w:bookmarkStart w:id="48" w:name="_Toc242716507"/>
+      <w:r>
         <w:t>Step 18 – Command cheat sheet</w:t>
       </w:r>
       <w:bookmarkEnd w:id="48"/>
@@ -24500,31 +24602,31 @@
       </w:rPr>
     </w:lvl>
   </w:abstractNum>
-  <w:num w:numId="1" w16cid:durableId="1471244401">
+  <w:num w:numId="1" w16cid:durableId="1161045185">
     <w:abstractNumId w:val="8"/>
   </w:num>
-  <w:num w:numId="2" w16cid:durableId="2053574711">
+  <w:num w:numId="2" w16cid:durableId="1392189218">
     <w:abstractNumId w:val="6"/>
   </w:num>
-  <w:num w:numId="3" w16cid:durableId="650520540">
+  <w:num w:numId="3" w16cid:durableId="29230646">
     <w:abstractNumId w:val="5"/>
   </w:num>
-  <w:num w:numId="4" w16cid:durableId="2059477817">
+  <w:num w:numId="4" w16cid:durableId="311106122">
     <w:abstractNumId w:val="4"/>
   </w:num>
-  <w:num w:numId="5" w16cid:durableId="375088830">
+  <w:num w:numId="5" w16cid:durableId="1539047771">
     <w:abstractNumId w:val="7"/>
   </w:num>
-  <w:num w:numId="6" w16cid:durableId="2117746170">
+  <w:num w:numId="6" w16cid:durableId="723992235">
     <w:abstractNumId w:val="3"/>
   </w:num>
-  <w:num w:numId="7" w16cid:durableId="216548490">
+  <w:num w:numId="7" w16cid:durableId="1714841157">
     <w:abstractNumId w:val="2"/>
   </w:num>
-  <w:num w:numId="8" w16cid:durableId="1285037708">
+  <w:num w:numId="8" w16cid:durableId="17515621">
     <w:abstractNumId w:val="1"/>
   </w:num>
-  <w:num w:numId="9" w16cid:durableId="957028888">
+  <w:num w:numId="9" w16cid:durableId="1980568076">
     <w:abstractNumId w:val="0"/>
   </w:num>
 </w:numbering>
@@ -35921,7 +36023,7 @@
     <w:autoRedefine/>
     <w:uiPriority w:val="39"/>
     <w:unhideWhenUsed/>
-    <w:rsid w:val="00EE1920"/>
+    <w:rsid w:val="00E12038"/>
     <w:pPr>
       <w:spacing w:after="100"/>
     </w:pPr>
@@ -35933,7 +36035,7 @@
     <w:autoRedefine/>
     <w:uiPriority w:val="39"/>
     <w:unhideWhenUsed/>
-    <w:rsid w:val="00EE1920"/>
+    <w:rsid w:val="00E12038"/>
     <w:pPr>
       <w:spacing w:after="100"/>
       <w:ind w:left="210"/>
@@ -35944,7 +36046,7 @@
     <w:basedOn w:val="DefaultParagraphFont"/>
     <w:uiPriority w:val="99"/>
     <w:unhideWhenUsed/>
-    <w:rsid w:val="00EE1920"/>
+    <w:rsid w:val="00E12038"/>
     <w:rPr>
       <w:color w:val="0000FF" w:themeColor="hyperlink"/>
       <w:u w:val="single"/>

</xml_diff>

<commit_message>
Show the NTIA minimum elements of the original in all outputs
fix now checks the NTIA minimum elements of the original SBOM (built in,
always) and shows them:
- console: "ntia : original FAIL - supplier 72/320, author missing" or PASS;
- suggestions: one row per missing element with the count, the components
  (name@version) and the fix, e.g. "No supplier (NTIA) | 248 of 320";
- tech notes: summary lines and a table of the seven elements, original
  next to corrected.
The former "set metadata.authors" pipeline hint is the "No SBOM author
(NTIA)" row. README, Rule Book (md + docx), CHANGELOG, examples, wheel and
tests updated.
</commit_message>
<xml_diff>
--- a/SBOM_Fixer_Rule_Book_And_Installation_guide.docx
+++ b/SBOM_Fixer_Rule_Book_And_Installation_guide.docx
@@ -358,7 +358,7 @@
       <w:pPr>
         <w:pStyle w:val="Heading1"/>
       </w:pPr>
-      <w:bookmarkStart w:id="0" w:name="_Toc242716459"/>
+      <w:bookmarkStart w:id="0" w:name="_Toc242718508"/>
       <w:r>
         <w:t>Contents</w:t>
       </w:r>
@@ -383,7 +383,7 @@
       <w:r>
         <w:fldChar w:fldCharType="separate"/>
       </w:r>
-      <w:hyperlink w:anchor="_Toc242716459" w:history="1">
+      <w:hyperlink w:anchor="_Toc242718508" w:history="1">
         <w:r>
           <w:rPr>
             <w:rStyle w:val="Hyperlink"/>
@@ -410,7 +410,7 @@
             <w:noProof/>
             <w:webHidden/>
           </w:rPr>
-          <w:instrText xml:space="preserve"> PAGEREF _Toc242716459 \h </w:instrText>
+          <w:instrText xml:space="preserve"> PAGEREF _Toc242718508 \h </w:instrText>
         </w:r>
         <w:r>
           <w:rPr>
@@ -451,7 +451,7 @@
           <w:noProof/>
         </w:rPr>
       </w:pPr>
-      <w:hyperlink w:anchor="_Toc242716460" w:history="1">
+      <w:hyperlink w:anchor="_Toc242718509" w:history="1">
         <w:r>
           <w:rPr>
             <w:rStyle w:val="Hyperlink"/>
@@ -478,7 +478,7 @@
             <w:noProof/>
             <w:webHidden/>
           </w:rPr>
-          <w:instrText xml:space="preserve"> PAGEREF _Toc242716460 \h </w:instrText>
+          <w:instrText xml:space="preserve"> PAGEREF _Toc242718509 \h </w:instrText>
         </w:r>
         <w:r>
           <w:rPr>
@@ -519,7 +519,7 @@
           <w:noProof/>
         </w:rPr>
       </w:pPr>
-      <w:hyperlink w:anchor="_Toc242716461" w:history="1">
+      <w:hyperlink w:anchor="_Toc242718510" w:history="1">
         <w:r>
           <w:rPr>
             <w:rStyle w:val="Hyperlink"/>
@@ -546,7 +546,7 @@
             <w:noProof/>
             <w:webHidden/>
           </w:rPr>
-          <w:instrText xml:space="preserve"> PAGEREF _Toc242716461 \h </w:instrText>
+          <w:instrText xml:space="preserve"> PAGEREF _Toc242718510 \h </w:instrText>
         </w:r>
         <w:r>
           <w:rPr>
@@ -587,7 +587,7 @@
           <w:noProof/>
         </w:rPr>
       </w:pPr>
-      <w:hyperlink w:anchor="_Toc242716462" w:history="1">
+      <w:hyperlink w:anchor="_Toc242718511" w:history="1">
         <w:r>
           <w:rPr>
             <w:rStyle w:val="Hyperlink"/>
@@ -614,7 +614,7 @@
             <w:noProof/>
             <w:webHidden/>
           </w:rPr>
-          <w:instrText xml:space="preserve"> PAGEREF _Toc242716462 \h </w:instrText>
+          <w:instrText xml:space="preserve"> PAGEREF _Toc242718511 \h </w:instrText>
         </w:r>
         <w:r>
           <w:rPr>
@@ -655,7 +655,7 @@
           <w:noProof/>
         </w:rPr>
       </w:pPr>
-      <w:hyperlink w:anchor="_Toc242716463" w:history="1">
+      <w:hyperlink w:anchor="_Toc242718512" w:history="1">
         <w:r>
           <w:rPr>
             <w:rStyle w:val="Hyperlink"/>
@@ -682,7 +682,7 @@
             <w:noProof/>
             <w:webHidden/>
           </w:rPr>
-          <w:instrText xml:space="preserve"> PAGEREF _Toc242716463 \h </w:instrText>
+          <w:instrText xml:space="preserve"> PAGEREF _Toc242718512 \h </w:instrText>
         </w:r>
         <w:r>
           <w:rPr>
@@ -723,7 +723,7 @@
           <w:noProof/>
         </w:rPr>
       </w:pPr>
-      <w:hyperlink w:anchor="_Toc242716464" w:history="1">
+      <w:hyperlink w:anchor="_Toc242718513" w:history="1">
         <w:r>
           <w:rPr>
             <w:rStyle w:val="Hyperlink"/>
@@ -750,7 +750,7 @@
             <w:noProof/>
             <w:webHidden/>
           </w:rPr>
-          <w:instrText xml:space="preserve"> PAGEREF _Toc242716464 \h </w:instrText>
+          <w:instrText xml:space="preserve"> PAGEREF _Toc242718513 \h </w:instrText>
         </w:r>
         <w:r>
           <w:rPr>
@@ -791,7 +791,7 @@
           <w:noProof/>
         </w:rPr>
       </w:pPr>
-      <w:hyperlink w:anchor="_Toc242716465" w:history="1">
+      <w:hyperlink w:anchor="_Toc242718514" w:history="1">
         <w:r>
           <w:rPr>
             <w:rStyle w:val="Hyperlink"/>
@@ -818,7 +818,7 @@
             <w:noProof/>
             <w:webHidden/>
           </w:rPr>
-          <w:instrText xml:space="preserve"> PAGEREF _Toc242716465 \h </w:instrText>
+          <w:instrText xml:space="preserve"> PAGEREF _Toc242718514 \h </w:instrText>
         </w:r>
         <w:r>
           <w:rPr>
@@ -859,7 +859,7 @@
           <w:noProof/>
         </w:rPr>
       </w:pPr>
-      <w:hyperlink w:anchor="_Toc242716466" w:history="1">
+      <w:hyperlink w:anchor="_Toc242718515" w:history="1">
         <w:r>
           <w:rPr>
             <w:rStyle w:val="Hyperlink"/>
@@ -886,7 +886,7 @@
             <w:noProof/>
             <w:webHidden/>
           </w:rPr>
-          <w:instrText xml:space="preserve"> PAGEREF _Toc242716466 \h </w:instrText>
+          <w:instrText xml:space="preserve"> PAGEREF _Toc242718515 \h </w:instrText>
         </w:r>
         <w:r>
           <w:rPr>
@@ -927,7 +927,7 @@
           <w:noProof/>
         </w:rPr>
       </w:pPr>
-      <w:hyperlink w:anchor="_Toc242716467" w:history="1">
+      <w:hyperlink w:anchor="_Toc242718516" w:history="1">
         <w:r>
           <w:rPr>
             <w:rStyle w:val="Hyperlink"/>
@@ -954,7 +954,7 @@
             <w:noProof/>
             <w:webHidden/>
           </w:rPr>
-          <w:instrText xml:space="preserve"> PAGEREF _Toc242716467 \h </w:instrText>
+          <w:instrText xml:space="preserve"> PAGEREF _Toc242718516 \h </w:instrText>
         </w:r>
         <w:r>
           <w:rPr>
@@ -995,7 +995,7 @@
           <w:noProof/>
         </w:rPr>
       </w:pPr>
-      <w:hyperlink w:anchor="_Toc242716468" w:history="1">
+      <w:hyperlink w:anchor="_Toc242718517" w:history="1">
         <w:r>
           <w:rPr>
             <w:rStyle w:val="Hyperlink"/>
@@ -1022,7 +1022,7 @@
             <w:noProof/>
             <w:webHidden/>
           </w:rPr>
-          <w:instrText xml:space="preserve"> PAGEREF _Toc242716468 \h </w:instrText>
+          <w:instrText xml:space="preserve"> PAGEREF _Toc242718517 \h </w:instrText>
         </w:r>
         <w:r>
           <w:rPr>
@@ -1063,7 +1063,7 @@
           <w:noProof/>
         </w:rPr>
       </w:pPr>
-      <w:hyperlink w:anchor="_Toc242716469" w:history="1">
+      <w:hyperlink w:anchor="_Toc242718518" w:history="1">
         <w:r>
           <w:rPr>
             <w:rStyle w:val="Hyperlink"/>
@@ -1090,7 +1090,7 @@
             <w:noProof/>
             <w:webHidden/>
           </w:rPr>
-          <w:instrText xml:space="preserve"> PAGEREF _Toc242716469 \h </w:instrText>
+          <w:instrText xml:space="preserve"> PAGEREF _Toc242718518 \h </w:instrText>
         </w:r>
         <w:r>
           <w:rPr>
@@ -1131,7 +1131,7 @@
           <w:noProof/>
         </w:rPr>
       </w:pPr>
-      <w:hyperlink w:anchor="_Toc242716470" w:history="1">
+      <w:hyperlink w:anchor="_Toc242718519" w:history="1">
         <w:r>
           <w:rPr>
             <w:rStyle w:val="Hyperlink"/>
@@ -1158,7 +1158,7 @@
             <w:noProof/>
             <w:webHidden/>
           </w:rPr>
-          <w:instrText xml:space="preserve"> PAGEREF _Toc242716470 \h </w:instrText>
+          <w:instrText xml:space="preserve"> PAGEREF _Toc242718519 \h </w:instrText>
         </w:r>
         <w:r>
           <w:rPr>
@@ -1199,7 +1199,7 @@
           <w:noProof/>
         </w:rPr>
       </w:pPr>
-      <w:hyperlink w:anchor="_Toc242716471" w:history="1">
+      <w:hyperlink w:anchor="_Toc242718520" w:history="1">
         <w:r>
           <w:rPr>
             <w:rStyle w:val="Hyperlink"/>
@@ -1226,7 +1226,7 @@
             <w:noProof/>
             <w:webHidden/>
           </w:rPr>
-          <w:instrText xml:space="preserve"> PAGEREF _Toc242716471 \h </w:instrText>
+          <w:instrText xml:space="preserve"> PAGEREF _Toc242718520 \h </w:instrText>
         </w:r>
         <w:r>
           <w:rPr>
@@ -1267,7 +1267,7 @@
           <w:noProof/>
         </w:rPr>
       </w:pPr>
-      <w:hyperlink w:anchor="_Toc242716472" w:history="1">
+      <w:hyperlink w:anchor="_Toc242718521" w:history="1">
         <w:r>
           <w:rPr>
             <w:rStyle w:val="Hyperlink"/>
@@ -1294,7 +1294,7 @@
             <w:noProof/>
             <w:webHidden/>
           </w:rPr>
-          <w:instrText xml:space="preserve"> PAGEREF _Toc242716472 \h </w:instrText>
+          <w:instrText xml:space="preserve"> PAGEREF _Toc242718521 \h </w:instrText>
         </w:r>
         <w:r>
           <w:rPr>
@@ -1335,7 +1335,7 @@
           <w:noProof/>
         </w:rPr>
       </w:pPr>
-      <w:hyperlink w:anchor="_Toc242716473" w:history="1">
+      <w:hyperlink w:anchor="_Toc242718522" w:history="1">
         <w:r>
           <w:rPr>
             <w:rStyle w:val="Hyperlink"/>
@@ -1362,7 +1362,7 @@
             <w:noProof/>
             <w:webHidden/>
           </w:rPr>
-          <w:instrText xml:space="preserve"> PAGEREF _Toc242716473 \h </w:instrText>
+          <w:instrText xml:space="preserve"> PAGEREF _Toc242718522 \h </w:instrText>
         </w:r>
         <w:r>
           <w:rPr>
@@ -1403,7 +1403,7 @@
           <w:noProof/>
         </w:rPr>
       </w:pPr>
-      <w:hyperlink w:anchor="_Toc242716474" w:history="1">
+      <w:hyperlink w:anchor="_Toc242718523" w:history="1">
         <w:r>
           <w:rPr>
             <w:rStyle w:val="Hyperlink"/>
@@ -1430,7 +1430,7 @@
             <w:noProof/>
             <w:webHidden/>
           </w:rPr>
-          <w:instrText xml:space="preserve"> PAGEREF _Toc242716474 \h </w:instrText>
+          <w:instrText xml:space="preserve"> PAGEREF _Toc242718523 \h </w:instrText>
         </w:r>
         <w:r>
           <w:rPr>
@@ -1471,7 +1471,7 @@
           <w:noProof/>
         </w:rPr>
       </w:pPr>
-      <w:hyperlink w:anchor="_Toc242716475" w:history="1">
+      <w:hyperlink w:anchor="_Toc242718524" w:history="1">
         <w:r>
           <w:rPr>
             <w:rStyle w:val="Hyperlink"/>
@@ -1498,7 +1498,7 @@
             <w:noProof/>
             <w:webHidden/>
           </w:rPr>
-          <w:instrText xml:space="preserve"> PAGEREF _Toc242716475 \h </w:instrText>
+          <w:instrText xml:space="preserve"> PAGEREF _Toc242718524 \h </w:instrText>
         </w:r>
         <w:r>
           <w:rPr>
@@ -1539,7 +1539,7 @@
           <w:noProof/>
         </w:rPr>
       </w:pPr>
-      <w:hyperlink w:anchor="_Toc242716476" w:history="1">
+      <w:hyperlink w:anchor="_Toc242718525" w:history="1">
         <w:r>
           <w:rPr>
             <w:rStyle w:val="Hyperlink"/>
@@ -1566,7 +1566,7 @@
             <w:noProof/>
             <w:webHidden/>
           </w:rPr>
-          <w:instrText xml:space="preserve"> PAGEREF _Toc242716476 \h </w:instrText>
+          <w:instrText xml:space="preserve"> PAGEREF _Toc242718525 \h </w:instrText>
         </w:r>
         <w:r>
           <w:rPr>
@@ -1607,7 +1607,7 @@
           <w:noProof/>
         </w:rPr>
       </w:pPr>
-      <w:hyperlink w:anchor="_Toc242716477" w:history="1">
+      <w:hyperlink w:anchor="_Toc242718526" w:history="1">
         <w:r>
           <w:rPr>
             <w:rStyle w:val="Hyperlink"/>
@@ -1634,7 +1634,7 @@
             <w:noProof/>
             <w:webHidden/>
           </w:rPr>
-          <w:instrText xml:space="preserve"> PAGEREF _Toc242716477 \h </w:instrText>
+          <w:instrText xml:space="preserve"> PAGEREF _Toc242718526 \h </w:instrText>
         </w:r>
         <w:r>
           <w:rPr>
@@ -1675,7 +1675,7 @@
           <w:noProof/>
         </w:rPr>
       </w:pPr>
-      <w:hyperlink w:anchor="_Toc242716478" w:history="1">
+      <w:hyperlink w:anchor="_Toc242718527" w:history="1">
         <w:r>
           <w:rPr>
             <w:rStyle w:val="Hyperlink"/>
@@ -1702,7 +1702,7 @@
             <w:noProof/>
             <w:webHidden/>
           </w:rPr>
-          <w:instrText xml:space="preserve"> PAGEREF _Toc242716478 \h </w:instrText>
+          <w:instrText xml:space="preserve"> PAGEREF _Toc242718527 \h </w:instrText>
         </w:r>
         <w:r>
           <w:rPr>
@@ -1743,7 +1743,7 @@
           <w:noProof/>
         </w:rPr>
       </w:pPr>
-      <w:hyperlink w:anchor="_Toc242716479" w:history="1">
+      <w:hyperlink w:anchor="_Toc242718528" w:history="1">
         <w:r>
           <w:rPr>
             <w:rStyle w:val="Hyperlink"/>
@@ -1770,7 +1770,7 @@
             <w:noProof/>
             <w:webHidden/>
           </w:rPr>
-          <w:instrText xml:space="preserve"> PAGEREF _Toc242716479 \h </w:instrText>
+          <w:instrText xml:space="preserve"> PAGEREF _Toc242718528 \h </w:instrText>
         </w:r>
         <w:r>
           <w:rPr>
@@ -1811,7 +1811,7 @@
           <w:noProof/>
         </w:rPr>
       </w:pPr>
-      <w:hyperlink w:anchor="_Toc242716480" w:history="1">
+      <w:hyperlink w:anchor="_Toc242718529" w:history="1">
         <w:r>
           <w:rPr>
             <w:rStyle w:val="Hyperlink"/>
@@ -1838,7 +1838,7 @@
             <w:noProof/>
             <w:webHidden/>
           </w:rPr>
-          <w:instrText xml:space="preserve"> PAGEREF _Toc242716480 \h </w:instrText>
+          <w:instrText xml:space="preserve"> PAGEREF _Toc242718529 \h </w:instrText>
         </w:r>
         <w:r>
           <w:rPr>
@@ -1879,7 +1879,7 @@
           <w:noProof/>
         </w:rPr>
       </w:pPr>
-      <w:hyperlink w:anchor="_Toc242716481" w:history="1">
+      <w:hyperlink w:anchor="_Toc242718530" w:history="1">
         <w:r>
           <w:rPr>
             <w:rStyle w:val="Hyperlink"/>
@@ -1906,7 +1906,7 @@
             <w:noProof/>
             <w:webHidden/>
           </w:rPr>
-          <w:instrText xml:space="preserve"> PAGEREF _Toc242716481 \h </w:instrText>
+          <w:instrText xml:space="preserve"> PAGEREF _Toc242718530 \h </w:instrText>
         </w:r>
         <w:r>
           <w:rPr>
@@ -1947,7 +1947,7 @@
           <w:noProof/>
         </w:rPr>
       </w:pPr>
-      <w:hyperlink w:anchor="_Toc242716482" w:history="1">
+      <w:hyperlink w:anchor="_Toc242718531" w:history="1">
         <w:r>
           <w:rPr>
             <w:rStyle w:val="Hyperlink"/>
@@ -1974,7 +1974,7 @@
             <w:noProof/>
             <w:webHidden/>
           </w:rPr>
-          <w:instrText xml:space="preserve"> PAGEREF _Toc242716482 \h </w:instrText>
+          <w:instrText xml:space="preserve"> PAGEREF _Toc242718531 \h </w:instrText>
         </w:r>
         <w:r>
           <w:rPr>
@@ -2015,7 +2015,7 @@
           <w:noProof/>
         </w:rPr>
       </w:pPr>
-      <w:hyperlink w:anchor="_Toc242716483" w:history="1">
+      <w:hyperlink w:anchor="_Toc242718532" w:history="1">
         <w:r>
           <w:rPr>
             <w:rStyle w:val="Hyperlink"/>
@@ -2042,7 +2042,7 @@
             <w:noProof/>
             <w:webHidden/>
           </w:rPr>
-          <w:instrText xml:space="preserve"> PAGEREF _Toc242716483 \h </w:instrText>
+          <w:instrText xml:space="preserve"> PAGEREF _Toc242718532 \h </w:instrText>
         </w:r>
         <w:r>
           <w:rPr>
@@ -2083,7 +2083,7 @@
           <w:noProof/>
         </w:rPr>
       </w:pPr>
-      <w:hyperlink w:anchor="_Toc242716484" w:history="1">
+      <w:hyperlink w:anchor="_Toc242718533" w:history="1">
         <w:r>
           <w:rPr>
             <w:rStyle w:val="Hyperlink"/>
@@ -2110,7 +2110,7 @@
             <w:noProof/>
             <w:webHidden/>
           </w:rPr>
-          <w:instrText xml:space="preserve"> PAGEREF _Toc242716484 \h </w:instrText>
+          <w:instrText xml:space="preserve"> PAGEREF _Toc242718533 \h </w:instrText>
         </w:r>
         <w:r>
           <w:rPr>
@@ -2151,7 +2151,7 @@
           <w:noProof/>
         </w:rPr>
       </w:pPr>
-      <w:hyperlink w:anchor="_Toc242716485" w:history="1">
+      <w:hyperlink w:anchor="_Toc242718534" w:history="1">
         <w:r>
           <w:rPr>
             <w:rStyle w:val="Hyperlink"/>
@@ -2178,7 +2178,7 @@
             <w:noProof/>
             <w:webHidden/>
           </w:rPr>
-          <w:instrText xml:space="preserve"> PAGEREF _Toc242716485 \h </w:instrText>
+          <w:instrText xml:space="preserve"> PAGEREF _Toc242718534 \h </w:instrText>
         </w:r>
         <w:r>
           <w:rPr>
@@ -2219,7 +2219,7 @@
           <w:noProof/>
         </w:rPr>
       </w:pPr>
-      <w:hyperlink w:anchor="_Toc242716486" w:history="1">
+      <w:hyperlink w:anchor="_Toc242718535" w:history="1">
         <w:r>
           <w:rPr>
             <w:rStyle w:val="Hyperlink"/>
@@ -2246,7 +2246,7 @@
             <w:noProof/>
             <w:webHidden/>
           </w:rPr>
-          <w:instrText xml:space="preserve"> PAGEREF _Toc242716486 \h </w:instrText>
+          <w:instrText xml:space="preserve"> PAGEREF _Toc242718535 \h </w:instrText>
         </w:r>
         <w:r>
           <w:rPr>
@@ -2287,7 +2287,7 @@
           <w:noProof/>
         </w:rPr>
       </w:pPr>
-      <w:hyperlink w:anchor="_Toc242716487" w:history="1">
+      <w:hyperlink w:anchor="_Toc242718536" w:history="1">
         <w:r>
           <w:rPr>
             <w:rStyle w:val="Hyperlink"/>
@@ -2314,7 +2314,7 @@
             <w:noProof/>
             <w:webHidden/>
           </w:rPr>
-          <w:instrText xml:space="preserve"> PAGEREF _Toc242716487 \h </w:instrText>
+          <w:instrText xml:space="preserve"> PAGEREF _Toc242718536 \h </w:instrText>
         </w:r>
         <w:r>
           <w:rPr>
@@ -2355,7 +2355,7 @@
           <w:noProof/>
         </w:rPr>
       </w:pPr>
-      <w:hyperlink w:anchor="_Toc242716488" w:history="1">
+      <w:hyperlink w:anchor="_Toc242718537" w:history="1">
         <w:r>
           <w:rPr>
             <w:rStyle w:val="Hyperlink"/>
@@ -2382,7 +2382,7 @@
             <w:noProof/>
             <w:webHidden/>
           </w:rPr>
-          <w:instrText xml:space="preserve"> PAGEREF _Toc242716488 \h </w:instrText>
+          <w:instrText xml:space="preserve"> PAGEREF _Toc242718537 \h </w:instrText>
         </w:r>
         <w:r>
           <w:rPr>
@@ -2423,7 +2423,7 @@
           <w:noProof/>
         </w:rPr>
       </w:pPr>
-      <w:hyperlink w:anchor="_Toc242716489" w:history="1">
+      <w:hyperlink w:anchor="_Toc242718538" w:history="1">
         <w:r>
           <w:rPr>
             <w:rStyle w:val="Hyperlink"/>
@@ -2450,7 +2450,7 @@
             <w:noProof/>
             <w:webHidden/>
           </w:rPr>
-          <w:instrText xml:space="preserve"> PAGEREF _Toc242716489 \h </w:instrText>
+          <w:instrText xml:space="preserve"> PAGEREF _Toc242718538 \h </w:instrText>
         </w:r>
         <w:r>
           <w:rPr>
@@ -2491,7 +2491,7 @@
           <w:noProof/>
         </w:rPr>
       </w:pPr>
-      <w:hyperlink w:anchor="_Toc242716490" w:history="1">
+      <w:hyperlink w:anchor="_Toc242718539" w:history="1">
         <w:r>
           <w:rPr>
             <w:rStyle w:val="Hyperlink"/>
@@ -2518,7 +2518,7 @@
             <w:noProof/>
             <w:webHidden/>
           </w:rPr>
-          <w:instrText xml:space="preserve"> PAGEREF _Toc242716490 \h </w:instrText>
+          <w:instrText xml:space="preserve"> PAGEREF _Toc242718539 \h </w:instrText>
         </w:r>
         <w:r>
           <w:rPr>
@@ -2559,7 +2559,7 @@
           <w:noProof/>
         </w:rPr>
       </w:pPr>
-      <w:hyperlink w:anchor="_Toc242716491" w:history="1">
+      <w:hyperlink w:anchor="_Toc242718540" w:history="1">
         <w:r>
           <w:rPr>
             <w:rStyle w:val="Hyperlink"/>
@@ -2586,7 +2586,7 @@
             <w:noProof/>
             <w:webHidden/>
           </w:rPr>
-          <w:instrText xml:space="preserve"> PAGEREF _Toc242716491 \h </w:instrText>
+          <w:instrText xml:space="preserve"> PAGEREF _Toc242718540 \h </w:instrText>
         </w:r>
         <w:r>
           <w:rPr>
@@ -2606,7 +2606,7 @@
             <w:noProof/>
             <w:webHidden/>
           </w:rPr>
-          <w:t>21</w:t>
+          <w:t>22</w:t>
         </w:r>
         <w:r>
           <w:rPr>
@@ -2627,7 +2627,7 @@
           <w:noProof/>
         </w:rPr>
       </w:pPr>
-      <w:hyperlink w:anchor="_Toc242716492" w:history="1">
+      <w:hyperlink w:anchor="_Toc242718541" w:history="1">
         <w:r>
           <w:rPr>
             <w:rStyle w:val="Hyperlink"/>
@@ -2654,7 +2654,7 @@
             <w:noProof/>
             <w:webHidden/>
           </w:rPr>
-          <w:instrText xml:space="preserve"> PAGEREF _Toc242716492 \h </w:instrText>
+          <w:instrText xml:space="preserve"> PAGEREF _Toc242718541 \h </w:instrText>
         </w:r>
         <w:r>
           <w:rPr>
@@ -2695,7 +2695,7 @@
           <w:noProof/>
         </w:rPr>
       </w:pPr>
-      <w:hyperlink w:anchor="_Toc242716493" w:history="1">
+      <w:hyperlink w:anchor="_Toc242718542" w:history="1">
         <w:r>
           <w:rPr>
             <w:rStyle w:val="Hyperlink"/>
@@ -2722,7 +2722,7 @@
             <w:noProof/>
             <w:webHidden/>
           </w:rPr>
-          <w:instrText xml:space="preserve"> PAGEREF _Toc242716493 \h </w:instrText>
+          <w:instrText xml:space="preserve"> PAGEREF _Toc242718542 \h </w:instrText>
         </w:r>
         <w:r>
           <w:rPr>
@@ -2763,7 +2763,7 @@
           <w:noProof/>
         </w:rPr>
       </w:pPr>
-      <w:hyperlink w:anchor="_Toc242716494" w:history="1">
+      <w:hyperlink w:anchor="_Toc242718543" w:history="1">
         <w:r>
           <w:rPr>
             <w:rStyle w:val="Hyperlink"/>
@@ -2790,7 +2790,7 @@
             <w:noProof/>
             <w:webHidden/>
           </w:rPr>
-          <w:instrText xml:space="preserve"> PAGEREF _Toc242716494 \h </w:instrText>
+          <w:instrText xml:space="preserve"> PAGEREF _Toc242718543 \h </w:instrText>
         </w:r>
         <w:r>
           <w:rPr>
@@ -2831,7 +2831,7 @@
           <w:noProof/>
         </w:rPr>
       </w:pPr>
-      <w:hyperlink w:anchor="_Toc242716495" w:history="1">
+      <w:hyperlink w:anchor="_Toc242718544" w:history="1">
         <w:r>
           <w:rPr>
             <w:rStyle w:val="Hyperlink"/>
@@ -2858,7 +2858,7 @@
             <w:noProof/>
             <w:webHidden/>
           </w:rPr>
-          <w:instrText xml:space="preserve"> PAGEREF _Toc242716495 \h </w:instrText>
+          <w:instrText xml:space="preserve"> PAGEREF _Toc242718544 \h </w:instrText>
         </w:r>
         <w:r>
           <w:rPr>
@@ -2899,7 +2899,7 @@
           <w:noProof/>
         </w:rPr>
       </w:pPr>
-      <w:hyperlink w:anchor="_Toc242716496" w:history="1">
+      <w:hyperlink w:anchor="_Toc242718545" w:history="1">
         <w:r>
           <w:rPr>
             <w:rStyle w:val="Hyperlink"/>
@@ -2926,7 +2926,7 @@
             <w:noProof/>
             <w:webHidden/>
           </w:rPr>
-          <w:instrText xml:space="preserve"> PAGEREF _Toc242716496 \h </w:instrText>
+          <w:instrText xml:space="preserve"> PAGEREF _Toc242718545 \h </w:instrText>
         </w:r>
         <w:r>
           <w:rPr>
@@ -2967,7 +2967,7 @@
           <w:noProof/>
         </w:rPr>
       </w:pPr>
-      <w:hyperlink w:anchor="_Toc242716497" w:history="1">
+      <w:hyperlink w:anchor="_Toc242718546" w:history="1">
         <w:r>
           <w:rPr>
             <w:rStyle w:val="Hyperlink"/>
@@ -2994,7 +2994,7 @@
             <w:noProof/>
             <w:webHidden/>
           </w:rPr>
-          <w:instrText xml:space="preserve"> PAGEREF _Toc242716497 \h </w:instrText>
+          <w:instrText xml:space="preserve"> PAGEREF _Toc242718546 \h </w:instrText>
         </w:r>
         <w:r>
           <w:rPr>
@@ -3035,7 +3035,7 @@
           <w:noProof/>
         </w:rPr>
       </w:pPr>
-      <w:hyperlink w:anchor="_Toc242716498" w:history="1">
+      <w:hyperlink w:anchor="_Toc242718547" w:history="1">
         <w:r>
           <w:rPr>
             <w:rStyle w:val="Hyperlink"/>
@@ -3062,7 +3062,7 @@
             <w:noProof/>
             <w:webHidden/>
           </w:rPr>
-          <w:instrText xml:space="preserve"> PAGEREF _Toc242716498 \h </w:instrText>
+          <w:instrText xml:space="preserve"> PAGEREF _Toc242718547 \h </w:instrText>
         </w:r>
         <w:r>
           <w:rPr>
@@ -3103,7 +3103,7 @@
           <w:noProof/>
         </w:rPr>
       </w:pPr>
-      <w:hyperlink w:anchor="_Toc242716499" w:history="1">
+      <w:hyperlink w:anchor="_Toc242718548" w:history="1">
         <w:r>
           <w:rPr>
             <w:rStyle w:val="Hyperlink"/>
@@ -3130,7 +3130,7 @@
             <w:noProof/>
             <w:webHidden/>
           </w:rPr>
-          <w:instrText xml:space="preserve"> PAGEREF _Toc242716499 \h </w:instrText>
+          <w:instrText xml:space="preserve"> PAGEREF _Toc242718548 \h </w:instrText>
         </w:r>
         <w:r>
           <w:rPr>
@@ -3171,7 +3171,7 @@
           <w:noProof/>
         </w:rPr>
       </w:pPr>
-      <w:hyperlink w:anchor="_Toc242716500" w:history="1">
+      <w:hyperlink w:anchor="_Toc242718549" w:history="1">
         <w:r>
           <w:rPr>
             <w:rStyle w:val="Hyperlink"/>
@@ -3198,7 +3198,7 @@
             <w:noProof/>
             <w:webHidden/>
           </w:rPr>
-          <w:instrText xml:space="preserve"> PAGEREF _Toc242716500 \h </w:instrText>
+          <w:instrText xml:space="preserve"> PAGEREF _Toc242718549 \h </w:instrText>
         </w:r>
         <w:r>
           <w:rPr>
@@ -3239,7 +3239,7 @@
           <w:noProof/>
         </w:rPr>
       </w:pPr>
-      <w:hyperlink w:anchor="_Toc242716501" w:history="1">
+      <w:hyperlink w:anchor="_Toc242718550" w:history="1">
         <w:r>
           <w:rPr>
             <w:rStyle w:val="Hyperlink"/>
@@ -3266,7 +3266,7 @@
             <w:noProof/>
             <w:webHidden/>
           </w:rPr>
-          <w:instrText xml:space="preserve"> PAGEREF _Toc242716501 \h </w:instrText>
+          <w:instrText xml:space="preserve"> PAGEREF _Toc242718550 \h </w:instrText>
         </w:r>
         <w:r>
           <w:rPr>
@@ -3307,7 +3307,7 @@
           <w:noProof/>
         </w:rPr>
       </w:pPr>
-      <w:hyperlink w:anchor="_Toc242716502" w:history="1">
+      <w:hyperlink w:anchor="_Toc242718551" w:history="1">
         <w:r>
           <w:rPr>
             <w:rStyle w:val="Hyperlink"/>
@@ -3334,7 +3334,7 @@
             <w:noProof/>
             <w:webHidden/>
           </w:rPr>
-          <w:instrText xml:space="preserve"> PAGEREF _Toc242716502 \h </w:instrText>
+          <w:instrText xml:space="preserve"> PAGEREF _Toc242718551 \h </w:instrText>
         </w:r>
         <w:r>
           <w:rPr>
@@ -3375,7 +3375,7 @@
           <w:noProof/>
         </w:rPr>
       </w:pPr>
-      <w:hyperlink w:anchor="_Toc242716503" w:history="1">
+      <w:hyperlink w:anchor="_Toc242718552" w:history="1">
         <w:r>
           <w:rPr>
             <w:rStyle w:val="Hyperlink"/>
@@ -3402,7 +3402,7 @@
             <w:noProof/>
             <w:webHidden/>
           </w:rPr>
-          <w:instrText xml:space="preserve"> PAGEREF _Toc242716503 \h </w:instrText>
+          <w:instrText xml:space="preserve"> PAGEREF _Toc242718552 \h </w:instrText>
         </w:r>
         <w:r>
           <w:rPr>
@@ -3443,7 +3443,7 @@
           <w:noProof/>
         </w:rPr>
       </w:pPr>
-      <w:hyperlink w:anchor="_Toc242716504" w:history="1">
+      <w:hyperlink w:anchor="_Toc242718553" w:history="1">
         <w:r>
           <w:rPr>
             <w:rStyle w:val="Hyperlink"/>
@@ -3470,7 +3470,7 @@
             <w:noProof/>
             <w:webHidden/>
           </w:rPr>
-          <w:instrText xml:space="preserve"> PAGEREF _Toc242716504 \h </w:instrText>
+          <w:instrText xml:space="preserve"> PAGEREF _Toc242718553 \h </w:instrText>
         </w:r>
         <w:r>
           <w:rPr>
@@ -3511,7 +3511,7 @@
           <w:noProof/>
         </w:rPr>
       </w:pPr>
-      <w:hyperlink w:anchor="_Toc242716505" w:history="1">
+      <w:hyperlink w:anchor="_Toc242718554" w:history="1">
         <w:r>
           <w:rPr>
             <w:rStyle w:val="Hyperlink"/>
@@ -3538,7 +3538,7 @@
             <w:noProof/>
             <w:webHidden/>
           </w:rPr>
-          <w:instrText xml:space="preserve"> PAGEREF _Toc242716505 \h </w:instrText>
+          <w:instrText xml:space="preserve"> PAGEREF _Toc242718554 \h </w:instrText>
         </w:r>
         <w:r>
           <w:rPr>
@@ -3579,7 +3579,7 @@
           <w:noProof/>
         </w:rPr>
       </w:pPr>
-      <w:hyperlink w:anchor="_Toc242716506" w:history="1">
+      <w:hyperlink w:anchor="_Toc242718555" w:history="1">
         <w:r>
           <w:rPr>
             <w:rStyle w:val="Hyperlink"/>
@@ -3606,7 +3606,7 @@
             <w:noProof/>
             <w:webHidden/>
           </w:rPr>
-          <w:instrText xml:space="preserve"> PAGEREF _Toc242716506 \h </w:instrText>
+          <w:instrText xml:space="preserve"> PAGEREF _Toc242718555 \h </w:instrText>
         </w:r>
         <w:r>
           <w:rPr>
@@ -3647,7 +3647,7 @@
           <w:noProof/>
         </w:rPr>
       </w:pPr>
-      <w:hyperlink w:anchor="_Toc242716507" w:history="1">
+      <w:hyperlink w:anchor="_Toc242718556" w:history="1">
         <w:r>
           <w:rPr>
             <w:rStyle w:val="Hyperlink"/>
@@ -3674,7 +3674,7 @@
             <w:noProof/>
             <w:webHidden/>
           </w:rPr>
-          <w:instrText xml:space="preserve"> PAGEREF _Toc242716507 \h </w:instrText>
+          <w:instrText xml:space="preserve"> PAGEREF _Toc242718556 \h </w:instrText>
         </w:r>
         <w:r>
           <w:rPr>
@@ -3714,7 +3714,7 @@
       <w:pPr>
         <w:pStyle w:val="Heading1"/>
       </w:pPr>
-      <w:bookmarkStart w:id="1" w:name="_Toc242716460"/>
+      <w:bookmarkStart w:id="1" w:name="_Toc242718509"/>
       <w:r>
         <w:t>Step 01 – What sbom-fixer does</w:t>
       </w:r>
@@ -4529,7 +4529,7 @@
       <w:pPr>
         <w:pStyle w:val="Heading1"/>
       </w:pPr>
-      <w:bookmarkStart w:id="2" w:name="_Toc242716461"/>
+      <w:bookmarkStart w:id="2" w:name="_Toc242718510"/>
       <w:r>
         <w:lastRenderedPageBreak/>
         <w:t>Step 02 – Check the prerequisites on the new machine</w:t>
@@ -5089,7 +5089,7 @@
       <w:pPr>
         <w:pStyle w:val="Heading1"/>
       </w:pPr>
-      <w:bookmarkStart w:id="3" w:name="_Toc242716462"/>
+      <w:bookmarkStart w:id="3" w:name="_Toc242718511"/>
       <w:r>
         <w:t>Step 03 – Get the code onto the machine</w:t>
       </w:r>
@@ -5338,7 +5338,7 @@
       <w:pPr>
         <w:pStyle w:val="Heading1"/>
       </w:pPr>
-      <w:bookmarkStart w:id="4" w:name="_Toc242716463"/>
+      <w:bookmarkStart w:id="4" w:name="_Toc242718512"/>
       <w:r>
         <w:t>Step 04 – Install on Windows</w:t>
       </w:r>
@@ -5348,7 +5348,7 @@
       <w:pPr>
         <w:pStyle w:val="Heading2"/>
       </w:pPr>
-      <w:bookmarkStart w:id="5" w:name="_Toc242716464"/>
+      <w:bookmarkStart w:id="5" w:name="_Toc242718513"/>
       <w:r>
         <w:t>4.1 Open a terminal in the folder</w:t>
       </w:r>
@@ -5386,7 +5386,7 @@
       <w:pPr>
         <w:pStyle w:val="Heading2"/>
       </w:pPr>
-      <w:bookmarkStart w:id="6" w:name="_Toc242716465"/>
+      <w:bookmarkStart w:id="6" w:name="_Toc242718514"/>
       <w:r>
         <w:t>4.2 Create a virtual environment</w:t>
       </w:r>
@@ -5425,7 +5425,7 @@
       <w:pPr>
         <w:pStyle w:val="Heading2"/>
       </w:pPr>
-      <w:bookmarkStart w:id="7" w:name="_Toc242716466"/>
+      <w:bookmarkStart w:id="7" w:name="_Toc242718515"/>
       <w:r>
         <w:t>4.3 Activate it</w:t>
       </w:r>
@@ -5464,7 +5464,7 @@
       <w:pPr>
         <w:pStyle w:val="Heading2"/>
       </w:pPr>
-      <w:bookmarkStart w:id="8" w:name="_Toc242716467"/>
+      <w:bookmarkStart w:id="8" w:name="_Toc242718516"/>
       <w:r>
         <w:t>4.4 Install the tool</w:t>
       </w:r>
@@ -5517,7 +5517,7 @@
       <w:pPr>
         <w:pStyle w:val="Heading2"/>
       </w:pPr>
-      <w:bookmarkStart w:id="9" w:name="_Toc242716468"/>
+      <w:bookmarkStart w:id="9" w:name="_Toc242718517"/>
       <w:r>
         <w:t>4.5 Activation in other terminals</w:t>
       </w:r>
@@ -5745,7 +5745,7 @@
       <w:pPr>
         <w:pStyle w:val="Heading2"/>
       </w:pPr>
-      <w:bookmarkStart w:id="10" w:name="_Toc242716469"/>
+      <w:bookmarkStart w:id="10" w:name="_Toc242718518"/>
       <w:r>
         <w:t>4.6 Offline install (machine without internet)</w:t>
       </w:r>
@@ -5879,7 +5879,7 @@
       <w:pPr>
         <w:pStyle w:val="Heading2"/>
       </w:pPr>
-      <w:bookmarkStart w:id="11" w:name="_Toc242716470"/>
+      <w:bookmarkStart w:id="11" w:name="_Toc242718519"/>
       <w:r>
         <w:t>4.7 Make the command available everywhere (optional)</w:t>
       </w:r>
@@ -5929,7 +5929,7 @@
       <w:pPr>
         <w:pStyle w:val="Heading1"/>
       </w:pPr>
-      <w:bookmarkStart w:id="12" w:name="_Toc242716471"/>
+      <w:bookmarkStart w:id="12" w:name="_Toc242718520"/>
       <w:r>
         <w:t>Step 05 – Install on Linux or macOS</w:t>
       </w:r>
@@ -6053,7 +6053,7 @@
       <w:pPr>
         <w:pStyle w:val="Heading1"/>
       </w:pPr>
-      <w:bookmarkStart w:id="13" w:name="_Toc242716472"/>
+      <w:bookmarkStart w:id="13" w:name="_Toc242718521"/>
       <w:r>
         <w:t>Step 06 – Install with Docker (no Python needed)</w:t>
       </w:r>
@@ -6265,7 +6265,7 @@
       <w:pPr>
         <w:pStyle w:val="Heading1"/>
       </w:pPr>
-      <w:bookmarkStart w:id="14" w:name="_Toc242716473"/>
+      <w:bookmarkStart w:id="14" w:name="_Toc242718522"/>
       <w:r>
         <w:t>Step 07 – Verify the installation</w:t>
       </w:r>
@@ -6548,7 +6548,7 @@
       <w:pPr>
         <w:pStyle w:val="Heading1"/>
       </w:pPr>
-      <w:bookmarkStart w:id="15" w:name="_Toc242716474"/>
+      <w:bookmarkStart w:id="15" w:name="_Toc242718523"/>
       <w:r>
         <w:t>Step 08 – Daily workflow: fix an SBOM step by step</w:t>
       </w:r>
@@ -6558,7 +6558,7 @@
       <w:pPr>
         <w:pStyle w:val="Heading2"/>
       </w:pPr>
-      <w:bookmarkStart w:id="16" w:name="_Toc242716475"/>
+      <w:bookmarkStart w:id="16" w:name="_Toc242718524"/>
       <w:r>
         <w:t>8.1 Generate the SBOM with your normal tool</w:t>
       </w:r>
@@ -6632,7 +6632,7 @@
       <w:pPr>
         <w:pStyle w:val="Heading2"/>
       </w:pPr>
-      <w:bookmarkStart w:id="17" w:name="_Toc242716476"/>
+      <w:bookmarkStart w:id="17" w:name="_Toc242718525"/>
       <w:r>
         <w:t>8.2 Fix the file</w:t>
       </w:r>
@@ -6683,6 +6683,20 @@
           <w:sz w:val="17"/>
         </w:rPr>
         <w:t xml:space="preserve">  original   : 0 schema error(s)</w:t>
+      </w:r>
+    </w:p>
+    <w:p>
+      <w:pPr>
+        <w:shd w:val="clear" w:color="auto" w:fill="F2F2F2"/>
+        <w:spacing w:after="0"/>
+        <w:ind w:left="170"/>
+      </w:pPr>
+      <w:r>
+        <w:rPr>
+          <w:rFonts w:ascii="Consolas" w:hAnsi="Consolas"/>
+          <w:sz w:val="17"/>
+        </w:rPr>
+        <w:t xml:space="preserve">  ntia       : original FAIL - supplier 72/320, author missing</w:t>
       </w:r>
     </w:p>
     <w:p>
@@ -7347,7 +7361,7 @@
       <w:pPr>
         <w:pStyle w:val="Heading2"/>
       </w:pPr>
-      <w:bookmarkStart w:id="18" w:name="_Toc242716477"/>
+      <w:bookmarkStart w:id="18" w:name="_Toc242718526"/>
       <w:r>
         <w:t>8.3 Read the exit code</w:t>
       </w:r>
@@ -7520,7 +7534,7 @@
       <w:pPr>
         <w:pStyle w:val="Heading2"/>
       </w:pPr>
-      <w:bookmarkStart w:id="19" w:name="_Toc242716478"/>
+      <w:bookmarkStart w:id="19" w:name="_Toc242718527"/>
       <w:r>
         <w:t>8.4 Read the two Markdown files</w:t>
       </w:r>
@@ -7565,7 +7579,7 @@
       <w:pPr>
         <w:pStyle w:val="Heading2"/>
       </w:pPr>
-      <w:bookmarkStart w:id="20" w:name="_Toc242716479"/>
+      <w:bookmarkStart w:id="20" w:name="_Toc242718528"/>
       <w:r>
         <w:t>8.5 Upload to Checkmarx</w:t>
       </w:r>
@@ -7629,7 +7643,7 @@
       <w:pPr>
         <w:pStyle w:val="Heading2"/>
       </w:pPr>
-      <w:bookmarkStart w:id="21" w:name="_Toc242716480"/>
+      <w:bookmarkStart w:id="21" w:name="_Toc242718529"/>
       <w:r>
         <w:t>8.6 Keep the original</w:t>
       </w:r>
@@ -7644,7 +7658,7 @@
       <w:pPr>
         <w:pStyle w:val="Heading2"/>
       </w:pPr>
-      <w:bookmarkStart w:id="22" w:name="_Toc242716481"/>
+      <w:bookmarkStart w:id="22" w:name="_Toc242718530"/>
       <w:r>
         <w:t>8.7 Fill every schema field (any JSON)</w:t>
       </w:r>
@@ -8241,7 +8255,7 @@
       <w:pPr>
         <w:pStyle w:val="Heading1"/>
       </w:pPr>
-      <w:bookmarkStart w:id="23" w:name="_Toc242716482"/>
+      <w:bookmarkStart w:id="23" w:name="_Toc242718531"/>
       <w:r>
         <w:t>Step 09 – Understand the output files</w:t>
       </w:r>
@@ -8579,7 +8593,7 @@
               <w:rPr>
                 <w:sz w:val="18"/>
               </w:rPr>
-              <w:t>Input (format, version, generator, component count), output (version, component and dependency counts), the tool name chosen and why, change counts, original schema errors, exit code, NTIA result and sbomqs score</w:t>
+              <w:t>Input (format, version, generator, component count), output (version, component and dependency counts), the tool name chosen and why, change counts, original schema errors, exit code, NTIA result of the original and of the corrected file, sbomqs score</w:t>
             </w:r>
           </w:p>
         </w:tc>
@@ -8598,7 +8612,7 @@
               <w:rPr>
                 <w:sz w:val="18"/>
               </w:rPr>
-              <w:t>What was done</w:t>
+              <w:t>NTIA minimum elements</w:t>
             </w:r>
           </w:p>
         </w:tc>
@@ -8612,7 +8626,15 @@
               <w:rPr>
                 <w:sz w:val="18"/>
               </w:rPr>
-              <w:t>The three steps: conversion notes, the schema errors of the converted file grouped by cause, the output layout</w:t>
+              <w:t xml:space="preserve">The seven NTIA elements for the original and the corrected file, for example </w:t>
+            </w:r>
+            <w:r>
+              <w:rPr>
+                <w:rFonts w:ascii="Consolas" w:hAnsi="Consolas"/>
+                <w:color w:val="8B1A1A"/>
+                <w:sz w:val="18"/>
+              </w:rPr>
+              <w:t>Supplier name 72 / 320 ✗</w:t>
             </w:r>
           </w:p>
         </w:tc>
@@ -8630,7 +8652,7 @@
               <w:rPr>
                 <w:sz w:val="18"/>
               </w:rPr>
-              <w:t>Changes by rule</w:t>
+              <w:t>What was done</w:t>
             </w:r>
           </w:p>
         </w:tc>
@@ -8643,33 +8665,7 @@
               <w:rPr>
                 <w:sz w:val="18"/>
               </w:rPr>
-              <w:t xml:space="preserve">One row per rule: what it does, kind, count and an example. Kind </w:t>
-            </w:r>
-            <w:r>
-              <w:rPr>
-                <w:b/>
-                <w:sz w:val="18"/>
-              </w:rPr>
-              <w:t>fix</w:t>
-            </w:r>
-            <w:r>
-              <w:rPr>
-                <w:sz w:val="18"/>
-              </w:rPr>
-              <w:t xml:space="preserve"> = a problem of the input that was repaired; </w:t>
-            </w:r>
-            <w:r>
-              <w:rPr>
-                <w:b/>
-                <w:sz w:val="18"/>
-              </w:rPr>
-              <w:t>layout</w:t>
-            </w:r>
-            <w:r>
-              <w:rPr>
-                <w:sz w:val="18"/>
-              </w:rPr>
-              <w:t xml:space="preserve"> = reshaped for Checkmarx (data Checkmarx does not read is dropped from this copy only)</w:t>
+              <w:t>The three steps: conversion notes, the schema errors of the converted file grouped by cause, the output layout</w:t>
             </w:r>
           </w:p>
         </w:tc>
@@ -8688,6 +8684,64 @@
               <w:rPr>
                 <w:sz w:val="18"/>
               </w:rPr>
+              <w:t>Changes by rule</w:t>
+            </w:r>
+          </w:p>
+        </w:tc>
+        <w:tc>
+          <w:tcPr>
+            <w:tcW w:w="4819" w:type="dxa"/>
+            <w:shd w:val="clear" w:color="auto" w:fill="F2F6FA"/>
+          </w:tcPr>
+          <w:p>
+            <w:r>
+              <w:rPr>
+                <w:sz w:val="18"/>
+              </w:rPr>
+              <w:t xml:space="preserve">One row per rule: what it does, kind, count and an example. Kind </w:t>
+            </w:r>
+            <w:r>
+              <w:rPr>
+                <w:b/>
+                <w:sz w:val="18"/>
+              </w:rPr>
+              <w:t>fix</w:t>
+            </w:r>
+            <w:r>
+              <w:rPr>
+                <w:sz w:val="18"/>
+              </w:rPr>
+              <w:t xml:space="preserve"> = a problem of the input that was repaired; </w:t>
+            </w:r>
+            <w:r>
+              <w:rPr>
+                <w:b/>
+                <w:sz w:val="18"/>
+              </w:rPr>
+              <w:t>layout</w:t>
+            </w:r>
+            <w:r>
+              <w:rPr>
+                <w:sz w:val="18"/>
+              </w:rPr>
+              <w:t xml:space="preserve"> = reshaped for Checkmarx (data Checkmarx does not read is dropped from this copy only)</w:t>
+            </w:r>
+          </w:p>
+        </w:tc>
+      </w:tr>
+      <w:tr>
+        <w:trPr>
+          <w:jc w:val="center"/>
+        </w:trPr>
+        <w:tc>
+          <w:tcPr>
+            <w:tcW w:w="4819" w:type="dxa"/>
+          </w:tcPr>
+          <w:p>
+            <w:r>
+              <w:rPr>
+                <w:sz w:val="18"/>
+              </w:rPr>
               <w:t>Not changed (findings)</w:t>
             </w:r>
           </w:p>
@@ -8695,7 +8749,6 @@
         <w:tc>
           <w:tcPr>
             <w:tcW w:w="4819" w:type="dxa"/>
-            <w:shd w:val="clear" w:color="auto" w:fill="F2F6FA"/>
           </w:tcPr>
           <w:p>
             <w:r>
@@ -9055,11 +9108,161 @@
           </w:p>
         </w:tc>
       </w:tr>
+      <w:tr>
+        <w:trPr>
+          <w:jc w:val="center"/>
+        </w:trPr>
+        <w:tc>
+          <w:tcPr>
+            <w:tcW w:w="1928" w:type="dxa"/>
+            <w:shd w:val="clear" w:color="auto" w:fill="F2F6FA"/>
+          </w:tcPr>
+          <w:p>
+            <w:r>
+              <w:rPr>
+                <w:sz w:val="18"/>
+              </w:rPr>
+              <w:t>4</w:t>
+            </w:r>
+          </w:p>
+        </w:tc>
+        <w:tc>
+          <w:tcPr>
+            <w:tcW w:w="1928" w:type="dxa"/>
+            <w:shd w:val="clear" w:color="auto" w:fill="F2F6FA"/>
+          </w:tcPr>
+          <w:p>
+            <w:r>
+              <w:rPr>
+                <w:sz w:val="18"/>
+              </w:rPr>
+              <w:t>No supplier (NTIA)</w:t>
+            </w:r>
+          </w:p>
+        </w:tc>
+        <w:tc>
+          <w:tcPr>
+            <w:tcW w:w="1928" w:type="dxa"/>
+            <w:shd w:val="clear" w:color="auto" w:fill="F2F6FA"/>
+          </w:tcPr>
+          <w:p>
+            <w:r>
+              <w:rPr>
+                <w:sz w:val="18"/>
+              </w:rPr>
+              <w:t>248 of 320</w:t>
+            </w:r>
+          </w:p>
+        </w:tc>
+        <w:tc>
+          <w:tcPr>
+            <w:tcW w:w="1928" w:type="dxa"/>
+            <w:shd w:val="clear" w:color="auto" w:fill="F2F6FA"/>
+          </w:tcPr>
+          <w:p>
+            <w:r>
+              <w:rPr>
+                <w:sz w:val="18"/>
+              </w:rPr>
+              <w:t>bean-matchers@0.13, lucene-sandbox@7.5.0, ... +243 more</w:t>
+            </w:r>
+          </w:p>
+        </w:tc>
+        <w:tc>
+          <w:tcPr>
+            <w:tcW w:w="1928" w:type="dxa"/>
+            <w:shd w:val="clear" w:color="auto" w:fill="F2F6FA"/>
+          </w:tcPr>
+          <w:p>
+            <w:r>
+              <w:rPr>
+                <w:sz w:val="18"/>
+              </w:rPr>
+              <w:t>Let the generator write the supplier of every package (from the package metadata: the organization element of the pom, authors in the nuspec or package.json); for own libraries set your company.</w:t>
+            </w:r>
+          </w:p>
+        </w:tc>
+      </w:tr>
+      <w:tr>
+        <w:trPr>
+          <w:jc w:val="center"/>
+        </w:trPr>
+        <w:tc>
+          <w:tcPr>
+            <w:tcW w:w="1928" w:type="dxa"/>
+          </w:tcPr>
+          <w:p>
+            <w:r>
+              <w:rPr>
+                <w:sz w:val="18"/>
+              </w:rPr>
+              <w:t>5</w:t>
+            </w:r>
+          </w:p>
+        </w:tc>
+        <w:tc>
+          <w:tcPr>
+            <w:tcW w:w="1928" w:type="dxa"/>
+          </w:tcPr>
+          <w:p>
+            <w:r>
+              <w:rPr>
+                <w:sz w:val="18"/>
+              </w:rPr>
+              <w:t>No SBOM author (NTIA)</w:t>
+            </w:r>
+          </w:p>
+        </w:tc>
+        <w:tc>
+          <w:tcPr>
+            <w:tcW w:w="1928" w:type="dxa"/>
+          </w:tcPr>
+          <w:p>
+            <w:r>
+              <w:rPr>
+                <w:sz w:val="18"/>
+              </w:rPr>
+              <w:t>-</w:t>
+            </w:r>
+          </w:p>
+        </w:tc>
+        <w:tc>
+          <w:tcPr>
+            <w:tcW w:w="1928" w:type="dxa"/>
+          </w:tcPr>
+          <w:p>
+            <w:r>
+              <w:rPr>
+                <w:sz w:val="18"/>
+              </w:rPr>
+              <w:t>-</w:t>
+            </w:r>
+          </w:p>
+        </w:tc>
+        <w:tc>
+          <w:tcPr>
+            <w:tcW w:w="1928" w:type="dxa"/>
+          </w:tcPr>
+          <w:p>
+            <w:r>
+              <w:rPr>
+                <w:sz w:val="18"/>
+              </w:rPr>
+              <w:t>Set metadata.authors (CycloneDX) or a Person/Organization creator (SPDX) to the team that produced the SBOM.</w:t>
+            </w:r>
+          </w:p>
+        </w:tc>
+      </w:tr>
     </w:tbl>
     <w:p/>
     <w:p>
       <w:r>
-        <w:t>Schema errors of the original come first (grouped by cause), then the data problems, then pipeline hints. A problem</w:t>
+        <w:t>Schema errors of the original come first (grouped by cause), then the data problems, then the NTIA minimum</w:t>
+      </w:r>
+    </w:p>
+    <w:p>
+      <w:r>
+        <w:t>elements the original misses, then pipeline hints. A problem</w:t>
       </w:r>
     </w:p>
     <w:p>
@@ -9310,7 +9513,7 @@
       <w:pPr>
         <w:pStyle w:val="Heading1"/>
       </w:pPr>
-      <w:bookmarkStart w:id="24" w:name="_Toc242716483"/>
+      <w:bookmarkStart w:id="24" w:name="_Toc242718532"/>
       <w:r>
         <w:t>Step 10 – Exit codes and what to do</w:t>
       </w:r>
@@ -9738,7 +9941,7 @@
       <w:pPr>
         <w:pStyle w:val="Heading1"/>
       </w:pPr>
-      <w:bookmarkStart w:id="25" w:name="_Toc242716484"/>
+      <w:bookmarkStart w:id="25" w:name="_Toc242718533"/>
       <w:r>
         <w:t>Step 11 – Profiles and configuration</w:t>
       </w:r>
@@ -11414,7 +11617,7 @@
       <w:pPr>
         <w:pStyle w:val="Heading1"/>
       </w:pPr>
-      <w:bookmarkStart w:id="26" w:name="_Toc242716485"/>
+      <w:bookmarkStart w:id="26" w:name="_Toc242718534"/>
       <w:r>
         <w:t>Step 12 – Checkmarx integration</w:t>
       </w:r>
@@ -11446,7 +11649,7 @@
       <w:pPr>
         <w:pStyle w:val="Heading2"/>
       </w:pPr>
-      <w:bookmarkStart w:id="27" w:name="_Toc242716486"/>
+      <w:bookmarkStart w:id="27" w:name="_Toc242718535"/>
       <w:r>
         <w:t>12.1 Set up once</w:t>
       </w:r>
@@ -11830,7 +12033,7 @@
       <w:pPr>
         <w:pStyle w:val="Heading2"/>
       </w:pPr>
-      <w:bookmarkStart w:id="28" w:name="_Toc242716487"/>
+      <w:bookmarkStart w:id="28" w:name="_Toc242718536"/>
       <w:r>
         <w:t>12.2 Upload and check a file</w:t>
       </w:r>
@@ -11881,7 +12084,7 @@
       <w:pPr>
         <w:pStyle w:val="Heading1"/>
       </w:pPr>
-      <w:bookmarkStart w:id="29" w:name="_Toc242716488"/>
+      <w:bookmarkStart w:id="29" w:name="_Toc242718537"/>
       <w:r>
         <w:t>Step 13 – Quality audit (NTIA and sbomqs)</w:t>
       </w:r>
@@ -11896,7 +12099,74 @@
         <w:t>fix</w:t>
       </w:r>
       <w:r>
-        <w:t xml:space="preserve"> audits the corrected file and writes the result into the tech notes summary: NTIA minimum elements (supplier, component name, version, unique identifier, dependencies, SBOM author, timestamp) and the sbomqs score (0 to 10). </w:t>
+        <w:t xml:space="preserve"> checks the NTIA minimum elements (supplier, component name, version, unique identifier, dependencies, SBOM author, timestamp) of the </w:t>
+      </w:r>
+      <w:r>
+        <w:rPr>
+          <w:b/>
+        </w:rPr>
+        <w:t>original</w:t>
+      </w:r>
+      <w:r>
+        <w:t xml:space="preserve"> and of the </w:t>
+      </w:r>
+      <w:r>
+        <w:rPr>
+          <w:b/>
+        </w:rPr>
+        <w:t>corrected</w:t>
+      </w:r>
+      <w:r>
+        <w:t xml:space="preserve"> file:</w:t>
+      </w:r>
+    </w:p>
+    <w:p>
+      <w:pPr>
+        <w:pStyle w:val="ListBullet"/>
+      </w:pPr>
+      <w:r>
+        <w:t xml:space="preserve">console: </w:t>
+      </w:r>
+      <w:r>
+        <w:rPr>
+          <w:rFonts w:ascii="Consolas" w:hAnsi="Consolas"/>
+          <w:color w:val="8B1A1A"/>
+        </w:rPr>
+        <w:t>ntia : original FAIL - supplier 72/320, author missing</w:t>
+      </w:r>
+      <w:r>
+        <w:t xml:space="preserve"> (or </w:t>
+      </w:r>
+      <w:r>
+        <w:rPr>
+          <w:rFonts w:ascii="Consolas" w:hAnsi="Consolas"/>
+          <w:color w:val="8B1A1A"/>
+        </w:rPr>
+        <w:t>PASS</w:t>
+      </w:r>
+      <w:r>
+        <w:t>);</w:t>
+      </w:r>
+    </w:p>
+    <w:p>
+      <w:pPr>
+        <w:pStyle w:val="ListBullet"/>
+      </w:pPr>
+      <w:r>
+        <w:t>suggestions: one row per missing element, with the count, the components and the fix (for example "No supplier (NTIA) | 248 of 320 | bean-matchers@0.13, ...");</w:t>
+      </w:r>
+    </w:p>
+    <w:p>
+      <w:pPr>
+        <w:pStyle w:val="ListBullet"/>
+      </w:pPr>
+      <w:r>
+        <w:t>tech notes: the summary lines and a table of the seven elements, original next to corrected.</w:t>
+      </w:r>
+    </w:p>
+    <w:p>
+      <w:r>
+        <w:t xml:space="preserve">The NTIA check is built in and always runs. The sbomqs score (0 to 10) of the corrected file is added to the tech notes; </w:t>
       </w:r>
       <w:r>
         <w:rPr>
@@ -11906,7 +12176,7 @@
         <w:t>--no-audit</w:t>
       </w:r>
       <w:r>
-        <w:t xml:space="preserve"> skips it.</w:t>
+        <w:t xml:space="preserve"> skips sbomqs.</w:t>
       </w:r>
     </w:p>
     <w:p>
@@ -11956,7 +12226,7 @@
       <w:pPr>
         <w:pStyle w:val="Heading2"/>
       </w:pPr>
-      <w:bookmarkStart w:id="30" w:name="_Toc242716489"/>
+      <w:bookmarkStart w:id="30" w:name="_Toc242718538"/>
       <w:r>
         <w:t>13.1 sbomqs is bundled in the repository</w:t>
       </w:r>
@@ -12257,7 +12527,7 @@
       <w:pPr>
         <w:pStyle w:val="Heading2"/>
       </w:pPr>
-      <w:bookmarkStart w:id="31" w:name="_Toc242716490"/>
+      <w:bookmarkStart w:id="31" w:name="_Toc242718539"/>
       <w:r>
         <w:t>13.2 How sbom-fixer finds sbomqs</w:t>
       </w:r>
@@ -12559,7 +12829,7 @@
       <w:pPr>
         <w:pStyle w:val="Heading2"/>
       </w:pPr>
-      <w:bookmarkStart w:id="32" w:name="_Toc242716491"/>
+      <w:bookmarkStart w:id="32" w:name="_Toc242718540"/>
       <w:r>
         <w:t>13.3 Use sbomqs directly</w:t>
       </w:r>
@@ -12679,7 +12949,7 @@
       <w:pPr>
         <w:pStyle w:val="Heading2"/>
       </w:pPr>
-      <w:bookmarkStart w:id="33" w:name="_Toc242716492"/>
+      <w:bookmarkStart w:id="33" w:name="_Toc242718541"/>
       <w:r>
         <w:t>13.4 Check that the bundled copy is genuine</w:t>
       </w:r>
@@ -12762,7 +13032,7 @@
       <w:pPr>
         <w:pStyle w:val="Heading2"/>
       </w:pPr>
-      <w:bookmarkStart w:id="34" w:name="_Toc242716493"/>
+      <w:bookmarkStart w:id="34" w:name="_Toc242718542"/>
       <w:r>
         <w:t>13.5 When there is no score</w:t>
       </w:r>
@@ -13003,7 +13273,7 @@
       <w:pPr>
         <w:pStyle w:val="Heading1"/>
       </w:pPr>
-      <w:bookmarkStart w:id="35" w:name="_Toc242716494"/>
+      <w:bookmarkStart w:id="35" w:name="_Toc242718543"/>
       <w:r>
         <w:t>Step 14 – Use in Jenkins</w:t>
       </w:r>
@@ -13117,7 +13387,7 @@
       <w:pPr>
         <w:pStyle w:val="Heading1"/>
       </w:pPr>
-      <w:bookmarkStart w:id="36" w:name="_Toc242716495"/>
+      <w:bookmarkStart w:id="36" w:name="_Toc242718544"/>
       <w:r>
         <w:t>Step 15 – Rule reference</w:t>
       </w:r>
@@ -13127,7 +13397,7 @@
       <w:pPr>
         <w:pStyle w:val="Heading2"/>
       </w:pPr>
-      <w:bookmarkStart w:id="37" w:name="_Toc242716496"/>
+      <w:bookmarkStart w:id="37" w:name="_Toc242718545"/>
       <w:r>
         <w:t>15.1 How to read a rule ID</w:t>
       </w:r>
@@ -13701,7 +13971,7 @@
       <w:pPr>
         <w:pStyle w:val="Heading2"/>
       </w:pPr>
-      <w:bookmarkStart w:id="38" w:name="_Toc242716497"/>
+      <w:bookmarkStart w:id="38" w:name="_Toc242718546"/>
       <w:r>
         <w:t>15.2 Rules every rule follows</w:t>
       </w:r>
@@ -13805,7 +14075,7 @@
       <w:pPr>
         <w:pStyle w:val="Heading2"/>
       </w:pPr>
-      <w:bookmarkStart w:id="39" w:name="_Toc242716498"/>
+      <w:bookmarkStart w:id="39" w:name="_Toc242718547"/>
       <w:r>
         <w:t>15.3 Where the rules come from</w:t>
       </w:r>
@@ -14052,7 +14322,7 @@
       <w:pPr>
         <w:pStyle w:val="Heading2"/>
       </w:pPr>
-      <w:bookmarkStart w:id="40" w:name="_Toc242716499"/>
+      <w:bookmarkStart w:id="40" w:name="_Toc242718548"/>
       <w:r>
         <w:t>15.4 All rules</w:t>
       </w:r>
@@ -21810,7 +22080,7 @@
       <w:pPr>
         <w:pStyle w:val="Heading1"/>
       </w:pPr>
-      <w:bookmarkStart w:id="41" w:name="_Toc242716500"/>
+      <w:bookmarkStart w:id="41" w:name="_Toc242718549"/>
       <w:r>
         <w:t>Step 16 – Troubleshooting</w:t>
       </w:r>
@@ -23242,7 +23512,7 @@
       <w:pPr>
         <w:pStyle w:val="Heading1"/>
       </w:pPr>
-      <w:bookmarkStart w:id="42" w:name="_Toc242716501"/>
+      <w:bookmarkStart w:id="42" w:name="_Toc242718550"/>
       <w:r>
         <w:t>Step 17 – Updating the tool</w:t>
       </w:r>
@@ -23252,7 +23522,7 @@
       <w:pPr>
         <w:pStyle w:val="Heading2"/>
       </w:pPr>
-      <w:bookmarkStart w:id="43" w:name="_Toc242716502"/>
+      <w:bookmarkStart w:id="43" w:name="_Toc242718551"/>
       <w:r>
         <w:t>17.1 Install a newer version</w:t>
       </w:r>
@@ -23347,7 +23617,7 @@
       <w:pPr>
         <w:pStyle w:val="Heading2"/>
       </w:pPr>
-      <w:bookmarkStart w:id="44" w:name="_Toc242716503"/>
+      <w:bookmarkStart w:id="44" w:name="_Toc242718552"/>
       <w:r>
         <w:t>17.2 When CycloneDX releases a new version</w:t>
       </w:r>
@@ -23440,7 +23710,7 @@
       <w:pPr>
         <w:pStyle w:val="Heading2"/>
       </w:pPr>
-      <w:bookmarkStart w:id="45" w:name="_Toc242716504"/>
+      <w:bookmarkStart w:id="45" w:name="_Toc242718553"/>
       <w:r>
         <w:t>17.3 When Checkmarx supports a newer version</w:t>
       </w:r>
@@ -23475,7 +23745,7 @@
       <w:pPr>
         <w:pStyle w:val="Heading2"/>
       </w:pPr>
-      <w:bookmarkStart w:id="46" w:name="_Toc242716505"/>
+      <w:bookmarkStart w:id="46" w:name="_Toc242718554"/>
       <w:r>
         <w:t>17.4 When a new sbomqs is released</w:t>
       </w:r>
@@ -23626,7 +23896,7 @@
       <w:pPr>
         <w:pStyle w:val="Heading2"/>
       </w:pPr>
-      <w:bookmarkStart w:id="47" w:name="_Toc242716506"/>
+      <w:bookmarkStart w:id="47" w:name="_Toc242718555"/>
       <w:r>
         <w:t>17.5 Adding a new rule (developers)</w:t>
       </w:r>
@@ -23784,7 +24054,7 @@
       <w:pPr>
         <w:pStyle w:val="Heading1"/>
       </w:pPr>
-      <w:bookmarkStart w:id="48" w:name="_Toc242716507"/>
+      <w:bookmarkStart w:id="48" w:name="_Toc242718556"/>
       <w:r>
         <w:t>Step 18 – Command cheat sheet</w:t>
       </w:r>
@@ -24602,31 +24872,31 @@
       </w:rPr>
     </w:lvl>
   </w:abstractNum>
-  <w:num w:numId="1" w16cid:durableId="1161045185">
+  <w:num w:numId="1" w16cid:durableId="1660966037">
     <w:abstractNumId w:val="8"/>
   </w:num>
-  <w:num w:numId="2" w16cid:durableId="1392189218">
+  <w:num w:numId="2" w16cid:durableId="1050885257">
     <w:abstractNumId w:val="6"/>
   </w:num>
-  <w:num w:numId="3" w16cid:durableId="29230646">
+  <w:num w:numId="3" w16cid:durableId="810440122">
     <w:abstractNumId w:val="5"/>
   </w:num>
-  <w:num w:numId="4" w16cid:durableId="311106122">
+  <w:num w:numId="4" w16cid:durableId="351076734">
     <w:abstractNumId w:val="4"/>
   </w:num>
-  <w:num w:numId="5" w16cid:durableId="1539047771">
+  <w:num w:numId="5" w16cid:durableId="340132283">
     <w:abstractNumId w:val="7"/>
   </w:num>
-  <w:num w:numId="6" w16cid:durableId="723992235">
+  <w:num w:numId="6" w16cid:durableId="1376076543">
     <w:abstractNumId w:val="3"/>
   </w:num>
-  <w:num w:numId="7" w16cid:durableId="1714841157">
+  <w:num w:numId="7" w16cid:durableId="1717268633">
     <w:abstractNumId w:val="2"/>
   </w:num>
-  <w:num w:numId="8" w16cid:durableId="17515621">
+  <w:num w:numId="8" w16cid:durableId="1433278997">
     <w:abstractNumId w:val="1"/>
   </w:num>
-  <w:num w:numId="9" w16cid:durableId="1980568076">
+  <w:num w:numId="9" w16cid:durableId="1967613540">
     <w:abstractNumId w:val="0"/>
   </w:num>
 </w:numbering>
@@ -36023,7 +36293,7 @@
     <w:autoRedefine/>
     <w:uiPriority w:val="39"/>
     <w:unhideWhenUsed/>
-    <w:rsid w:val="00E12038"/>
+    <w:rsid w:val="00CC2A9E"/>
     <w:pPr>
       <w:spacing w:after="100"/>
     </w:pPr>
@@ -36035,7 +36305,7 @@
     <w:autoRedefine/>
     <w:uiPriority w:val="39"/>
     <w:unhideWhenUsed/>
-    <w:rsid w:val="00E12038"/>
+    <w:rsid w:val="00CC2A9E"/>
     <w:pPr>
       <w:spacing w:after="100"/>
       <w:ind w:left="210"/>
@@ -36046,7 +36316,7 @@
     <w:basedOn w:val="DefaultParagraphFont"/>
     <w:uiPriority w:val="99"/>
     <w:unhideWhenUsed/>
-    <w:rsid w:val="00E12038"/>
+    <w:rsid w:val="00CC2A9E"/>
     <w:rPr>
       <w:color w:val="0000FF" w:themeColor="hyperlink"/>
       <w:u w:val="single"/>

</xml_diff>